<commit_message>
Simplify code comments; keep pitch deliverables local; NOTES: real assets + pitch
</commit_message>
<xml_diff>
--- a/pitch/AMET-CEII-Website-Redesign-Proposal.docx
+++ b/pitch/AMET-CEII-Website-Redesign-Proposal.docx
@@ -5,2349 +5,14 @@
     <w:p>
       <w:pPr>
         <w:spacing w:after="40"/>
-        <w:jc w:val="right"/>
-      </w:pPr>
-      <w:r>
-        <w:rPr>
-          <w:color w:val="595959"/>
-        </w:rPr>
-        <w:t xml:space="preserve">Date: ______________</w:t>
-      </w:r>
-    </w:p>
-    <w:p>
-      <w:pPr>
-        <w:spacing w:after="120"/>
-      </w:pPr>
-    </w:p>
-    <w:p>
-      <w:pPr>
-        <w:spacing w:after="140" w:line="276"/>
-      </w:pPr>
-      <w:r>
-        <w:rPr>
-          <w:b/>
-          <w:bCs/>
-        </w:rPr>
-        <w:t xml:space="preserve">To,</w:t>
-      </w:r>
-    </w:p>
-    <w:p>
-      <w:pPr>
-        <w:spacing w:after="140" w:line="276"/>
-      </w:pPr>
-      <w:r>
-        <w:t xml:space="preserve">The Registrar</w:t>
-      </w:r>
-    </w:p>
-    <w:p>
-      <w:pPr>
-        <w:spacing w:after="140" w:line="276"/>
-      </w:pPr>
-      <w:r>
-        <w:t xml:space="preserve">AMET University (Academy of Maritime Education and Training)</w:t>
-      </w:r>
-    </w:p>
-    <w:p>
-      <w:pPr>
-        <w:spacing w:after="140" w:line="276"/>
-      </w:pPr>
-      <w:r>
-        <w:t xml:space="preserve">135, East Coast Road, Kanathur, Chennai – 603112, Tamil Nadu</w:t>
-      </w:r>
-    </w:p>
-    <w:p>
-      <w:pPr>
-        <w:spacing w:after="120"/>
-      </w:pPr>
-    </w:p>
-    <w:p>
-      <w:pPr>
-        <w:spacing w:after="140" w:line="276"/>
-      </w:pPr>
-      <w:r>
-        <w:rPr>
-          <w:b/>
-          <w:bCs/>
-        </w:rPr>
-        <w:t xml:space="preserve">Subject: </w:t>
-      </w:r>
-      <w:r>
-        <w:t xml:space="preserve">Proposal to redesign and maintain the AMET CEII website (aceii.in) in-house as a student internship project.</w:t>
-      </w:r>
-    </w:p>
-    <w:p>
-      <w:pPr>
-        <w:spacing w:after="120"/>
-      </w:pPr>
-    </w:p>
-    <w:p>
-      <w:pPr>
-        <w:spacing w:after="140" w:line="276"/>
-      </w:pPr>
-      <w:r>
-        <w:t xml:space="preserve">Respected Sir/Madam,</w:t>
-      </w:r>
-    </w:p>
-    <w:p>
-      <w:pPr>
-        <w:spacing w:after="140" w:line="276"/>
-        <w:jc w:val="both"/>
-      </w:pPr>
-      <w:r>
-        <w:t xml:space="preserve">We are a team of five third-year students of </w:t>
-      </w:r>
-      <w:r>
-        <w:rPr>
-          <w:b/>
-          <w:bCs/>
-        </w:rPr>
-        <w:t xml:space="preserve">B.Sc. Artificial Intelligence and Machine Learning</w:t>
-      </w:r>
-      <w:r>
-        <w:t xml:space="preserve"> at AMET University. As part of our programme, we have acquired practical skills in web development, cloud deployment, user-interface design and the use of AI tools — and we would like to put these skills to work for our own university.</w:t>
-      </w:r>
-    </w:p>
-    <w:p>
-      <w:pPr>
-        <w:spacing w:after="140" w:line="276"/>
-        <w:jc w:val="both"/>
-      </w:pPr>
-      <w:r>
-        <w:t xml:space="preserve">We are writing to propose a complete redesign of the website of the </w:t>
-      </w:r>
-      <w:r>
-        <w:rPr>
-          <w:b/>
-          <w:bCs/>
-        </w:rPr>
-        <w:t xml:space="preserve">AMET Centre for Entrepreneurship, Innovation and Incubation (AMET CEII), aceii.in</w:t>
-      </w:r>
-      <w:r>
-        <w:t xml:space="preserve">, and to take over its ongoing maintenance in-house. At present this work is carried out by an external third-party agency. We believe that a student team, guided by the CEII and a faculty mentor, can deliver a world-class redesign and maintain it at a fraction of the recurring cost — while gaining real, industry-grade experience.</w:t>
-      </w:r>
-    </w:p>
-    <w:p>
-      <w:pPr>
-        <w:spacing w:after="140" w:line="276"/>
-        <w:jc w:val="both"/>
-      </w:pPr>
-      <w:r>
-        <w:t xml:space="preserve">To demonstrate our seriousness, we have already built a working prototype of the redesigned site, which can be viewed at </w:t>
-      </w:r>
-      <w:r>
-        <w:rPr>
-          <w:b/>
-          <w:bCs/>
-        </w:rPr>
-        <w:t xml:space="preserve">amet-ceii.vercel.app</w:t>
-      </w:r>
-      <w:r>
-        <w:t xml:space="preserve">. This proposal document sets out the background, the proposed solution, a detailed maintenance plan, and the internship arrangement we are requesting.</w:t>
-      </w:r>
-    </w:p>
-    <w:p>
-      <w:pPr>
-        <w:spacing w:after="140" w:line="276"/>
-        <w:jc w:val="both"/>
-      </w:pPr>
-      <w:r>
-        <w:t xml:space="preserve">We would be grateful for the opportunity to present this proposal to you in person. We thank you for your time and consideration.</w:t>
-      </w:r>
-    </w:p>
-    <w:p>
-      <w:pPr>
-        <w:spacing w:after="120"/>
-      </w:pPr>
-    </w:p>
-    <w:p>
-      <w:pPr>
-        <w:spacing w:after="140" w:line="276"/>
-      </w:pPr>
-      <w:r>
-        <w:t xml:space="preserve">Yours sincerely,</w:t>
-      </w:r>
-    </w:p>
-    <w:p>
-      <w:pPr>
-        <w:spacing w:after="140" w:line="276"/>
-      </w:pPr>
-      <w:r>
-        <w:rPr>
-          <w:b/>
-          <w:bCs/>
-        </w:rPr>
-        <w:t xml:space="preserve">The Student Project Team — B.Sc. AI &amp; ML (Third Year), AMET University</w:t>
-      </w:r>
-    </w:p>
-    <w:p>
-      <w:pPr>
-        <w:spacing w:after="60"/>
-      </w:pPr>
-    </w:p>
-    <w:p>
-      <w:r>
-        <w:rPr>
-          <w:i/>
-          <w:iCs/>
-          <w:color w:val="595959"/>
-          <w:sz w:val="20"/>
-          <w:szCs w:val="20"/>
-        </w:rPr>
-        <w:t xml:space="preserve">[ Names &amp; register numbers on the team page overleaf ]</w:t>
-      </w:r>
-    </w:p>
-    <w:p>
-      <w:r>
-        <w:br w:type="page"/>
-      </w:r>
-    </w:p>
-    <w:p>
-      <w:pPr>
-        <w:pStyle w:val="Heading1"/>
-      </w:pPr>
-      <w:r>
-        <w:t xml:space="preserve">Contents</w:t>
-      </w:r>
-    </w:p>
-    <w:sdt>
-      <w:sdtPr>
-        <w:alias w:val="Contents"/>
-      </w:sdtPr>
-      <w:sdtContent>
-        <w:p>
-          <w:r>
-            <w:fldChar w:fldCharType="begin" w:dirty="true"/>
-            <w:instrText xml:space="preserve">TOC \h \o "1-1"</w:instrText>
-            <w:fldChar w:fldCharType="separate"/>
-          </w:r>
-        </w:p>
-        <w:p>
-          <w:r>
-            <w:fldChar w:fldCharType="end"/>
-          </w:r>
-        </w:p>
-      </w:sdtContent>
-    </w:sdt>
-    <w:p>
-      <w:r>
-        <w:br w:type="page"/>
-      </w:r>
-    </w:p>
-    <w:p>
-      <w:pPr>
-        <w:pStyle w:val="Heading1"/>
-      </w:pPr>
-      <w:r>
-        <w:t xml:space="preserve">1.  Executive Summary</w:t>
-      </w:r>
-    </w:p>
-    <w:p>
-      <w:pPr>
-        <w:spacing w:after="140" w:line="276"/>
-        <w:jc w:val="both"/>
-      </w:pPr>
-      <w:r>
-        <w:t xml:space="preserve">The AMET Centre for Entrepreneurship, Innovation and Incubation (CEII) is the university’s startup incubator, with a stated focus on the </w:t>
-      </w:r>
-      <w:r>
-        <w:rPr>
-          <w:b/>
-          <w:bCs/>
-        </w:rPr>
-        <w:t xml:space="preserve">maritime sector and the blue economy</w:t>
-      </w:r>
-      <w:r>
-        <w:t xml:space="preserve">. Its current website, aceii.in, is functional but minimal and is maintained by an external vendor.</w:t>
-      </w:r>
-    </w:p>
-    <w:p>
-      <w:pPr>
-        <w:spacing w:after="140" w:line="276"/>
-        <w:jc w:val="both"/>
-      </w:pPr>
-      <w:r>
-        <w:t xml:space="preserve">We propose to:</w:t>
-      </w:r>
-    </w:p>
-    <w:p>
-      <w:pPr>
-        <w:pStyle w:val="ListParagraph"/>
-        <w:numPr>
-          <w:ilvl w:val="0"/>
-          <w:numId w:val="2"/>
-        </w:numPr>
-        <w:spacing w:after="70" w:line="270"/>
-      </w:pPr>
-      <w:r>
-        <w:rPr>
-          <w:b/>
-          <w:bCs/>
-        </w:rPr>
-        <w:t xml:space="preserve">Redesign </w:t>
-      </w:r>
-      <w:r>
-        <w:t xml:space="preserve">the website into a modern, professional, mobile-friendly platform that reflects CEII’s ambition to be a leading maritime incubation cell.</w:t>
-      </w:r>
-    </w:p>
-    <w:p>
-      <w:pPr>
-        <w:pStyle w:val="ListParagraph"/>
-        <w:numPr>
-          <w:ilvl w:val="0"/>
-          <w:numId w:val="2"/>
-        </w:numPr>
-        <w:spacing w:after="70" w:line="270"/>
-      </w:pPr>
-      <w:r>
-        <w:rPr>
-          <w:b/>
-          <w:bCs/>
-        </w:rPr>
-        <w:t xml:space="preserve">Maintain </w:t>
-      </w:r>
-      <w:r>
-        <w:t xml:space="preserve">the site in-house through a structured student internship, replacing the recurring third-party arrangement.</w:t>
-      </w:r>
-    </w:p>
-    <w:p>
-      <w:pPr>
-        <w:pStyle w:val="ListParagraph"/>
-        <w:numPr>
-          <w:ilvl w:val="0"/>
-          <w:numId w:val="2"/>
-        </w:numPr>
-        <w:spacing w:after="70" w:line="270"/>
-      </w:pPr>
-      <w:r>
-        <w:rPr>
-          <w:b/>
-          <w:bCs/>
-        </w:rPr>
-        <w:t xml:space="preserve">Document and hand over </w:t>
-      </w:r>
-      <w:r>
-        <w:t xml:space="preserve">the system so that future student batches can continue the work — building lasting capability within the university.</w:t>
-      </w:r>
-    </w:p>
-    <w:p>
-      <w:pPr>
-        <w:spacing w:after="140" w:line="276"/>
-        <w:jc w:val="both"/>
-      </w:pPr>
-      <w:r>
-        <w:t xml:space="preserve">A working prototype is already live at amet-ceii.vercel.app. The redesign expands the site from a handful of pages to ten well-structured pages, adds an online application and enquiry system, and introduces a distinctive maritime visual identity — all built on free and low-cost, industry-standard tools.</w:t>
-      </w:r>
-    </w:p>
-    <w:p>
-      <w:pPr>
-        <w:pStyle w:val="Heading1"/>
-      </w:pPr>
-      <w:r>
-        <w:t xml:space="preserve">2.  The Proposing Team</w:t>
-      </w:r>
-    </w:p>
-    <w:p>
-      <w:pPr>
-        <w:spacing w:after="140" w:line="276"/>
-        <w:jc w:val="both"/>
-      </w:pPr>
-      <w:r>
-        <w:t xml:space="preserve">We are five third-year B.Sc. Artificial Intelligence and Machine Learning students. Our programme has equipped us with programming, web-development, cloud and AI skills that map directly onto this project. Proposed roles are shown below (names and register numbers to be completed by the team):</w:t>
-      </w:r>
-    </w:p>
-    <w:tbl>
-      <w:tblPr>
-        <w:tblW w:type="dxa" w:w="9026"/>
-        <w:tblBorders>
-          <w:top w:val="single" w:color="auto" w:sz="4"/>
-          <w:left w:val="single" w:color="auto" w:sz="4"/>
-          <w:bottom w:val="single" w:color="auto" w:sz="4"/>
-          <w:right w:val="single" w:color="auto" w:sz="4"/>
-          <w:insideH w:val="single" w:color="auto" w:sz="4"/>
-          <w:insideV w:val="single" w:color="auto" w:sz="4"/>
-        </w:tblBorders>
-      </w:tblPr>
-      <w:tblGrid>
-        <w:gridCol w:w="3100"/>
-        <w:gridCol w:w="2400"/>
-        <w:gridCol w:w="3526"/>
-      </w:tblGrid>
-      <w:tr>
-        <w:trPr>
-          <w:tblHeader/>
-        </w:trPr>
-        <w:tc>
-          <w:tcPr>
-            <w:tcW w:type="dxa" w:w="3100"/>
-            <w:tcBorders>
-              <w:top w:val="single" w:color="BBBBBB" w:sz="1"/>
-              <w:left w:val="single" w:color="BBBBBB" w:sz="1"/>
-              <w:bottom w:val="single" w:color="BBBBBB" w:sz="1"/>
-              <w:right w:val="single" w:color="BBBBBB" w:sz="1"/>
-            </w:tcBorders>
-            <w:shd w:fill="0E2E42" w:val="clear"/>
-            <w:tcMar>
-              <w:top w:type="dxa" w:w="60"/>
-              <w:left w:type="dxa" w:w="110"/>
-              <w:bottom w:type="dxa" w:w="60"/>
-              <w:right w:type="dxa" w:w="110"/>
-            </w:tcMar>
-          </w:tcPr>
-          <w:p>
-            <w:pPr>
-              <w:spacing w:after="0" w:line="260"/>
-            </w:pPr>
-            <w:r>
-              <w:rPr>
-                <w:b/>
-                <w:bCs/>
-                <w:color w:val="FFFFFF"/>
-              </w:rPr>
-              <w:t xml:space="preserve">Student name</w:t>
-            </w:r>
-          </w:p>
-        </w:tc>
-        <w:tc>
-          <w:tcPr>
-            <w:tcW w:type="dxa" w:w="2400"/>
-            <w:tcBorders>
-              <w:top w:val="single" w:color="BBBBBB" w:sz="1"/>
-              <w:left w:val="single" w:color="BBBBBB" w:sz="1"/>
-              <w:bottom w:val="single" w:color="BBBBBB" w:sz="1"/>
-              <w:right w:val="single" w:color="BBBBBB" w:sz="1"/>
-            </w:tcBorders>
-            <w:shd w:fill="0E2E42" w:val="clear"/>
-            <w:tcMar>
-              <w:top w:type="dxa" w:w="60"/>
-              <w:left w:type="dxa" w:w="110"/>
-              <w:bottom w:type="dxa" w:w="60"/>
-              <w:right w:type="dxa" w:w="110"/>
-            </w:tcMar>
-          </w:tcPr>
-          <w:p>
-            <w:pPr>
-              <w:spacing w:after="0" w:line="260"/>
-            </w:pPr>
-            <w:r>
-              <w:rPr>
-                <w:b/>
-                <w:bCs/>
-                <w:color w:val="FFFFFF"/>
-              </w:rPr>
-              <w:t xml:space="preserve">Register number</w:t>
-            </w:r>
-          </w:p>
-        </w:tc>
-        <w:tc>
-          <w:tcPr>
-            <w:tcW w:type="dxa" w:w="3526"/>
-            <w:tcBorders>
-              <w:top w:val="single" w:color="BBBBBB" w:sz="1"/>
-              <w:left w:val="single" w:color="BBBBBB" w:sz="1"/>
-              <w:bottom w:val="single" w:color="BBBBBB" w:sz="1"/>
-              <w:right w:val="single" w:color="BBBBBB" w:sz="1"/>
-            </w:tcBorders>
-            <w:shd w:fill="0E2E42" w:val="clear"/>
-            <w:tcMar>
-              <w:top w:type="dxa" w:w="60"/>
-              <w:left w:type="dxa" w:w="110"/>
-              <w:bottom w:type="dxa" w:w="60"/>
-              <w:right w:type="dxa" w:w="110"/>
-            </w:tcMar>
-          </w:tcPr>
-          <w:p>
-            <w:pPr>
-              <w:spacing w:after="0" w:line="260"/>
-            </w:pPr>
-            <w:r>
-              <w:rPr>
-                <w:b/>
-                <w:bCs/>
-                <w:color w:val="FFFFFF"/>
-              </w:rPr>
-              <w:t xml:space="preserve">Role on the project</w:t>
-            </w:r>
-          </w:p>
-        </w:tc>
-      </w:tr>
-      <w:tr>
-        <w:tc>
-          <w:tcPr>
-            <w:tcW w:type="dxa" w:w="3100"/>
-            <w:tcBorders>
-              <w:top w:val="single" w:color="BBBBBB" w:sz="1"/>
-              <w:left w:val="single" w:color="BBBBBB" w:sz="1"/>
-              <w:bottom w:val="single" w:color="BBBBBB" w:sz="1"/>
-              <w:right w:val="single" w:color="BBBBBB" w:sz="1"/>
-            </w:tcBorders>
-            <w:tcMar>
-              <w:top w:type="dxa" w:w="60"/>
-              <w:left w:type="dxa" w:w="110"/>
-              <w:bottom w:type="dxa" w:w="60"/>
-              <w:right w:type="dxa" w:w="110"/>
-            </w:tcMar>
-          </w:tcPr>
-          <w:p>
-            <w:pPr>
-              <w:spacing w:after="0" w:line="260"/>
-            </w:pPr>
-            <w:r>
-              <w:rPr>
-                <w:color w:val="1A1A1A"/>
-              </w:rPr>
-              <w:t xml:space="preserve">[ Full name ]</w:t>
-            </w:r>
-          </w:p>
-        </w:tc>
-        <w:tc>
-          <w:tcPr>
-            <w:tcW w:type="dxa" w:w="2400"/>
-            <w:tcBorders>
-              <w:top w:val="single" w:color="BBBBBB" w:sz="1"/>
-              <w:left w:val="single" w:color="BBBBBB" w:sz="1"/>
-              <w:bottom w:val="single" w:color="BBBBBB" w:sz="1"/>
-              <w:right w:val="single" w:color="BBBBBB" w:sz="1"/>
-            </w:tcBorders>
-            <w:tcMar>
-              <w:top w:type="dxa" w:w="60"/>
-              <w:left w:type="dxa" w:w="110"/>
-              <w:bottom w:type="dxa" w:w="60"/>
-              <w:right w:type="dxa" w:w="110"/>
-            </w:tcMar>
-          </w:tcPr>
-          <w:p>
-            <w:pPr>
-              <w:spacing w:after="0" w:line="260"/>
-            </w:pPr>
-            <w:r>
-              <w:rPr>
-                <w:color w:val="1A1A1A"/>
-              </w:rPr>
-              <w:t xml:space="preserve">[ Reg. no. ]</w:t>
-            </w:r>
-          </w:p>
-        </w:tc>
-        <w:tc>
-          <w:tcPr>
-            <w:tcW w:type="dxa" w:w="3526"/>
-            <w:tcBorders>
-              <w:top w:val="single" w:color="BBBBBB" w:sz="1"/>
-              <w:left w:val="single" w:color="BBBBBB" w:sz="1"/>
-              <w:bottom w:val="single" w:color="BBBBBB" w:sz="1"/>
-              <w:right w:val="single" w:color="BBBBBB" w:sz="1"/>
-            </w:tcBorders>
-            <w:tcMar>
-              <w:top w:type="dxa" w:w="60"/>
-              <w:left w:type="dxa" w:w="110"/>
-              <w:bottom w:type="dxa" w:w="60"/>
-              <w:right w:type="dxa" w:w="110"/>
-            </w:tcMar>
-          </w:tcPr>
-          <w:p>
-            <w:pPr>
-              <w:spacing w:after="0" w:line="260"/>
-            </w:pPr>
-            <w:r>
-              <w:rPr>
-                <w:color w:val="1A1A1A"/>
-              </w:rPr>
-              <w:t xml:space="preserve">Team Lead &amp; Full-stack Developer</w:t>
-            </w:r>
-          </w:p>
-        </w:tc>
-      </w:tr>
-      <w:tr>
-        <w:tc>
-          <w:tcPr>
-            <w:tcW w:type="dxa" w:w="3100"/>
-            <w:tcBorders>
-              <w:top w:val="single" w:color="BBBBBB" w:sz="1"/>
-              <w:left w:val="single" w:color="BBBBBB" w:sz="1"/>
-              <w:bottom w:val="single" w:color="BBBBBB" w:sz="1"/>
-              <w:right w:val="single" w:color="BBBBBB" w:sz="1"/>
-            </w:tcBorders>
-            <w:tcMar>
-              <w:top w:type="dxa" w:w="60"/>
-              <w:left w:type="dxa" w:w="110"/>
-              <w:bottom w:type="dxa" w:w="60"/>
-              <w:right w:type="dxa" w:w="110"/>
-            </w:tcMar>
-          </w:tcPr>
-          <w:p>
-            <w:pPr>
-              <w:spacing w:after="0" w:line="260"/>
-            </w:pPr>
-            <w:r>
-              <w:rPr>
-                <w:color w:val="1A1A1A"/>
-              </w:rPr>
-              <w:t xml:space="preserve">[ Full name ]</w:t>
-            </w:r>
-          </w:p>
-        </w:tc>
-        <w:tc>
-          <w:tcPr>
-            <w:tcW w:type="dxa" w:w="2400"/>
-            <w:tcBorders>
-              <w:top w:val="single" w:color="BBBBBB" w:sz="1"/>
-              <w:left w:val="single" w:color="BBBBBB" w:sz="1"/>
-              <w:bottom w:val="single" w:color="BBBBBB" w:sz="1"/>
-              <w:right w:val="single" w:color="BBBBBB" w:sz="1"/>
-            </w:tcBorders>
-            <w:tcMar>
-              <w:top w:type="dxa" w:w="60"/>
-              <w:left w:type="dxa" w:w="110"/>
-              <w:bottom w:type="dxa" w:w="60"/>
-              <w:right w:type="dxa" w:w="110"/>
-            </w:tcMar>
-          </w:tcPr>
-          <w:p>
-            <w:pPr>
-              <w:spacing w:after="0" w:line="260"/>
-            </w:pPr>
-            <w:r>
-              <w:rPr>
-                <w:color w:val="1A1A1A"/>
-              </w:rPr>
-              <w:t xml:space="preserve">[ Reg. no. ]</w:t>
-            </w:r>
-          </w:p>
-        </w:tc>
-        <w:tc>
-          <w:tcPr>
-            <w:tcW w:type="dxa" w:w="3526"/>
-            <w:tcBorders>
-              <w:top w:val="single" w:color="BBBBBB" w:sz="1"/>
-              <w:left w:val="single" w:color="BBBBBB" w:sz="1"/>
-              <w:bottom w:val="single" w:color="BBBBBB" w:sz="1"/>
-              <w:right w:val="single" w:color="BBBBBB" w:sz="1"/>
-            </w:tcBorders>
-            <w:tcMar>
-              <w:top w:type="dxa" w:w="60"/>
-              <w:left w:type="dxa" w:w="110"/>
-              <w:bottom w:type="dxa" w:w="60"/>
-              <w:right w:type="dxa" w:w="110"/>
-            </w:tcMar>
-          </w:tcPr>
-          <w:p>
-            <w:pPr>
-              <w:spacing w:after="0" w:line="260"/>
-            </w:pPr>
-            <w:r>
-              <w:rPr>
-                <w:color w:val="1A1A1A"/>
-              </w:rPr>
-              <w:t xml:space="preserve">Front-end &amp; UI/UX Developer</w:t>
-            </w:r>
-          </w:p>
-        </w:tc>
-      </w:tr>
-      <w:tr>
-        <w:tc>
-          <w:tcPr>
-            <w:tcW w:type="dxa" w:w="3100"/>
-            <w:tcBorders>
-              <w:top w:val="single" w:color="BBBBBB" w:sz="1"/>
-              <w:left w:val="single" w:color="BBBBBB" w:sz="1"/>
-              <w:bottom w:val="single" w:color="BBBBBB" w:sz="1"/>
-              <w:right w:val="single" w:color="BBBBBB" w:sz="1"/>
-            </w:tcBorders>
-            <w:tcMar>
-              <w:top w:type="dxa" w:w="60"/>
-              <w:left w:type="dxa" w:w="110"/>
-              <w:bottom w:type="dxa" w:w="60"/>
-              <w:right w:type="dxa" w:w="110"/>
-            </w:tcMar>
-          </w:tcPr>
-          <w:p>
-            <w:pPr>
-              <w:spacing w:after="0" w:line="260"/>
-            </w:pPr>
-            <w:r>
-              <w:rPr>
-                <w:color w:val="1A1A1A"/>
-              </w:rPr>
-              <w:t xml:space="preserve">[ Full name ]</w:t>
-            </w:r>
-          </w:p>
-        </w:tc>
-        <w:tc>
-          <w:tcPr>
-            <w:tcW w:type="dxa" w:w="2400"/>
-            <w:tcBorders>
-              <w:top w:val="single" w:color="BBBBBB" w:sz="1"/>
-              <w:left w:val="single" w:color="BBBBBB" w:sz="1"/>
-              <w:bottom w:val="single" w:color="BBBBBB" w:sz="1"/>
-              <w:right w:val="single" w:color="BBBBBB" w:sz="1"/>
-            </w:tcBorders>
-            <w:tcMar>
-              <w:top w:type="dxa" w:w="60"/>
-              <w:left w:type="dxa" w:w="110"/>
-              <w:bottom w:type="dxa" w:w="60"/>
-              <w:right w:type="dxa" w:w="110"/>
-            </w:tcMar>
-          </w:tcPr>
-          <w:p>
-            <w:pPr>
-              <w:spacing w:after="0" w:line="260"/>
-            </w:pPr>
-            <w:r>
-              <w:rPr>
-                <w:color w:val="1A1A1A"/>
-              </w:rPr>
-              <w:t xml:space="preserve">[ Reg. no. ]</w:t>
-            </w:r>
-          </w:p>
-        </w:tc>
-        <w:tc>
-          <w:tcPr>
-            <w:tcW w:type="dxa" w:w="3526"/>
-            <w:tcBorders>
-              <w:top w:val="single" w:color="BBBBBB" w:sz="1"/>
-              <w:left w:val="single" w:color="BBBBBB" w:sz="1"/>
-              <w:bottom w:val="single" w:color="BBBBBB" w:sz="1"/>
-              <w:right w:val="single" w:color="BBBBBB" w:sz="1"/>
-            </w:tcBorders>
-            <w:tcMar>
-              <w:top w:type="dxa" w:w="60"/>
-              <w:left w:type="dxa" w:w="110"/>
-              <w:bottom w:type="dxa" w:w="60"/>
-              <w:right w:type="dxa" w:w="110"/>
-            </w:tcMar>
-          </w:tcPr>
-          <w:p>
-            <w:pPr>
-              <w:spacing w:after="0" w:line="260"/>
-            </w:pPr>
-            <w:r>
-              <w:rPr>
-                <w:color w:val="1A1A1A"/>
-              </w:rPr>
-              <w:t xml:space="preserve">Content &amp; Data Manager</w:t>
-            </w:r>
-          </w:p>
-        </w:tc>
-      </w:tr>
-      <w:tr>
-        <w:tc>
-          <w:tcPr>
-            <w:tcW w:type="dxa" w:w="3100"/>
-            <w:tcBorders>
-              <w:top w:val="single" w:color="BBBBBB" w:sz="1"/>
-              <w:left w:val="single" w:color="BBBBBB" w:sz="1"/>
-              <w:bottom w:val="single" w:color="BBBBBB" w:sz="1"/>
-              <w:right w:val="single" w:color="BBBBBB" w:sz="1"/>
-            </w:tcBorders>
-            <w:tcMar>
-              <w:top w:type="dxa" w:w="60"/>
-              <w:left w:type="dxa" w:w="110"/>
-              <w:bottom w:type="dxa" w:w="60"/>
-              <w:right w:type="dxa" w:w="110"/>
-            </w:tcMar>
-          </w:tcPr>
-          <w:p>
-            <w:pPr>
-              <w:spacing w:after="0" w:line="260"/>
-            </w:pPr>
-            <w:r>
-              <w:rPr>
-                <w:color w:val="1A1A1A"/>
-              </w:rPr>
-              <w:t xml:space="preserve">[ Full name ]</w:t>
-            </w:r>
-          </w:p>
-        </w:tc>
-        <w:tc>
-          <w:tcPr>
-            <w:tcW w:type="dxa" w:w="2400"/>
-            <w:tcBorders>
-              <w:top w:val="single" w:color="BBBBBB" w:sz="1"/>
-              <w:left w:val="single" w:color="BBBBBB" w:sz="1"/>
-              <w:bottom w:val="single" w:color="BBBBBB" w:sz="1"/>
-              <w:right w:val="single" w:color="BBBBBB" w:sz="1"/>
-            </w:tcBorders>
-            <w:tcMar>
-              <w:top w:type="dxa" w:w="60"/>
-              <w:left w:type="dxa" w:w="110"/>
-              <w:bottom w:type="dxa" w:w="60"/>
-              <w:right w:type="dxa" w:w="110"/>
-            </w:tcMar>
-          </w:tcPr>
-          <w:p>
-            <w:pPr>
-              <w:spacing w:after="0" w:line="260"/>
-            </w:pPr>
-            <w:r>
-              <w:rPr>
-                <w:color w:val="1A1A1A"/>
-              </w:rPr>
-              <w:t xml:space="preserve">[ Reg. no. ]</w:t>
-            </w:r>
-          </w:p>
-        </w:tc>
-        <w:tc>
-          <w:tcPr>
-            <w:tcW w:type="dxa" w:w="3526"/>
-            <w:tcBorders>
-              <w:top w:val="single" w:color="BBBBBB" w:sz="1"/>
-              <w:left w:val="single" w:color="BBBBBB" w:sz="1"/>
-              <w:bottom w:val="single" w:color="BBBBBB" w:sz="1"/>
-              <w:right w:val="single" w:color="BBBBBB" w:sz="1"/>
-            </w:tcBorders>
-            <w:tcMar>
-              <w:top w:type="dxa" w:w="60"/>
-              <w:left w:type="dxa" w:w="110"/>
-              <w:bottom w:type="dxa" w:w="60"/>
-              <w:right w:type="dxa" w:w="110"/>
-            </w:tcMar>
-          </w:tcPr>
-          <w:p>
-            <w:pPr>
-              <w:spacing w:after="0" w:line="260"/>
-            </w:pPr>
-            <w:r>
-              <w:rPr>
-                <w:color w:val="1A1A1A"/>
-              </w:rPr>
-              <w:t xml:space="preserve">Quality Assurance &amp; Testing</w:t>
-            </w:r>
-          </w:p>
-        </w:tc>
-      </w:tr>
-      <w:tr>
-        <w:tc>
-          <w:tcPr>
-            <w:tcW w:type="dxa" w:w="3100"/>
-            <w:tcBorders>
-              <w:top w:val="single" w:color="BBBBBB" w:sz="1"/>
-              <w:left w:val="single" w:color="BBBBBB" w:sz="1"/>
-              <w:bottom w:val="single" w:color="BBBBBB" w:sz="1"/>
-              <w:right w:val="single" w:color="BBBBBB" w:sz="1"/>
-            </w:tcBorders>
-            <w:tcMar>
-              <w:top w:type="dxa" w:w="60"/>
-              <w:left w:type="dxa" w:w="110"/>
-              <w:bottom w:type="dxa" w:w="60"/>
-              <w:right w:type="dxa" w:w="110"/>
-            </w:tcMar>
-          </w:tcPr>
-          <w:p>
-            <w:pPr>
-              <w:spacing w:after="0" w:line="260"/>
-            </w:pPr>
-            <w:r>
-              <w:rPr>
-                <w:color w:val="1A1A1A"/>
-              </w:rPr>
-              <w:t xml:space="preserve">[ Full name ]</w:t>
-            </w:r>
-          </w:p>
-        </w:tc>
-        <w:tc>
-          <w:tcPr>
-            <w:tcW w:type="dxa" w:w="2400"/>
-            <w:tcBorders>
-              <w:top w:val="single" w:color="BBBBBB" w:sz="1"/>
-              <w:left w:val="single" w:color="BBBBBB" w:sz="1"/>
-              <w:bottom w:val="single" w:color="BBBBBB" w:sz="1"/>
-              <w:right w:val="single" w:color="BBBBBB" w:sz="1"/>
-            </w:tcBorders>
-            <w:tcMar>
-              <w:top w:type="dxa" w:w="60"/>
-              <w:left w:type="dxa" w:w="110"/>
-              <w:bottom w:type="dxa" w:w="60"/>
-              <w:right w:type="dxa" w:w="110"/>
-            </w:tcMar>
-          </w:tcPr>
-          <w:p>
-            <w:pPr>
-              <w:spacing w:after="0" w:line="260"/>
-            </w:pPr>
-            <w:r>
-              <w:rPr>
-                <w:color w:val="1A1A1A"/>
-              </w:rPr>
-              <w:t xml:space="preserve">[ Reg. no. ]</w:t>
-            </w:r>
-          </w:p>
-        </w:tc>
-        <w:tc>
-          <w:tcPr>
-            <w:tcW w:type="dxa" w:w="3526"/>
-            <w:tcBorders>
-              <w:top w:val="single" w:color="BBBBBB" w:sz="1"/>
-              <w:left w:val="single" w:color="BBBBBB" w:sz="1"/>
-              <w:bottom w:val="single" w:color="BBBBBB" w:sz="1"/>
-              <w:right w:val="single" w:color="BBBBBB" w:sz="1"/>
-            </w:tcBorders>
-            <w:tcMar>
-              <w:top w:type="dxa" w:w="60"/>
-              <w:left w:type="dxa" w:w="110"/>
-              <w:bottom w:type="dxa" w:w="60"/>
-              <w:right w:type="dxa" w:w="110"/>
-            </w:tcMar>
-          </w:tcPr>
-          <w:p>
-            <w:pPr>
-              <w:spacing w:after="0" w:line="260"/>
-            </w:pPr>
-            <w:r>
-              <w:rPr>
-                <w:color w:val="1A1A1A"/>
-              </w:rPr>
-              <w:t xml:space="preserve">Deployment &amp; Maintenance (DevOps)</w:t>
-            </w:r>
-          </w:p>
-        </w:tc>
-      </w:tr>
-    </w:tbl>
-    <w:p>
-      <w:pPr>
-        <w:spacing w:after="60"/>
-      </w:pPr>
-    </w:p>
-    <w:p>
-      <w:pPr>
-        <w:spacing w:after="140" w:line="276"/>
-      </w:pPr>
-      <w:r>
-        <w:rPr>
-          <w:b/>
-          <w:bCs/>
-        </w:rPr>
-        <w:t xml:space="preserve">Faculty mentor (proposed): </w:t>
-      </w:r>
-      <w:r>
-        <w:t xml:space="preserve">____________________________     </w:t>
-      </w:r>
-      <w:r>
-        <w:rPr>
-          <w:b/>
-          <w:bCs/>
-        </w:rPr>
-        <w:t xml:space="preserve">Reporting to: </w:t>
-      </w:r>
-      <w:r>
-        <w:t xml:space="preserve">AMET CEII</w:t>
-      </w:r>
-    </w:p>
-    <w:p>
-      <w:pPr>
-        <w:pStyle w:val="Heading1"/>
-      </w:pPr>
-      <w:r>
-        <w:t xml:space="preserve">3.  Background — The CEII Website Today</w:t>
-      </w:r>
-    </w:p>
-    <w:p>
-      <w:pPr>
-        <w:spacing w:after="140" w:line="276"/>
-        <w:jc w:val="both"/>
-      </w:pPr>
-      <w:r>
-        <w:t xml:space="preserve">The following details are drawn directly from the current CEII website and materials:</w:t>
-      </w:r>
-    </w:p>
-    <w:tbl>
-      <w:tblPr>
-        <w:tblW w:type="dxa" w:w="9026"/>
-        <w:tblBorders>
-          <w:top w:val="single" w:color="auto" w:sz="4"/>
-          <w:left w:val="single" w:color="auto" w:sz="4"/>
-          <w:bottom w:val="single" w:color="auto" w:sz="4"/>
-          <w:right w:val="single" w:color="auto" w:sz="4"/>
-          <w:insideH w:val="single" w:color="auto" w:sz="4"/>
-          <w:insideV w:val="single" w:color="auto" w:sz="4"/>
-        </w:tblBorders>
-      </w:tblPr>
-      <w:tblGrid>
-        <w:gridCol w:w="2500"/>
-        <w:gridCol w:w="6526"/>
-      </w:tblGrid>
-      <w:tr>
-        <w:tc>
-          <w:tcPr>
-            <w:tcW w:type="dxa" w:w="2500"/>
-            <w:tcBorders>
-              <w:top w:val="single" w:color="BBBBBB" w:sz="1"/>
-              <w:left w:val="single" w:color="BBBBBB" w:sz="1"/>
-              <w:bottom w:val="single" w:color="BBBBBB" w:sz="1"/>
-              <w:right w:val="single" w:color="BBBBBB" w:sz="1"/>
-            </w:tcBorders>
-            <w:shd w:fill="EEF3F5" w:val="clear"/>
-            <w:tcMar>
-              <w:top w:type="dxa" w:w="60"/>
-              <w:left w:type="dxa" w:w="110"/>
-              <w:bottom w:type="dxa" w:w="60"/>
-              <w:right w:type="dxa" w:w="110"/>
-            </w:tcMar>
-          </w:tcPr>
-          <w:p>
-            <w:pPr>
-              <w:spacing w:after="0" w:line="260"/>
-            </w:pPr>
-            <w:r>
-              <w:rPr>
-                <w:b/>
-                <w:bCs/>
-                <w:color w:val="1A1A1A"/>
-              </w:rPr>
-              <w:t xml:space="preserve">Organisation</w:t>
-            </w:r>
-          </w:p>
-        </w:tc>
-        <w:tc>
-          <w:tcPr>
-            <w:tcW w:type="dxa" w:w="6526"/>
-            <w:tcBorders>
-              <w:top w:val="single" w:color="BBBBBB" w:sz="1"/>
-              <w:left w:val="single" w:color="BBBBBB" w:sz="1"/>
-              <w:bottom w:val="single" w:color="BBBBBB" w:sz="1"/>
-              <w:right w:val="single" w:color="BBBBBB" w:sz="1"/>
-            </w:tcBorders>
-            <w:tcMar>
-              <w:top w:type="dxa" w:w="60"/>
-              <w:left w:type="dxa" w:w="110"/>
-              <w:bottom w:type="dxa" w:w="60"/>
-              <w:right w:type="dxa" w:w="110"/>
-            </w:tcMar>
-          </w:tcPr>
-          <w:p>
-            <w:pPr>
-              <w:spacing w:after="0" w:line="260"/>
-            </w:pPr>
-            <w:r>
-              <w:rPr>
-                <w:color w:val="1A1A1A"/>
-              </w:rPr>
-              <w:t xml:space="preserve">AMET Centre for Entrepreneurship, Innovation and Incubation (AMET CEII)</w:t>
-            </w:r>
-          </w:p>
-        </w:tc>
-      </w:tr>
-      <w:tr>
-        <w:tc>
-          <w:tcPr>
-            <w:tcW w:type="dxa" w:w="2500"/>
-            <w:tcBorders>
-              <w:top w:val="single" w:color="BBBBBB" w:sz="1"/>
-              <w:left w:val="single" w:color="BBBBBB" w:sz="1"/>
-              <w:bottom w:val="single" w:color="BBBBBB" w:sz="1"/>
-              <w:right w:val="single" w:color="BBBBBB" w:sz="1"/>
-            </w:tcBorders>
-            <w:shd w:fill="EEF3F5" w:val="clear"/>
-            <w:tcMar>
-              <w:top w:type="dxa" w:w="60"/>
-              <w:left w:type="dxa" w:w="110"/>
-              <w:bottom w:type="dxa" w:w="60"/>
-              <w:right w:type="dxa" w:w="110"/>
-            </w:tcMar>
-          </w:tcPr>
-          <w:p>
-            <w:pPr>
-              <w:spacing w:after="0" w:line="260"/>
-            </w:pPr>
-            <w:r>
-              <w:rPr>
-                <w:b/>
-                <w:bCs/>
-                <w:color w:val="1A1A1A"/>
-              </w:rPr>
-              <w:t xml:space="preserve">Website</w:t>
-            </w:r>
-          </w:p>
-        </w:tc>
-        <w:tc>
-          <w:tcPr>
-            <w:tcW w:type="dxa" w:w="6526"/>
-            <w:tcBorders>
-              <w:top w:val="single" w:color="BBBBBB" w:sz="1"/>
-              <w:left w:val="single" w:color="BBBBBB" w:sz="1"/>
-              <w:bottom w:val="single" w:color="BBBBBB" w:sz="1"/>
-              <w:right w:val="single" w:color="BBBBBB" w:sz="1"/>
-            </w:tcBorders>
-            <w:tcMar>
-              <w:top w:type="dxa" w:w="60"/>
-              <w:left w:type="dxa" w:w="110"/>
-              <w:bottom w:type="dxa" w:w="60"/>
-              <w:right w:type="dxa" w:w="110"/>
-            </w:tcMar>
-          </w:tcPr>
-          <w:p>
-            <w:pPr>
-              <w:spacing w:after="0" w:line="260"/>
-            </w:pPr>
-            <w:r>
-              <w:rPr>
-                <w:color w:val="1A1A1A"/>
-              </w:rPr>
-              <w:t xml:space="preserve">aceii.in</w:t>
-            </w:r>
-          </w:p>
-        </w:tc>
-      </w:tr>
-      <w:tr>
-        <w:tc>
-          <w:tcPr>
-            <w:tcW w:type="dxa" w:w="2500"/>
-            <w:tcBorders>
-              <w:top w:val="single" w:color="BBBBBB" w:sz="1"/>
-              <w:left w:val="single" w:color="BBBBBB" w:sz="1"/>
-              <w:bottom w:val="single" w:color="BBBBBB" w:sz="1"/>
-              <w:right w:val="single" w:color="BBBBBB" w:sz="1"/>
-            </w:tcBorders>
-            <w:shd w:fill="EEF3F5" w:val="clear"/>
-            <w:tcMar>
-              <w:top w:type="dxa" w:w="60"/>
-              <w:left w:type="dxa" w:w="110"/>
-              <w:bottom w:type="dxa" w:w="60"/>
-              <w:right w:type="dxa" w:w="110"/>
-            </w:tcMar>
-          </w:tcPr>
-          <w:p>
-            <w:pPr>
-              <w:spacing w:after="0" w:line="260"/>
-            </w:pPr>
-            <w:r>
-              <w:rPr>
-                <w:b/>
-                <w:bCs/>
-                <w:color w:val="1A1A1A"/>
-              </w:rPr>
-              <w:t xml:space="preserve">Vision</w:t>
-            </w:r>
-          </w:p>
-        </w:tc>
-        <w:tc>
-          <w:tcPr>
-            <w:tcW w:type="dxa" w:w="6526"/>
-            <w:tcBorders>
-              <w:top w:val="single" w:color="BBBBBB" w:sz="1"/>
-              <w:left w:val="single" w:color="BBBBBB" w:sz="1"/>
-              <w:bottom w:val="single" w:color="BBBBBB" w:sz="1"/>
-              <w:right w:val="single" w:color="BBBBBB" w:sz="1"/>
-            </w:tcBorders>
-            <w:tcMar>
-              <w:top w:type="dxa" w:w="60"/>
-              <w:left w:type="dxa" w:w="110"/>
-              <w:bottom w:type="dxa" w:w="60"/>
-              <w:right w:type="dxa" w:w="110"/>
-            </w:tcMar>
-          </w:tcPr>
-          <w:p>
-            <w:pPr>
-              <w:spacing w:after="0" w:line="260"/>
-            </w:pPr>
-            <w:r>
-              <w:rPr>
-                <w:color w:val="1A1A1A"/>
-              </w:rPr>
-              <w:t xml:space="preserve">Foster entrepreneurship and innovation with a focus on maritime-sector business ideas to boost economic contribution.</w:t>
-            </w:r>
-          </w:p>
-        </w:tc>
-      </w:tr>
-      <w:tr>
-        <w:tc>
-          <w:tcPr>
-            <w:tcW w:type="dxa" w:w="2500"/>
-            <w:tcBorders>
-              <w:top w:val="single" w:color="BBBBBB" w:sz="1"/>
-              <w:left w:val="single" w:color="BBBBBB" w:sz="1"/>
-              <w:bottom w:val="single" w:color="BBBBBB" w:sz="1"/>
-              <w:right w:val="single" w:color="BBBBBB" w:sz="1"/>
-            </w:tcBorders>
-            <w:shd w:fill="EEF3F5" w:val="clear"/>
-            <w:tcMar>
-              <w:top w:type="dxa" w:w="60"/>
-              <w:left w:type="dxa" w:w="110"/>
-              <w:bottom w:type="dxa" w:w="60"/>
-              <w:right w:type="dxa" w:w="110"/>
-            </w:tcMar>
-          </w:tcPr>
-          <w:p>
-            <w:pPr>
-              <w:spacing w:after="0" w:line="260"/>
-            </w:pPr>
-            <w:r>
-              <w:rPr>
-                <w:b/>
-                <w:bCs/>
-                <w:color w:val="1A1A1A"/>
-              </w:rPr>
-              <w:t xml:space="preserve">Mission</w:t>
-            </w:r>
-          </w:p>
-        </w:tc>
-        <w:tc>
-          <w:tcPr>
-            <w:tcW w:type="dxa" w:w="6526"/>
-            <w:tcBorders>
-              <w:top w:val="single" w:color="BBBBBB" w:sz="1"/>
-              <w:left w:val="single" w:color="BBBBBB" w:sz="1"/>
-              <w:bottom w:val="single" w:color="BBBBBB" w:sz="1"/>
-              <w:right w:val="single" w:color="BBBBBB" w:sz="1"/>
-            </w:tcBorders>
-            <w:tcMar>
-              <w:top w:type="dxa" w:w="60"/>
-              <w:left w:type="dxa" w:w="110"/>
-              <w:bottom w:type="dxa" w:w="60"/>
-              <w:right w:type="dxa" w:w="110"/>
-            </w:tcMar>
-          </w:tcPr>
-          <w:p>
-            <w:pPr>
-              <w:spacing w:after="0" w:line="260"/>
-            </w:pPr>
-            <w:r>
-              <w:rPr>
-                <w:color w:val="1A1A1A"/>
-              </w:rPr>
-              <w:t xml:space="preserve">“Empower young innovators by fostering creative thinking and providing essential support, guidance, and resources to help them navigate challenges and achieve sustainable growth during their startup journey.”</w:t>
-            </w:r>
-          </w:p>
-        </w:tc>
-      </w:tr>
-      <w:tr>
-        <w:tc>
-          <w:tcPr>
-            <w:tcW w:type="dxa" w:w="2500"/>
-            <w:tcBorders>
-              <w:top w:val="single" w:color="BBBBBB" w:sz="1"/>
-              <w:left w:val="single" w:color="BBBBBB" w:sz="1"/>
-              <w:bottom w:val="single" w:color="BBBBBB" w:sz="1"/>
-              <w:right w:val="single" w:color="BBBBBB" w:sz="1"/>
-            </w:tcBorders>
-            <w:shd w:fill="EEF3F5" w:val="clear"/>
-            <w:tcMar>
-              <w:top w:type="dxa" w:w="60"/>
-              <w:left w:type="dxa" w:w="110"/>
-              <w:bottom w:type="dxa" w:w="60"/>
-              <w:right w:type="dxa" w:w="110"/>
-            </w:tcMar>
-          </w:tcPr>
-          <w:p>
-            <w:pPr>
-              <w:spacing w:after="0" w:line="260"/>
-            </w:pPr>
-            <w:r>
-              <w:rPr>
-                <w:b/>
-                <w:bCs/>
-                <w:color w:val="1A1A1A"/>
-              </w:rPr>
-              <w:t xml:space="preserve">Current pages</w:t>
-            </w:r>
-          </w:p>
-        </w:tc>
-        <w:tc>
-          <w:tcPr>
-            <w:tcW w:type="dxa" w:w="6526"/>
-            <w:tcBorders>
-              <w:top w:val="single" w:color="BBBBBB" w:sz="1"/>
-              <w:left w:val="single" w:color="BBBBBB" w:sz="1"/>
-              <w:bottom w:val="single" w:color="BBBBBB" w:sz="1"/>
-              <w:right w:val="single" w:color="BBBBBB" w:sz="1"/>
-            </w:tcBorders>
-            <w:tcMar>
-              <w:top w:type="dxa" w:w="60"/>
-              <w:left w:type="dxa" w:w="110"/>
-              <w:bottom w:type="dxa" w:w="60"/>
-              <w:right w:type="dxa" w:w="110"/>
-            </w:tcMar>
-          </w:tcPr>
-          <w:p>
-            <w:pPr>
-              <w:spacing w:after="0" w:line="260"/>
-            </w:pPr>
-            <w:r>
-              <w:rPr>
-                <w:color w:val="1A1A1A"/>
-              </w:rPr>
-              <w:t xml:space="preserve">Home, Portfolio, Events, Apply Now, Contact, Blog, and a link to AMET University.</w:t>
-            </w:r>
-          </w:p>
-        </w:tc>
-      </w:tr>
-      <w:tr>
-        <w:tc>
-          <w:tcPr>
-            <w:tcW w:type="dxa" w:w="2500"/>
-            <w:tcBorders>
-              <w:top w:val="single" w:color="BBBBBB" w:sz="1"/>
-              <w:left w:val="single" w:color="BBBBBB" w:sz="1"/>
-              <w:bottom w:val="single" w:color="BBBBBB" w:sz="1"/>
-              <w:right w:val="single" w:color="BBBBBB" w:sz="1"/>
-            </w:tcBorders>
-            <w:shd w:fill="EEF3F5" w:val="clear"/>
-            <w:tcMar>
-              <w:top w:type="dxa" w:w="60"/>
-              <w:left w:type="dxa" w:w="110"/>
-              <w:bottom w:type="dxa" w:w="60"/>
-              <w:right w:type="dxa" w:w="110"/>
-            </w:tcMar>
-          </w:tcPr>
-          <w:p>
-            <w:pPr>
-              <w:spacing w:after="0" w:line="260"/>
-            </w:pPr>
-            <w:r>
-              <w:rPr>
-                <w:b/>
-                <w:bCs/>
-                <w:color w:val="1A1A1A"/>
-              </w:rPr>
-              <w:t xml:space="preserve">CEII team</w:t>
-            </w:r>
-          </w:p>
-        </w:tc>
-        <w:tc>
-          <w:tcPr>
-            <w:tcW w:type="dxa" w:w="6526"/>
-            <w:tcBorders>
-              <w:top w:val="single" w:color="BBBBBB" w:sz="1"/>
-              <w:left w:val="single" w:color="BBBBBB" w:sz="1"/>
-              <w:bottom w:val="single" w:color="BBBBBB" w:sz="1"/>
-              <w:right w:val="single" w:color="BBBBBB" w:sz="1"/>
-            </w:tcBorders>
-            <w:tcMar>
-              <w:top w:type="dxa" w:w="60"/>
-              <w:left w:type="dxa" w:w="110"/>
-              <w:bottom w:type="dxa" w:w="60"/>
-              <w:right w:type="dxa" w:w="110"/>
-            </w:tcMar>
-          </w:tcPr>
-          <w:p>
-            <w:pPr>
-              <w:spacing w:after="0" w:line="260"/>
-            </w:pPr>
-            <w:r>
-              <w:rPr>
-                <w:color w:val="1A1A1A"/>
-              </w:rPr>
-              <w:t xml:space="preserve">Mr. G. Nirmal Raj (CEO); Dr. Anitha Rexalin Devaraj (Director, IIC); Mr. V. Velavan (Incubation Associate).</w:t>
-            </w:r>
-          </w:p>
-        </w:tc>
-      </w:tr>
-      <w:tr>
-        <w:tc>
-          <w:tcPr>
-            <w:tcW w:type="dxa" w:w="2500"/>
-            <w:tcBorders>
-              <w:top w:val="single" w:color="BBBBBB" w:sz="1"/>
-              <w:left w:val="single" w:color="BBBBBB" w:sz="1"/>
-              <w:bottom w:val="single" w:color="BBBBBB" w:sz="1"/>
-              <w:right w:val="single" w:color="BBBBBB" w:sz="1"/>
-            </w:tcBorders>
-            <w:shd w:fill="EEF3F5" w:val="clear"/>
-            <w:tcMar>
-              <w:top w:type="dxa" w:w="60"/>
-              <w:left w:type="dxa" w:w="110"/>
-              <w:bottom w:type="dxa" w:w="60"/>
-              <w:right w:type="dxa" w:w="110"/>
-            </w:tcMar>
-          </w:tcPr>
-          <w:p>
-            <w:pPr>
-              <w:spacing w:after="0" w:line="260"/>
-            </w:pPr>
-            <w:r>
-              <w:rPr>
-                <w:b/>
-                <w:bCs/>
-                <w:color w:val="1A1A1A"/>
-              </w:rPr>
-              <w:t xml:space="preserve">Contact</w:t>
-            </w:r>
-          </w:p>
-        </w:tc>
-        <w:tc>
-          <w:tcPr>
-            <w:tcW w:type="dxa" w:w="6526"/>
-            <w:tcBorders>
-              <w:top w:val="single" w:color="BBBBBB" w:sz="1"/>
-              <w:left w:val="single" w:color="BBBBBB" w:sz="1"/>
-              <w:bottom w:val="single" w:color="BBBBBB" w:sz="1"/>
-              <w:right w:val="single" w:color="BBBBBB" w:sz="1"/>
-            </w:tcBorders>
-            <w:tcMar>
-              <w:top w:type="dxa" w:w="60"/>
-              <w:left w:type="dxa" w:w="110"/>
-              <w:bottom w:type="dxa" w:w="60"/>
-              <w:right w:type="dxa" w:w="110"/>
-            </w:tcMar>
-          </w:tcPr>
-          <w:p>
-            <w:pPr>
-              <w:spacing w:after="0" w:line="260"/>
-            </w:pPr>
-            <w:r>
-              <w:rPr>
-                <w:color w:val="1A1A1A"/>
-              </w:rPr>
-              <w:t xml:space="preserve">aceii@ametuniv.ac.in  ·  +91 94863 03654, +91 96296 95776  ·  135 SH 49, Kanathur Reddykuppam, Tamil Nadu 603112.</w:t>
-            </w:r>
-          </w:p>
-        </w:tc>
-      </w:tr>
-    </w:tbl>
-    <w:p>
-      <w:pPr>
-        <w:pStyle w:val="Heading1"/>
-      </w:pPr>
-      <w:r>
-        <w:t xml:space="preserve">4.  Why a Redesign — Problem &amp; Opportunity</w:t>
-      </w:r>
-    </w:p>
-    <w:p>
-      <w:pPr>
-        <w:spacing w:after="140" w:line="276"/>
-        <w:jc w:val="both"/>
-      </w:pPr>
-      <w:r>
-        <w:t xml:space="preserve">The current website serves its basic purpose, but it under-represents the ambition of a maritime incubation cell. We see the following gaps and opportunities:</w:t>
-      </w:r>
-    </w:p>
-    <w:p>
-      <w:pPr>
-        <w:pStyle w:val="ListParagraph"/>
-        <w:numPr>
-          <w:ilvl w:val="0"/>
-          <w:numId w:val="2"/>
-        </w:numPr>
-        <w:spacing w:after="70" w:line="270"/>
-      </w:pPr>
-      <w:r>
-        <w:rPr>
-          <w:b/>
-          <w:bCs/>
-        </w:rPr>
-        <w:t xml:space="preserve">Limited depth: </w:t>
-      </w:r>
-      <w:r>
-        <w:t xml:space="preserve">key information a founder looks for — incubation programmes, facilities, mentors, success stories — is not presented in detail.</w:t>
-      </w:r>
-    </w:p>
-    <w:p>
-      <w:pPr>
-        <w:pStyle w:val="ListParagraph"/>
-        <w:numPr>
-          <w:ilvl w:val="0"/>
-          <w:numId w:val="2"/>
-        </w:numPr>
-        <w:spacing w:after="70" w:line="270"/>
-      </w:pPr>
-      <w:r>
-        <w:rPr>
-          <w:b/>
-          <w:bCs/>
-        </w:rPr>
-        <w:t xml:space="preserve">Dated first impression: </w:t>
-      </w:r>
-      <w:r>
-        <w:t xml:space="preserve">the design does not yet convey a ‘leading incubator’ image to founders, investors and partners.</w:t>
-      </w:r>
-    </w:p>
-    <w:p>
-      <w:pPr>
-        <w:pStyle w:val="ListParagraph"/>
-        <w:numPr>
-          <w:ilvl w:val="0"/>
-          <w:numId w:val="2"/>
-        </w:numPr>
-        <w:spacing w:after="70" w:line="270"/>
-      </w:pPr>
-      <w:r>
-        <w:rPr>
-          <w:b/>
-          <w:bCs/>
-        </w:rPr>
-        <w:t xml:space="preserve">External dependency: </w:t>
-      </w:r>
-      <w:r>
-        <w:t xml:space="preserve">every content change (a new event, a new startup, an updated contact) must go through a third-party vendor — adding cost and delay.</w:t>
-      </w:r>
-    </w:p>
-    <w:p>
-      <w:pPr>
-        <w:pStyle w:val="ListParagraph"/>
-        <w:numPr>
-          <w:ilvl w:val="0"/>
-          <w:numId w:val="2"/>
-        </w:numPr>
-        <w:spacing w:after="70" w:line="270"/>
-      </w:pPr>
-      <w:r>
-        <w:rPr>
-          <w:b/>
-          <w:bCs/>
-        </w:rPr>
-        <w:t xml:space="preserve">Missed engagement: </w:t>
-      </w:r>
-      <w:r>
-        <w:t xml:space="preserve">there is no rich, guided online application or enquiry experience to capture and organise interest from founders.</w:t>
-      </w:r>
-    </w:p>
-    <w:p>
-      <w:pPr>
-        <w:spacing w:after="140" w:line="276"/>
-        <w:jc w:val="both"/>
-      </w:pPr>
-      <w:r>
-        <w:t xml:space="preserve">The opportunity is to turn the website into CEII’s strongest ambassador — and to bring its upkeep inside the university, where it becomes both cheaper and a live learning platform for students. </w:t>
-      </w:r>
-      <w:r>
-        <w:rPr>
-          <w:b/>
-          <w:bCs/>
-        </w:rPr>
-        <w:t xml:space="preserve">Our prototype (amet-ceii.vercel.app) already demonstrates what this can look like.</w:t>
-      </w:r>
-    </w:p>
-    <w:p>
-      <w:pPr>
-        <w:pStyle w:val="Heading1"/>
-      </w:pPr>
-      <w:r>
-        <w:t xml:space="preserve">5.  The Proposed Solution</w:t>
-      </w:r>
-    </w:p>
-    <w:p>
-      <w:pPr>
-        <w:pStyle w:val="Heading2"/>
-      </w:pPr>
-      <w:r>
-        <w:t xml:space="preserve">5.1  A ten-page site built around the founder’s journey</w:t>
-      </w:r>
-    </w:p>
-    <w:tbl>
-      <w:tblPr>
-        <w:tblW w:type="dxa" w:w="9026"/>
-        <w:tblBorders>
-          <w:top w:val="single" w:color="auto" w:sz="4"/>
-          <w:left w:val="single" w:color="auto" w:sz="4"/>
-          <w:bottom w:val="single" w:color="auto" w:sz="4"/>
-          <w:right w:val="single" w:color="auto" w:sz="4"/>
-          <w:insideH w:val="single" w:color="auto" w:sz="4"/>
-          <w:insideV w:val="single" w:color="auto" w:sz="4"/>
-        </w:tblBorders>
-      </w:tblPr>
-      <w:tblGrid>
-        <w:gridCol w:w="2200"/>
-        <w:gridCol w:w="6826"/>
-      </w:tblGrid>
-      <w:tr>
-        <w:trPr>
-          <w:tblHeader/>
-        </w:trPr>
-        <w:tc>
-          <w:tcPr>
-            <w:tcW w:type="dxa" w:w="2200"/>
-            <w:tcBorders>
-              <w:top w:val="single" w:color="BBBBBB" w:sz="1"/>
-              <w:left w:val="single" w:color="BBBBBB" w:sz="1"/>
-              <w:bottom w:val="single" w:color="BBBBBB" w:sz="1"/>
-              <w:right w:val="single" w:color="BBBBBB" w:sz="1"/>
-            </w:tcBorders>
-            <w:shd w:fill="0E2E42" w:val="clear"/>
-            <w:tcMar>
-              <w:top w:type="dxa" w:w="60"/>
-              <w:left w:type="dxa" w:w="110"/>
-              <w:bottom w:type="dxa" w:w="60"/>
-              <w:right w:type="dxa" w:w="110"/>
-            </w:tcMar>
-          </w:tcPr>
-          <w:p>
-            <w:pPr>
-              <w:spacing w:after="0" w:line="260"/>
-            </w:pPr>
-            <w:r>
-              <w:rPr>
-                <w:b/>
-                <w:bCs/>
-                <w:color w:val="FFFFFF"/>
-              </w:rPr>
-              <w:t xml:space="preserve">Page</w:t>
-            </w:r>
-          </w:p>
-        </w:tc>
-        <w:tc>
-          <w:tcPr>
-            <w:tcW w:type="dxa" w:w="6826"/>
-            <w:tcBorders>
-              <w:top w:val="single" w:color="BBBBBB" w:sz="1"/>
-              <w:left w:val="single" w:color="BBBBBB" w:sz="1"/>
-              <w:bottom w:val="single" w:color="BBBBBB" w:sz="1"/>
-              <w:right w:val="single" w:color="BBBBBB" w:sz="1"/>
-            </w:tcBorders>
-            <w:shd w:fill="0E2E42" w:val="clear"/>
-            <w:tcMar>
-              <w:top w:type="dxa" w:w="60"/>
-              <w:left w:type="dxa" w:w="110"/>
-              <w:bottom w:type="dxa" w:w="60"/>
-              <w:right w:type="dxa" w:w="110"/>
-            </w:tcMar>
-          </w:tcPr>
-          <w:p>
-            <w:pPr>
-              <w:spacing w:after="0" w:line="260"/>
-            </w:pPr>
-            <w:r>
-              <w:rPr>
-                <w:b/>
-                <w:bCs/>
-                <w:color w:val="FFFFFF"/>
-              </w:rPr>
-              <w:t xml:space="preserve">Purpose</w:t>
-            </w:r>
-          </w:p>
-        </w:tc>
-      </w:tr>
-      <w:tr>
-        <w:tc>
-          <w:tcPr>
-            <w:tcW w:type="dxa" w:w="2200"/>
-            <w:tcBorders>
-              <w:top w:val="single" w:color="BBBBBB" w:sz="1"/>
-              <w:left w:val="single" w:color="BBBBBB" w:sz="1"/>
-              <w:bottom w:val="single" w:color="BBBBBB" w:sz="1"/>
-              <w:right w:val="single" w:color="BBBBBB" w:sz="1"/>
-            </w:tcBorders>
-            <w:tcMar>
-              <w:top w:type="dxa" w:w="60"/>
-              <w:left w:type="dxa" w:w="110"/>
-              <w:bottom w:type="dxa" w:w="60"/>
-              <w:right w:type="dxa" w:w="110"/>
-            </w:tcMar>
-          </w:tcPr>
-          <w:p>
-            <w:pPr>
-              <w:spacing w:after="0" w:line="260"/>
-            </w:pPr>
-            <w:r>
-              <w:rPr>
-                <w:b/>
-                <w:bCs/>
-                <w:color w:val="1A1A1A"/>
-              </w:rPr>
-              <w:t xml:space="preserve">Home</w:t>
-            </w:r>
-          </w:p>
-        </w:tc>
-        <w:tc>
-          <w:tcPr>
-            <w:tcW w:type="dxa" w:w="6826"/>
-            <w:tcBorders>
-              <w:top w:val="single" w:color="BBBBBB" w:sz="1"/>
-              <w:left w:val="single" w:color="BBBBBB" w:sz="1"/>
-              <w:bottom w:val="single" w:color="BBBBBB" w:sz="1"/>
-              <w:right w:val="single" w:color="BBBBBB" w:sz="1"/>
-            </w:tcBorders>
-            <w:tcMar>
-              <w:top w:type="dxa" w:w="60"/>
-              <w:left w:type="dxa" w:w="110"/>
-              <w:bottom w:type="dxa" w:w="60"/>
-              <w:right w:type="dxa" w:w="110"/>
-            </w:tcMar>
-          </w:tcPr>
-          <w:p>
-            <w:pPr>
-              <w:spacing w:after="0" w:line="260"/>
-            </w:pPr>
-            <w:r>
-              <w:rPr>
-                <w:color w:val="1A1A1A"/>
-              </w:rPr>
-              <w:t xml:space="preserve">Bold introduction to CEII, the maritime focus, key highlights and clear calls to action.</w:t>
-            </w:r>
-          </w:p>
-        </w:tc>
-      </w:tr>
-      <w:tr>
-        <w:tc>
-          <w:tcPr>
-            <w:tcW w:type="dxa" w:w="2200"/>
-            <w:tcBorders>
-              <w:top w:val="single" w:color="BBBBBB" w:sz="1"/>
-              <w:left w:val="single" w:color="BBBBBB" w:sz="1"/>
-              <w:bottom w:val="single" w:color="BBBBBB" w:sz="1"/>
-              <w:right w:val="single" w:color="BBBBBB" w:sz="1"/>
-            </w:tcBorders>
-            <w:tcMar>
-              <w:top w:type="dxa" w:w="60"/>
-              <w:left w:type="dxa" w:w="110"/>
-              <w:bottom w:type="dxa" w:w="60"/>
-              <w:right w:type="dxa" w:w="110"/>
-            </w:tcMar>
-          </w:tcPr>
-          <w:p>
-            <w:pPr>
-              <w:spacing w:after="0" w:line="260"/>
-            </w:pPr>
-            <w:r>
-              <w:rPr>
-                <w:b/>
-                <w:bCs/>
-                <w:color w:val="1A1A1A"/>
-              </w:rPr>
-              <w:t xml:space="preserve">About</w:t>
-            </w:r>
-          </w:p>
-        </w:tc>
-        <w:tc>
-          <w:tcPr>
-            <w:tcW w:type="dxa" w:w="6826"/>
-            <w:tcBorders>
-              <w:top w:val="single" w:color="BBBBBB" w:sz="1"/>
-              <w:left w:val="single" w:color="BBBBBB" w:sz="1"/>
-              <w:bottom w:val="single" w:color="BBBBBB" w:sz="1"/>
-              <w:right w:val="single" w:color="BBBBBB" w:sz="1"/>
-            </w:tcBorders>
-            <w:tcMar>
-              <w:top w:type="dxa" w:w="60"/>
-              <w:left w:type="dxa" w:w="110"/>
-              <w:bottom w:type="dxa" w:w="60"/>
-              <w:right w:type="dxa" w:w="110"/>
-            </w:tcMar>
-          </w:tcPr>
-          <w:p>
-            <w:pPr>
-              <w:spacing w:after="0" w:line="260"/>
-            </w:pPr>
-            <w:r>
-              <w:rPr>
-                <w:color w:val="1A1A1A"/>
-              </w:rPr>
-              <w:t xml:space="preserve">Vision, mission (as above), story, values and the CEII’s place within AMET University.</w:t>
-            </w:r>
-          </w:p>
-        </w:tc>
-      </w:tr>
-      <w:tr>
-        <w:tc>
-          <w:tcPr>
-            <w:tcW w:type="dxa" w:w="2200"/>
-            <w:tcBorders>
-              <w:top w:val="single" w:color="BBBBBB" w:sz="1"/>
-              <w:left w:val="single" w:color="BBBBBB" w:sz="1"/>
-              <w:bottom w:val="single" w:color="BBBBBB" w:sz="1"/>
-              <w:right w:val="single" w:color="BBBBBB" w:sz="1"/>
-            </w:tcBorders>
-            <w:tcMar>
-              <w:top w:type="dxa" w:w="60"/>
-              <w:left w:type="dxa" w:w="110"/>
-              <w:bottom w:type="dxa" w:w="60"/>
-              <w:right w:type="dxa" w:w="110"/>
-            </w:tcMar>
-          </w:tcPr>
-          <w:p>
-            <w:pPr>
-              <w:spacing w:after="0" w:line="260"/>
-            </w:pPr>
-            <w:r>
-              <w:rPr>
-                <w:b/>
-                <w:bCs/>
-                <w:color w:val="1A1A1A"/>
-              </w:rPr>
-              <w:t xml:space="preserve">Programs</w:t>
-            </w:r>
-          </w:p>
-        </w:tc>
-        <w:tc>
-          <w:tcPr>
-            <w:tcW w:type="dxa" w:w="6826"/>
-            <w:tcBorders>
-              <w:top w:val="single" w:color="BBBBBB" w:sz="1"/>
-              <w:left w:val="single" w:color="BBBBBB" w:sz="1"/>
-              <w:bottom w:val="single" w:color="BBBBBB" w:sz="1"/>
-              <w:right w:val="single" w:color="BBBBBB" w:sz="1"/>
-            </w:tcBorders>
-            <w:tcMar>
-              <w:top w:type="dxa" w:w="60"/>
-              <w:left w:type="dxa" w:w="110"/>
-              <w:bottom w:type="dxa" w:w="60"/>
-              <w:right w:type="dxa" w:w="110"/>
-            </w:tcMar>
-          </w:tcPr>
-          <w:p>
-            <w:pPr>
-              <w:spacing w:after="0" w:line="260"/>
-            </w:pPr>
-            <w:r>
-              <w:rPr>
-                <w:color w:val="1A1A1A"/>
-              </w:rPr>
-              <w:t xml:space="preserve">The incubation journey — pre-incubation, incubation, acceleration and always-on community support.</w:t>
-            </w:r>
-          </w:p>
-        </w:tc>
-      </w:tr>
-      <w:tr>
-        <w:tc>
-          <w:tcPr>
-            <w:tcW w:type="dxa" w:w="2200"/>
-            <w:tcBorders>
-              <w:top w:val="single" w:color="BBBBBB" w:sz="1"/>
-              <w:left w:val="single" w:color="BBBBBB" w:sz="1"/>
-              <w:bottom w:val="single" w:color="BBBBBB" w:sz="1"/>
-              <w:right w:val="single" w:color="BBBBBB" w:sz="1"/>
-            </w:tcBorders>
-            <w:tcMar>
-              <w:top w:type="dxa" w:w="60"/>
-              <w:left w:type="dxa" w:w="110"/>
-              <w:bottom w:type="dxa" w:w="60"/>
-              <w:right w:type="dxa" w:w="110"/>
-            </w:tcMar>
-          </w:tcPr>
-          <w:p>
-            <w:pPr>
-              <w:spacing w:after="0" w:line="260"/>
-            </w:pPr>
-            <w:r>
-              <w:rPr>
-                <w:b/>
-                <w:bCs/>
-                <w:color w:val="1A1A1A"/>
-              </w:rPr>
-              <w:t xml:space="preserve">Portfolio</w:t>
-            </w:r>
-          </w:p>
-        </w:tc>
-        <w:tc>
-          <w:tcPr>
-            <w:tcW w:type="dxa" w:w="6826"/>
-            <w:tcBorders>
-              <w:top w:val="single" w:color="BBBBBB" w:sz="1"/>
-              <w:left w:val="single" w:color="BBBBBB" w:sz="1"/>
-              <w:bottom w:val="single" w:color="BBBBBB" w:sz="1"/>
-              <w:right w:val="single" w:color="BBBBBB" w:sz="1"/>
-            </w:tcBorders>
-            <w:tcMar>
-              <w:top w:type="dxa" w:w="60"/>
-              <w:left w:type="dxa" w:w="110"/>
-              <w:bottom w:type="dxa" w:w="60"/>
-              <w:right w:type="dxa" w:w="110"/>
-            </w:tcMar>
-          </w:tcPr>
-          <w:p>
-            <w:pPr>
-              <w:spacing w:after="0" w:line="260"/>
-            </w:pPr>
-            <w:r>
-              <w:rPr>
-                <w:color w:val="1A1A1A"/>
-              </w:rPr>
-              <w:t xml:space="preserve">Startups incubated at CEII, filterable by sector (ocean-tech, logistics, aquaculture, etc.).</w:t>
-            </w:r>
-          </w:p>
-        </w:tc>
-      </w:tr>
-      <w:tr>
-        <w:tc>
-          <w:tcPr>
-            <w:tcW w:type="dxa" w:w="2200"/>
-            <w:tcBorders>
-              <w:top w:val="single" w:color="BBBBBB" w:sz="1"/>
-              <w:left w:val="single" w:color="BBBBBB" w:sz="1"/>
-              <w:bottom w:val="single" w:color="BBBBBB" w:sz="1"/>
-              <w:right w:val="single" w:color="BBBBBB" w:sz="1"/>
-            </w:tcBorders>
-            <w:tcMar>
-              <w:top w:type="dxa" w:w="60"/>
-              <w:left w:type="dxa" w:w="110"/>
-              <w:bottom w:type="dxa" w:w="60"/>
-              <w:right w:type="dxa" w:w="110"/>
-            </w:tcMar>
-          </w:tcPr>
-          <w:p>
-            <w:pPr>
-              <w:spacing w:after="0" w:line="260"/>
-            </w:pPr>
-            <w:r>
-              <w:rPr>
-                <w:b/>
-                <w:bCs/>
-                <w:color w:val="1A1A1A"/>
-              </w:rPr>
-              <w:t xml:space="preserve">Events</w:t>
-            </w:r>
-          </w:p>
-        </w:tc>
-        <w:tc>
-          <w:tcPr>
-            <w:tcW w:type="dxa" w:w="6826"/>
-            <w:tcBorders>
-              <w:top w:val="single" w:color="BBBBBB" w:sz="1"/>
-              <w:left w:val="single" w:color="BBBBBB" w:sz="1"/>
-              <w:bottom w:val="single" w:color="BBBBBB" w:sz="1"/>
-              <w:right w:val="single" w:color="BBBBBB" w:sz="1"/>
-            </w:tcBorders>
-            <w:tcMar>
-              <w:top w:type="dxa" w:w="60"/>
-              <w:left w:type="dxa" w:w="110"/>
-              <w:bottom w:type="dxa" w:w="60"/>
-              <w:right w:type="dxa" w:w="110"/>
-            </w:tcMar>
-          </w:tcPr>
-          <w:p>
-            <w:pPr>
-              <w:spacing w:after="0" w:line="260"/>
-            </w:pPr>
-            <w:r>
-              <w:rPr>
-                <w:color w:val="1A1A1A"/>
-              </w:rPr>
-              <w:t xml:space="preserve">Demo days, workshops, hackathons and the annual calendar.</w:t>
-            </w:r>
-          </w:p>
-        </w:tc>
-      </w:tr>
-      <w:tr>
-        <w:tc>
-          <w:tcPr>
-            <w:tcW w:type="dxa" w:w="2200"/>
-            <w:tcBorders>
-              <w:top w:val="single" w:color="BBBBBB" w:sz="1"/>
-              <w:left w:val="single" w:color="BBBBBB" w:sz="1"/>
-              <w:bottom w:val="single" w:color="BBBBBB" w:sz="1"/>
-              <w:right w:val="single" w:color="BBBBBB" w:sz="1"/>
-            </w:tcBorders>
-            <w:tcMar>
-              <w:top w:type="dxa" w:w="60"/>
-              <w:left w:type="dxa" w:w="110"/>
-              <w:bottom w:type="dxa" w:w="60"/>
-              <w:right w:type="dxa" w:w="110"/>
-            </w:tcMar>
-          </w:tcPr>
-          <w:p>
-            <w:pPr>
-              <w:spacing w:after="0" w:line="260"/>
-            </w:pPr>
-            <w:r>
-              <w:rPr>
-                <w:b/>
-                <w:bCs/>
-                <w:color w:val="1A1A1A"/>
-              </w:rPr>
-              <w:t xml:space="preserve">Team &amp; Mentors</w:t>
-            </w:r>
-          </w:p>
-        </w:tc>
-        <w:tc>
-          <w:tcPr>
-            <w:tcW w:type="dxa" w:w="6826"/>
-            <w:tcBorders>
-              <w:top w:val="single" w:color="BBBBBB" w:sz="1"/>
-              <w:left w:val="single" w:color="BBBBBB" w:sz="1"/>
-              <w:bottom w:val="single" w:color="BBBBBB" w:sz="1"/>
-              <w:right w:val="single" w:color="BBBBBB" w:sz="1"/>
-            </w:tcBorders>
-            <w:tcMar>
-              <w:top w:type="dxa" w:w="60"/>
-              <w:left w:type="dxa" w:w="110"/>
-              <w:bottom w:type="dxa" w:w="60"/>
-              <w:right w:type="dxa" w:w="110"/>
-            </w:tcMar>
-          </w:tcPr>
-          <w:p>
-            <w:pPr>
-              <w:spacing w:after="0" w:line="260"/>
-            </w:pPr>
-            <w:r>
-              <w:rPr>
-                <w:color w:val="1A1A1A"/>
-              </w:rPr>
-              <w:t xml:space="preserve">The CEII team (real) and the mentor / advisor network.</w:t>
-            </w:r>
-          </w:p>
-        </w:tc>
-      </w:tr>
-      <w:tr>
-        <w:tc>
-          <w:tcPr>
-            <w:tcW w:type="dxa" w:w="2200"/>
-            <w:tcBorders>
-              <w:top w:val="single" w:color="BBBBBB" w:sz="1"/>
-              <w:left w:val="single" w:color="BBBBBB" w:sz="1"/>
-              <w:bottom w:val="single" w:color="BBBBBB" w:sz="1"/>
-              <w:right w:val="single" w:color="BBBBBB" w:sz="1"/>
-            </w:tcBorders>
-            <w:tcMar>
-              <w:top w:type="dxa" w:w="60"/>
-              <w:left w:type="dxa" w:w="110"/>
-              <w:bottom w:type="dxa" w:w="60"/>
-              <w:right w:type="dxa" w:w="110"/>
-            </w:tcMar>
-          </w:tcPr>
-          <w:p>
-            <w:pPr>
-              <w:spacing w:after="0" w:line="260"/>
-            </w:pPr>
-            <w:r>
-              <w:rPr>
-                <w:b/>
-                <w:bCs/>
-                <w:color w:val="1A1A1A"/>
-              </w:rPr>
-              <w:t xml:space="preserve">Resources</w:t>
-            </w:r>
-          </w:p>
-        </w:tc>
-        <w:tc>
-          <w:tcPr>
-            <w:tcW w:type="dxa" w:w="6826"/>
-            <w:tcBorders>
-              <w:top w:val="single" w:color="BBBBBB" w:sz="1"/>
-              <w:left w:val="single" w:color="BBBBBB" w:sz="1"/>
-              <w:bottom w:val="single" w:color="BBBBBB" w:sz="1"/>
-              <w:right w:val="single" w:color="BBBBBB" w:sz="1"/>
-            </w:tcBorders>
-            <w:tcMar>
-              <w:top w:type="dxa" w:w="60"/>
-              <w:left w:type="dxa" w:w="110"/>
-              <w:bottom w:type="dxa" w:w="60"/>
-              <w:right w:type="dxa" w:w="110"/>
-            </w:tcMar>
-          </w:tcPr>
-          <w:p>
-            <w:pPr>
-              <w:spacing w:after="0" w:line="260"/>
-            </w:pPr>
-            <w:r>
-              <w:rPr>
-                <w:color w:val="1A1A1A"/>
-              </w:rPr>
-              <w:t xml:space="preserve">Facilities, labs, funding routes, legal and IP support, and partner networks.</w:t>
-            </w:r>
-          </w:p>
-        </w:tc>
-      </w:tr>
-      <w:tr>
-        <w:tc>
-          <w:tcPr>
-            <w:tcW w:type="dxa" w:w="2200"/>
-            <w:tcBorders>
-              <w:top w:val="single" w:color="BBBBBB" w:sz="1"/>
-              <w:left w:val="single" w:color="BBBBBB" w:sz="1"/>
-              <w:bottom w:val="single" w:color="BBBBBB" w:sz="1"/>
-              <w:right w:val="single" w:color="BBBBBB" w:sz="1"/>
-            </w:tcBorders>
-            <w:tcMar>
-              <w:top w:type="dxa" w:w="60"/>
-              <w:left w:type="dxa" w:w="110"/>
-              <w:bottom w:type="dxa" w:w="60"/>
-              <w:right w:type="dxa" w:w="110"/>
-            </w:tcMar>
-          </w:tcPr>
-          <w:p>
-            <w:pPr>
-              <w:spacing w:after="0" w:line="260"/>
-            </w:pPr>
-            <w:r>
-              <w:rPr>
-                <w:b/>
-                <w:bCs/>
-                <w:color w:val="1A1A1A"/>
-              </w:rPr>
-              <w:t xml:space="preserve">Journal (Blog)</w:t>
-            </w:r>
-          </w:p>
-        </w:tc>
-        <w:tc>
-          <w:tcPr>
-            <w:tcW w:type="dxa" w:w="6826"/>
-            <w:tcBorders>
-              <w:top w:val="single" w:color="BBBBBB" w:sz="1"/>
-              <w:left w:val="single" w:color="BBBBBB" w:sz="1"/>
-              <w:bottom w:val="single" w:color="BBBBBB" w:sz="1"/>
-              <w:right w:val="single" w:color="BBBBBB" w:sz="1"/>
-            </w:tcBorders>
-            <w:tcMar>
-              <w:top w:type="dxa" w:w="60"/>
-              <w:left w:type="dxa" w:w="110"/>
-              <w:bottom w:type="dxa" w:w="60"/>
-              <w:right w:type="dxa" w:w="110"/>
-            </w:tcMar>
-          </w:tcPr>
-          <w:p>
-            <w:pPr>
-              <w:spacing w:after="0" w:line="260"/>
-            </w:pPr>
-            <w:r>
-              <w:rPr>
-                <w:color w:val="1A1A1A"/>
-              </w:rPr>
-              <w:t xml:space="preserve">Articles, founder stories and blue-economy insight.</w:t>
-            </w:r>
-          </w:p>
-        </w:tc>
-      </w:tr>
-      <w:tr>
-        <w:tc>
-          <w:tcPr>
-            <w:tcW w:type="dxa" w:w="2200"/>
-            <w:tcBorders>
-              <w:top w:val="single" w:color="BBBBBB" w:sz="1"/>
-              <w:left w:val="single" w:color="BBBBBB" w:sz="1"/>
-              <w:bottom w:val="single" w:color="BBBBBB" w:sz="1"/>
-              <w:right w:val="single" w:color="BBBBBB" w:sz="1"/>
-            </w:tcBorders>
-            <w:tcMar>
-              <w:top w:type="dxa" w:w="60"/>
-              <w:left w:type="dxa" w:w="110"/>
-              <w:bottom w:type="dxa" w:w="60"/>
-              <w:right w:type="dxa" w:w="110"/>
-            </w:tcMar>
-          </w:tcPr>
-          <w:p>
-            <w:pPr>
-              <w:spacing w:after="0" w:line="260"/>
-            </w:pPr>
-            <w:r>
-              <w:rPr>
-                <w:b/>
-                <w:bCs/>
-                <w:color w:val="1A1A1A"/>
-              </w:rPr>
-              <w:t xml:space="preserve">Apply</w:t>
-            </w:r>
-          </w:p>
-        </w:tc>
-        <w:tc>
-          <w:tcPr>
-            <w:tcW w:type="dxa" w:w="6826"/>
-            <w:tcBorders>
-              <w:top w:val="single" w:color="BBBBBB" w:sz="1"/>
-              <w:left w:val="single" w:color="BBBBBB" w:sz="1"/>
-              <w:bottom w:val="single" w:color="BBBBBB" w:sz="1"/>
-              <w:right w:val="single" w:color="BBBBBB" w:sz="1"/>
-            </w:tcBorders>
-            <w:tcMar>
-              <w:top w:type="dxa" w:w="60"/>
-              <w:left w:type="dxa" w:w="110"/>
-              <w:bottom w:type="dxa" w:w="60"/>
-              <w:right w:type="dxa" w:w="110"/>
-            </w:tcMar>
-          </w:tcPr>
-          <w:p>
-            <w:pPr>
-              <w:spacing w:after="0" w:line="260"/>
-            </w:pPr>
-            <w:r>
-              <w:rPr>
-                <w:color w:val="1A1A1A"/>
-              </w:rPr>
-              <w:t xml:space="preserve">A short, guided multi-step application form for founders.</w:t>
-            </w:r>
-          </w:p>
-        </w:tc>
-      </w:tr>
-      <w:tr>
-        <w:tc>
-          <w:tcPr>
-            <w:tcW w:type="dxa" w:w="2200"/>
-            <w:tcBorders>
-              <w:top w:val="single" w:color="BBBBBB" w:sz="1"/>
-              <w:left w:val="single" w:color="BBBBBB" w:sz="1"/>
-              <w:bottom w:val="single" w:color="BBBBBB" w:sz="1"/>
-              <w:right w:val="single" w:color="BBBBBB" w:sz="1"/>
-            </w:tcBorders>
-            <w:tcMar>
-              <w:top w:type="dxa" w:w="60"/>
-              <w:left w:type="dxa" w:w="110"/>
-              <w:bottom w:type="dxa" w:w="60"/>
-              <w:right w:type="dxa" w:w="110"/>
-            </w:tcMar>
-          </w:tcPr>
-          <w:p>
-            <w:pPr>
-              <w:spacing w:after="0" w:line="260"/>
-            </w:pPr>
-            <w:r>
-              <w:rPr>
-                <w:b/>
-                <w:bCs/>
-                <w:color w:val="1A1A1A"/>
-              </w:rPr>
-              <w:t xml:space="preserve">Contact</w:t>
-            </w:r>
-          </w:p>
-        </w:tc>
-        <w:tc>
-          <w:tcPr>
-            <w:tcW w:type="dxa" w:w="6826"/>
-            <w:tcBorders>
-              <w:top w:val="single" w:color="BBBBBB" w:sz="1"/>
-              <w:left w:val="single" w:color="BBBBBB" w:sz="1"/>
-              <w:bottom w:val="single" w:color="BBBBBB" w:sz="1"/>
-              <w:right w:val="single" w:color="BBBBBB" w:sz="1"/>
-            </w:tcBorders>
-            <w:tcMar>
-              <w:top w:type="dxa" w:w="60"/>
-              <w:left w:type="dxa" w:w="110"/>
-              <w:bottom w:type="dxa" w:w="60"/>
-              <w:right w:type="dxa" w:w="110"/>
-            </w:tcMar>
-          </w:tcPr>
-          <w:p>
-            <w:pPr>
-              <w:spacing w:after="0" w:line="260"/>
-            </w:pPr>
-            <w:r>
-              <w:rPr>
-                <w:color w:val="1A1A1A"/>
-              </w:rPr>
-              <w:t xml:space="preserve">All contact details, location map and an enquiry form.</w:t>
-            </w:r>
-          </w:p>
-        </w:tc>
-      </w:tr>
-    </w:tbl>
-    <w:p>
-      <w:pPr>
-        <w:spacing w:after="140" w:line="276"/>
-        <w:jc w:val="both"/>
-      </w:pPr>
-      <w:r>
-        <w:t xml:space="preserve">Note: </w:t>
-      </w:r>
-      <w:r>
-        <w:rPr>
-          <w:i/>
-          <w:iCs/>
-        </w:rPr>
-        <w:t xml:space="preserve">the prototype currently shows clearly-labelled sample content (e.g., example startups and events). During the project, all such placeholders will be replaced with real information supplied by the CEII.</w:t>
-      </w:r>
-    </w:p>
-    <w:p>
-      <w:pPr>
-        <w:pStyle w:val="Heading2"/>
-      </w:pPr>
-      <w:r>
-        <w:t xml:space="preserve">5.2  Key features</w:t>
-      </w:r>
-    </w:p>
-    <w:p>
-      <w:pPr>
-        <w:pStyle w:val="ListParagraph"/>
-        <w:numPr>
-          <w:ilvl w:val="0"/>
-          <w:numId w:val="2"/>
-        </w:numPr>
-        <w:spacing w:after="70" w:line="270"/>
-      </w:pPr>
-      <w:r>
-        <w:rPr>
-          <w:b/>
-          <w:bCs/>
-        </w:rPr>
-        <w:t xml:space="preserve">Distinctive maritime identity </w:t>
-      </w:r>
-      <w:r>
-        <w:t xml:space="preserve">— a professional ‘harbour’ theme (deep-ocean palette, nautical detailing) fitting a maritime university.</w:t>
-      </w:r>
-    </w:p>
-    <w:p>
-      <w:pPr>
-        <w:pStyle w:val="ListParagraph"/>
-        <w:numPr>
-          <w:ilvl w:val="0"/>
-          <w:numId w:val="2"/>
-        </w:numPr>
-        <w:spacing w:after="70" w:line="270"/>
-      </w:pPr>
-      <w:r>
-        <w:rPr>
-          <w:b/>
-          <w:bCs/>
-        </w:rPr>
-        <w:t xml:space="preserve">Fully mobile-responsive </w:t>
-      </w:r>
-      <w:r>
-        <w:t xml:space="preserve">— works cleanly on phones, tablets and desktops.</w:t>
-      </w:r>
-    </w:p>
-    <w:p>
-      <w:pPr>
-        <w:pStyle w:val="ListParagraph"/>
-        <w:numPr>
-          <w:ilvl w:val="0"/>
-          <w:numId w:val="2"/>
-        </w:numPr>
-        <w:spacing w:after="70" w:line="270"/>
-      </w:pPr>
-      <w:r>
-        <w:rPr>
-          <w:b/>
-          <w:bCs/>
-        </w:rPr>
-        <w:t xml:space="preserve">Online application &amp; enquiry system </w:t>
-      </w:r>
-      <w:r>
-        <w:t xml:space="preserve">— submissions are emailed directly to aceii@ametuniv.ac.in.</w:t>
-      </w:r>
-    </w:p>
-    <w:p>
-      <w:pPr>
-        <w:pStyle w:val="ListParagraph"/>
-        <w:numPr>
-          <w:ilvl w:val="0"/>
-          <w:numId w:val="2"/>
-        </w:numPr>
-        <w:spacing w:after="70" w:line="270"/>
-      </w:pPr>
-      <w:r>
-        <w:rPr>
-          <w:b/>
-          <w:bCs/>
-        </w:rPr>
-        <w:t xml:space="preserve">Fast and accessible </w:t>
-      </w:r>
-      <w:r>
-        <w:t xml:space="preserve">— lightweight pages, good search-engine visibility, readable for everyone.</w:t>
-      </w:r>
-    </w:p>
-    <w:p>
-      <w:pPr>
-        <w:pStyle w:val="ListParagraph"/>
-        <w:numPr>
-          <w:ilvl w:val="0"/>
-          <w:numId w:val="2"/>
-        </w:numPr>
-        <w:spacing w:after="70" w:line="270"/>
-      </w:pPr>
-      <w:r>
-        <w:rPr>
-          <w:b/>
-          <w:bCs/>
-        </w:rPr>
-        <w:t xml:space="preserve">Easy to update </w:t>
-      </w:r>
-      <w:r>
-        <w:t xml:space="preserve">— a shared design system means content can be changed quickly and consistently.</w:t>
-      </w:r>
-    </w:p>
-    <w:p>
-      <w:pPr>
-        <w:pStyle w:val="Heading2"/>
-      </w:pPr>
-      <w:r>
-        <w:t xml:space="preserve">5.3  Prototype preview</w:t>
-      </w:r>
-    </w:p>
-    <w:p>
-      <w:pPr>
-        <w:spacing w:after="40" w:before="100"/>
         <w:jc w:val="center"/>
       </w:pPr>
       <w:r>
         <w:drawing>
           <wp:inline distT="0" distB="0" distL="0" distR="0">
-            <wp:extent cx="5334000" cy="3257550"/>
+            <wp:extent cx="876300" cy="876300"/>
             <wp:effectExtent t="0" r="0" b="0" l="0"/>
-            <wp:docPr id="1" name="home_top.png" descr="Figure 1 — Redesigned Home page (working prototype)." title="Figure 1 — Redesigned Home page (working prototype)."/>
+            <wp:docPr id="1" name="logo" descr="AMET CEII logo" title="AMET CEII"/>
             <wp:cNvGraphicFramePr>
               <a:graphicFrameLocks xmlns:a="http://schemas.openxmlformats.org/drawingml/2006/main" noChangeAspect="1"/>
             </wp:cNvGraphicFramePr>
@@ -2370,7 +35,7 @@
                   <pic:spPr bwMode="auto">
                     <a:xfrm>
                       <a:off x="0" y="0"/>
-                      <a:ext cx="5334000" cy="3257550"/>
+                      <a:ext cx="876300" cy="876300"/>
                     </a:xfrm>
                     <a:prstGeom prst="rect">
                       <a:avLst/>
@@ -2385,18 +50,2418 @@
     </w:p>
     <w:p>
       <w:pPr>
-        <w:spacing w:after="160"/>
+        <w:spacing w:after="200"/>
         <w:jc w:val="center"/>
       </w:pPr>
+      <w:r>
+        <w:rPr>
+          <w:b/>
+          <w:bCs/>
+          <w:color w:val="0E2E42"/>
+          <w:sz w:val="22"/>
+          <w:szCs w:val="22"/>
+        </w:rPr>
+        <w:t xml:space="preserve">AMET Centre for Entrepreneurship, Innovation &amp; Incubation</w:t>
+      </w:r>
+    </w:p>
+    <w:p>
+      <w:pPr>
+        <w:spacing w:after="40"/>
+        <w:jc w:val="right"/>
+      </w:pPr>
+      <w:r>
+        <w:rPr>
+          <w:color w:val="595959"/>
+        </w:rPr>
+        <w:t xml:space="preserve">Date: ______________</w:t>
+      </w:r>
+    </w:p>
+    <w:p>
+      <w:pPr>
+        <w:spacing w:after="100"/>
+      </w:pPr>
+    </w:p>
+    <w:p>
+      <w:pPr>
+        <w:spacing w:after="140" w:line="276"/>
+      </w:pPr>
+      <w:r>
+        <w:rPr>
+          <w:b/>
+          <w:bCs/>
+        </w:rPr>
+        <w:t xml:space="preserve">To,</w:t>
+      </w:r>
+    </w:p>
+    <w:p>
+      <w:pPr>
+        <w:spacing w:after="140" w:line="276"/>
+      </w:pPr>
+      <w:r>
+        <w:rPr>
+          <w:b/>
+          <w:bCs/>
+        </w:rPr>
+        <w:t xml:space="preserve">The Registrar, Dr. V. Sangeetha Albin</w:t>
+      </w:r>
+    </w:p>
+    <w:p>
+      <w:pPr>
+        <w:spacing w:after="140" w:line="276"/>
+      </w:pPr>
+      <w:r>
+        <w:t xml:space="preserve">AMET University (Academy of Maritime Education and Training)</w:t>
+      </w:r>
+    </w:p>
+    <w:p>
+      <w:pPr>
+        <w:spacing w:after="140" w:line="276"/>
+      </w:pPr>
+      <w:r>
+        <w:t xml:space="preserve">135, SH 49, Kanathur Reddykuppam, Tamil Nadu – 603112</w:t>
+      </w:r>
+    </w:p>
+    <w:p>
+      <w:pPr>
+        <w:spacing w:after="120"/>
+      </w:pPr>
+    </w:p>
+    <w:p>
+      <w:pPr>
+        <w:spacing w:after="140" w:line="276"/>
+      </w:pPr>
+      <w:r>
+        <w:rPr>
+          <w:b/>
+          <w:bCs/>
+        </w:rPr>
+        <w:t xml:space="preserve">Subject: </w:t>
+      </w:r>
+      <w:r>
+        <w:t xml:space="preserve">Proposal to redesign and maintain the AMET CEII website (aceii.in) in-house as a student internship project.</w:t>
+      </w:r>
+    </w:p>
+    <w:p>
+      <w:pPr>
+        <w:spacing w:after="120"/>
+      </w:pPr>
+    </w:p>
+    <w:p>
+      <w:pPr>
+        <w:spacing w:after="140" w:line="276"/>
+      </w:pPr>
+      <w:r>
+        <w:t xml:space="preserve">Respected Madam,</w:t>
+      </w:r>
+    </w:p>
+    <w:p>
+      <w:pPr>
+        <w:spacing w:after="140" w:line="276"/>
+        <w:jc w:val="both"/>
+      </w:pPr>
+      <w:r>
+        <w:t xml:space="preserve">We are a team of five third-year students of </w:t>
+      </w:r>
+      <w:r>
+        <w:rPr>
+          <w:b/>
+          <w:bCs/>
+        </w:rPr>
+        <w:t xml:space="preserve">B.Sc. Artificial Intelligence and Machine Learning</w:t>
+      </w:r>
+      <w:r>
+        <w:t xml:space="preserve"> at AMET University. As part of our programme, we have acquired practical skills in web development, cloud deployment, user-interface design and the use of AI tools — and we would like to put these skills to work for our own university.</w:t>
+      </w:r>
+    </w:p>
+    <w:p>
+      <w:pPr>
+        <w:spacing w:after="140" w:line="276"/>
+        <w:jc w:val="both"/>
+      </w:pPr>
+      <w:r>
+        <w:t xml:space="preserve">We are writing to propose a complete redesign of the website of the </w:t>
+      </w:r>
+      <w:r>
+        <w:rPr>
+          <w:b/>
+          <w:bCs/>
+        </w:rPr>
+        <w:t xml:space="preserve">AMET Centre for Entrepreneurship, Innovation and Incubation (AMET CEII), aceii.in</w:t>
+      </w:r>
+      <w:r>
+        <w:t xml:space="preserve">, and to take over its ongoing maintenance in-house. At present this work is carried out by an external third-party agency. We believe that a student team, guided by the CEII and a faculty mentor, can deliver a world-class redesign and maintain it at a fraction of the recurring cost — while gaining real, industry-grade experience.</w:t>
+      </w:r>
+    </w:p>
+    <w:p>
+      <w:pPr>
+        <w:spacing w:after="140" w:line="276"/>
+        <w:jc w:val="both"/>
+      </w:pPr>
+      <w:r>
+        <w:t xml:space="preserve">To demonstrate our seriousness, we have already built a working prototype of the redesigned site, which can be viewed at </w:t>
+      </w:r>
+      <w:r>
+        <w:rPr>
+          <w:b/>
+          <w:bCs/>
+        </w:rPr>
+        <w:t xml:space="preserve">amet-ceii.vercel.app</w:t>
+      </w:r>
+      <w:r>
+        <w:t xml:space="preserve">. This proposal document sets out the background, the proposed solution, a detailed maintenance plan, and the internship arrangement we are requesting.</w:t>
+      </w:r>
+    </w:p>
+    <w:p>
+      <w:pPr>
+        <w:spacing w:after="140" w:line="276"/>
+        <w:jc w:val="both"/>
+      </w:pPr>
+      <w:r>
+        <w:t xml:space="preserve">We would be grateful for the opportunity to present this proposal to you in person. We thank you for your time and consideration.</w:t>
+      </w:r>
+    </w:p>
+    <w:p>
+      <w:pPr>
+        <w:spacing w:after="120"/>
+      </w:pPr>
+    </w:p>
+    <w:p>
+      <w:pPr>
+        <w:spacing w:after="140" w:line="276"/>
+      </w:pPr>
+      <w:r>
+        <w:t xml:space="preserve">Yours sincerely,</w:t>
+      </w:r>
+    </w:p>
+    <w:p>
+      <w:pPr>
+        <w:spacing w:after="140" w:line="276"/>
+      </w:pPr>
+      <w:r>
+        <w:rPr>
+          <w:b/>
+          <w:bCs/>
+        </w:rPr>
+        <w:t xml:space="preserve">The Student Project Team — B.Sc. AI &amp; ML (Third Year), AMET University</w:t>
+      </w:r>
+    </w:p>
+    <w:p>
+      <w:pPr>
+        <w:spacing w:after="60"/>
+      </w:pPr>
+    </w:p>
+    <w:p>
       <w:r>
         <w:rPr>
           <w:i/>
           <w:iCs/>
           <w:color w:val="595959"/>
-          <w:sz w:val="18"/>
-          <w:szCs w:val="18"/>
+          <w:sz w:val="20"/>
+          <w:szCs w:val="20"/>
         </w:rPr>
-        <w:t xml:space="preserve">Figure 1 — Redesigned Home page (working prototype).</w:t>
+        <w:t xml:space="preserve">[ Names &amp; register numbers on the team page overleaf ]</w:t>
+      </w:r>
+    </w:p>
+    <w:p>
+      <w:r>
+        <w:br w:type="page"/>
+      </w:r>
+    </w:p>
+    <w:p>
+      <w:pPr>
+        <w:pStyle w:val="Heading1"/>
+      </w:pPr>
+      <w:r>
+        <w:t xml:space="preserve">Contents</w:t>
+      </w:r>
+    </w:p>
+    <w:sdt>
+      <w:sdtPr>
+        <w:alias w:val="Contents"/>
+      </w:sdtPr>
+      <w:sdtContent>
+        <w:p>
+          <w:r>
+            <w:fldChar w:fldCharType="begin" w:dirty="true"/>
+            <w:instrText xml:space="preserve">TOC \h \o "1-1"</w:instrText>
+            <w:fldChar w:fldCharType="separate"/>
+          </w:r>
+        </w:p>
+        <w:p>
+          <w:r>
+            <w:fldChar w:fldCharType="end"/>
+          </w:r>
+        </w:p>
+      </w:sdtContent>
+    </w:sdt>
+    <w:p>
+      <w:r>
+        <w:br w:type="page"/>
+      </w:r>
+    </w:p>
+    <w:p>
+      <w:pPr>
+        <w:pStyle w:val="Heading1"/>
+      </w:pPr>
+      <w:r>
+        <w:t xml:space="preserve">1.  Executive Summary</w:t>
+      </w:r>
+    </w:p>
+    <w:p>
+      <w:pPr>
+        <w:spacing w:after="140" w:line="276"/>
+        <w:jc w:val="both"/>
+      </w:pPr>
+      <w:r>
+        <w:t xml:space="preserve">The AMET Centre for Entrepreneurship, Innovation and Incubation (CEII) is the university’s startup incubator, with a stated focus on the </w:t>
+      </w:r>
+      <w:r>
+        <w:rPr>
+          <w:b/>
+          <w:bCs/>
+        </w:rPr>
+        <w:t xml:space="preserve">maritime sector and the blue economy</w:t>
+      </w:r>
+      <w:r>
+        <w:t xml:space="preserve">. Its current website, aceii.in, is functional but minimal — built on Zoho Sites and maintained by an external vendor (TEMS Tech Solutions).</w:t>
+      </w:r>
+    </w:p>
+    <w:p>
+      <w:pPr>
+        <w:spacing w:after="140" w:line="276"/>
+        <w:jc w:val="both"/>
+      </w:pPr>
+      <w:r>
+        <w:t xml:space="preserve">We propose to:</w:t>
+      </w:r>
+    </w:p>
+    <w:p>
+      <w:pPr>
+        <w:pStyle w:val="ListParagraph"/>
+        <w:numPr>
+          <w:ilvl w:val="0"/>
+          <w:numId w:val="2"/>
+        </w:numPr>
+        <w:spacing w:after="70" w:line="270"/>
+      </w:pPr>
+      <w:r>
+        <w:rPr>
+          <w:b/>
+          <w:bCs/>
+        </w:rPr>
+        <w:t xml:space="preserve">Redesign </w:t>
+      </w:r>
+      <w:r>
+        <w:t xml:space="preserve">the website into a modern, professional, mobile-friendly platform that reflects CEII’s ambition to be a leading maritime incubation cell.</w:t>
+      </w:r>
+    </w:p>
+    <w:p>
+      <w:pPr>
+        <w:pStyle w:val="ListParagraph"/>
+        <w:numPr>
+          <w:ilvl w:val="0"/>
+          <w:numId w:val="2"/>
+        </w:numPr>
+        <w:spacing w:after="70" w:line="270"/>
+      </w:pPr>
+      <w:r>
+        <w:rPr>
+          <w:b/>
+          <w:bCs/>
+        </w:rPr>
+        <w:t xml:space="preserve">Maintain </w:t>
+      </w:r>
+      <w:r>
+        <w:t xml:space="preserve">the site in-house through a structured student internship, replacing the recurring third-party arrangement.</w:t>
+      </w:r>
+    </w:p>
+    <w:p>
+      <w:pPr>
+        <w:pStyle w:val="ListParagraph"/>
+        <w:numPr>
+          <w:ilvl w:val="0"/>
+          <w:numId w:val="2"/>
+        </w:numPr>
+        <w:spacing w:after="70" w:line="270"/>
+      </w:pPr>
+      <w:r>
+        <w:rPr>
+          <w:b/>
+          <w:bCs/>
+        </w:rPr>
+        <w:t xml:space="preserve">Document and hand over </w:t>
+      </w:r>
+      <w:r>
+        <w:t xml:space="preserve">the system so that future student batches can continue the work — building lasting capability within the university.</w:t>
+      </w:r>
+    </w:p>
+    <w:p>
+      <w:pPr>
+        <w:spacing w:after="140" w:line="276"/>
+        <w:jc w:val="both"/>
+      </w:pPr>
+      <w:r>
+        <w:t xml:space="preserve">A working prototype is already live at amet-ceii.vercel.app. The redesign expands the site from a handful of pages to ten well-structured pages, adds an online application and enquiry system, and introduces a distinctive maritime visual identity — all built on free and low-cost, industry-standard tools.</w:t>
+      </w:r>
+    </w:p>
+    <w:p>
+      <w:pPr>
+        <w:pStyle w:val="Heading1"/>
+      </w:pPr>
+      <w:r>
+        <w:t xml:space="preserve">2.  The Proposing Team</w:t>
+      </w:r>
+    </w:p>
+    <w:p>
+      <w:pPr>
+        <w:spacing w:after="140" w:line="276"/>
+        <w:jc w:val="both"/>
+      </w:pPr>
+      <w:r>
+        <w:t xml:space="preserve">We are five third-year B.Sc. Artificial Intelligence and Machine Learning students. Our programme has equipped us with programming, web-development, cloud and AI skills that map directly onto this project. Proposed roles are shown below (names and register numbers to be completed by the team):</w:t>
+      </w:r>
+    </w:p>
+    <w:tbl>
+      <w:tblPr>
+        <w:tblW w:type="dxa" w:w="9026"/>
+        <w:tblBorders>
+          <w:top w:val="single" w:color="auto" w:sz="4"/>
+          <w:left w:val="single" w:color="auto" w:sz="4"/>
+          <w:bottom w:val="single" w:color="auto" w:sz="4"/>
+          <w:right w:val="single" w:color="auto" w:sz="4"/>
+          <w:insideH w:val="single" w:color="auto" w:sz="4"/>
+          <w:insideV w:val="single" w:color="auto" w:sz="4"/>
+        </w:tblBorders>
+      </w:tblPr>
+      <w:tblGrid>
+        <w:gridCol w:w="3100"/>
+        <w:gridCol w:w="2400"/>
+        <w:gridCol w:w="3526"/>
+      </w:tblGrid>
+      <w:tr>
+        <w:trPr>
+          <w:tblHeader/>
+        </w:trPr>
+        <w:tc>
+          <w:tcPr>
+            <w:tcW w:type="dxa" w:w="3100"/>
+            <w:tcBorders>
+              <w:top w:val="single" w:color="BBBBBB" w:sz="1"/>
+              <w:left w:val="single" w:color="BBBBBB" w:sz="1"/>
+              <w:bottom w:val="single" w:color="BBBBBB" w:sz="1"/>
+              <w:right w:val="single" w:color="BBBBBB" w:sz="1"/>
+            </w:tcBorders>
+            <w:shd w:fill="0E2E42" w:val="clear"/>
+            <w:tcMar>
+              <w:top w:type="dxa" w:w="60"/>
+              <w:left w:type="dxa" w:w="110"/>
+              <w:bottom w:type="dxa" w:w="60"/>
+              <w:right w:type="dxa" w:w="110"/>
+            </w:tcMar>
+          </w:tcPr>
+          <w:p>
+            <w:pPr>
+              <w:spacing w:after="0" w:line="260"/>
+            </w:pPr>
+            <w:r>
+              <w:rPr>
+                <w:b/>
+                <w:bCs/>
+                <w:color w:val="FFFFFF"/>
+              </w:rPr>
+              <w:t xml:space="preserve">Student name</w:t>
+            </w:r>
+          </w:p>
+        </w:tc>
+        <w:tc>
+          <w:tcPr>
+            <w:tcW w:type="dxa" w:w="2400"/>
+            <w:tcBorders>
+              <w:top w:val="single" w:color="BBBBBB" w:sz="1"/>
+              <w:left w:val="single" w:color="BBBBBB" w:sz="1"/>
+              <w:bottom w:val="single" w:color="BBBBBB" w:sz="1"/>
+              <w:right w:val="single" w:color="BBBBBB" w:sz="1"/>
+            </w:tcBorders>
+            <w:shd w:fill="0E2E42" w:val="clear"/>
+            <w:tcMar>
+              <w:top w:type="dxa" w:w="60"/>
+              <w:left w:type="dxa" w:w="110"/>
+              <w:bottom w:type="dxa" w:w="60"/>
+              <w:right w:type="dxa" w:w="110"/>
+            </w:tcMar>
+          </w:tcPr>
+          <w:p>
+            <w:pPr>
+              <w:spacing w:after="0" w:line="260"/>
+            </w:pPr>
+            <w:r>
+              <w:rPr>
+                <w:b/>
+                <w:bCs/>
+                <w:color w:val="FFFFFF"/>
+              </w:rPr>
+              <w:t xml:space="preserve">Register number</w:t>
+            </w:r>
+          </w:p>
+        </w:tc>
+        <w:tc>
+          <w:tcPr>
+            <w:tcW w:type="dxa" w:w="3526"/>
+            <w:tcBorders>
+              <w:top w:val="single" w:color="BBBBBB" w:sz="1"/>
+              <w:left w:val="single" w:color="BBBBBB" w:sz="1"/>
+              <w:bottom w:val="single" w:color="BBBBBB" w:sz="1"/>
+              <w:right w:val="single" w:color="BBBBBB" w:sz="1"/>
+            </w:tcBorders>
+            <w:shd w:fill="0E2E42" w:val="clear"/>
+            <w:tcMar>
+              <w:top w:type="dxa" w:w="60"/>
+              <w:left w:type="dxa" w:w="110"/>
+              <w:bottom w:type="dxa" w:w="60"/>
+              <w:right w:type="dxa" w:w="110"/>
+            </w:tcMar>
+          </w:tcPr>
+          <w:p>
+            <w:pPr>
+              <w:spacing w:after="0" w:line="260"/>
+            </w:pPr>
+            <w:r>
+              <w:rPr>
+                <w:b/>
+                <w:bCs/>
+                <w:color w:val="FFFFFF"/>
+              </w:rPr>
+              <w:t xml:space="preserve">Role on the project</w:t>
+            </w:r>
+          </w:p>
+        </w:tc>
+      </w:tr>
+      <w:tr>
+        <w:tc>
+          <w:tcPr>
+            <w:tcW w:type="dxa" w:w="3100"/>
+            <w:tcBorders>
+              <w:top w:val="single" w:color="BBBBBB" w:sz="1"/>
+              <w:left w:val="single" w:color="BBBBBB" w:sz="1"/>
+              <w:bottom w:val="single" w:color="BBBBBB" w:sz="1"/>
+              <w:right w:val="single" w:color="BBBBBB" w:sz="1"/>
+            </w:tcBorders>
+            <w:tcMar>
+              <w:top w:type="dxa" w:w="60"/>
+              <w:left w:type="dxa" w:w="110"/>
+              <w:bottom w:type="dxa" w:w="60"/>
+              <w:right w:type="dxa" w:w="110"/>
+            </w:tcMar>
+          </w:tcPr>
+          <w:p>
+            <w:pPr>
+              <w:spacing w:after="0" w:line="260"/>
+            </w:pPr>
+            <w:r>
+              <w:rPr>
+                <w:color w:val="1A1A1A"/>
+              </w:rPr>
+              <w:t xml:space="preserve">[ Full name ]</w:t>
+            </w:r>
+          </w:p>
+        </w:tc>
+        <w:tc>
+          <w:tcPr>
+            <w:tcW w:type="dxa" w:w="2400"/>
+            <w:tcBorders>
+              <w:top w:val="single" w:color="BBBBBB" w:sz="1"/>
+              <w:left w:val="single" w:color="BBBBBB" w:sz="1"/>
+              <w:bottom w:val="single" w:color="BBBBBB" w:sz="1"/>
+              <w:right w:val="single" w:color="BBBBBB" w:sz="1"/>
+            </w:tcBorders>
+            <w:tcMar>
+              <w:top w:type="dxa" w:w="60"/>
+              <w:left w:type="dxa" w:w="110"/>
+              <w:bottom w:type="dxa" w:w="60"/>
+              <w:right w:type="dxa" w:w="110"/>
+            </w:tcMar>
+          </w:tcPr>
+          <w:p>
+            <w:pPr>
+              <w:spacing w:after="0" w:line="260"/>
+            </w:pPr>
+            <w:r>
+              <w:rPr>
+                <w:color w:val="1A1A1A"/>
+              </w:rPr>
+              <w:t xml:space="preserve">[ Reg. no. ]</w:t>
+            </w:r>
+          </w:p>
+        </w:tc>
+        <w:tc>
+          <w:tcPr>
+            <w:tcW w:type="dxa" w:w="3526"/>
+            <w:tcBorders>
+              <w:top w:val="single" w:color="BBBBBB" w:sz="1"/>
+              <w:left w:val="single" w:color="BBBBBB" w:sz="1"/>
+              <w:bottom w:val="single" w:color="BBBBBB" w:sz="1"/>
+              <w:right w:val="single" w:color="BBBBBB" w:sz="1"/>
+            </w:tcBorders>
+            <w:tcMar>
+              <w:top w:type="dxa" w:w="60"/>
+              <w:left w:type="dxa" w:w="110"/>
+              <w:bottom w:type="dxa" w:w="60"/>
+              <w:right w:type="dxa" w:w="110"/>
+            </w:tcMar>
+          </w:tcPr>
+          <w:p>
+            <w:pPr>
+              <w:spacing w:after="0" w:line="260"/>
+            </w:pPr>
+            <w:r>
+              <w:rPr>
+                <w:color w:val="1A1A1A"/>
+              </w:rPr>
+              <w:t xml:space="preserve">Team Lead &amp; Full-stack Developer</w:t>
+            </w:r>
+          </w:p>
+        </w:tc>
+      </w:tr>
+      <w:tr>
+        <w:tc>
+          <w:tcPr>
+            <w:tcW w:type="dxa" w:w="3100"/>
+            <w:tcBorders>
+              <w:top w:val="single" w:color="BBBBBB" w:sz="1"/>
+              <w:left w:val="single" w:color="BBBBBB" w:sz="1"/>
+              <w:bottom w:val="single" w:color="BBBBBB" w:sz="1"/>
+              <w:right w:val="single" w:color="BBBBBB" w:sz="1"/>
+            </w:tcBorders>
+            <w:tcMar>
+              <w:top w:type="dxa" w:w="60"/>
+              <w:left w:type="dxa" w:w="110"/>
+              <w:bottom w:type="dxa" w:w="60"/>
+              <w:right w:type="dxa" w:w="110"/>
+            </w:tcMar>
+          </w:tcPr>
+          <w:p>
+            <w:pPr>
+              <w:spacing w:after="0" w:line="260"/>
+            </w:pPr>
+            <w:r>
+              <w:rPr>
+                <w:color w:val="1A1A1A"/>
+              </w:rPr>
+              <w:t xml:space="preserve">[ Full name ]</w:t>
+            </w:r>
+          </w:p>
+        </w:tc>
+        <w:tc>
+          <w:tcPr>
+            <w:tcW w:type="dxa" w:w="2400"/>
+            <w:tcBorders>
+              <w:top w:val="single" w:color="BBBBBB" w:sz="1"/>
+              <w:left w:val="single" w:color="BBBBBB" w:sz="1"/>
+              <w:bottom w:val="single" w:color="BBBBBB" w:sz="1"/>
+              <w:right w:val="single" w:color="BBBBBB" w:sz="1"/>
+            </w:tcBorders>
+            <w:tcMar>
+              <w:top w:type="dxa" w:w="60"/>
+              <w:left w:type="dxa" w:w="110"/>
+              <w:bottom w:type="dxa" w:w="60"/>
+              <w:right w:type="dxa" w:w="110"/>
+            </w:tcMar>
+          </w:tcPr>
+          <w:p>
+            <w:pPr>
+              <w:spacing w:after="0" w:line="260"/>
+            </w:pPr>
+            <w:r>
+              <w:rPr>
+                <w:color w:val="1A1A1A"/>
+              </w:rPr>
+              <w:t xml:space="preserve">[ Reg. no. ]</w:t>
+            </w:r>
+          </w:p>
+        </w:tc>
+        <w:tc>
+          <w:tcPr>
+            <w:tcW w:type="dxa" w:w="3526"/>
+            <w:tcBorders>
+              <w:top w:val="single" w:color="BBBBBB" w:sz="1"/>
+              <w:left w:val="single" w:color="BBBBBB" w:sz="1"/>
+              <w:bottom w:val="single" w:color="BBBBBB" w:sz="1"/>
+              <w:right w:val="single" w:color="BBBBBB" w:sz="1"/>
+            </w:tcBorders>
+            <w:tcMar>
+              <w:top w:type="dxa" w:w="60"/>
+              <w:left w:type="dxa" w:w="110"/>
+              <w:bottom w:type="dxa" w:w="60"/>
+              <w:right w:type="dxa" w:w="110"/>
+            </w:tcMar>
+          </w:tcPr>
+          <w:p>
+            <w:pPr>
+              <w:spacing w:after="0" w:line="260"/>
+            </w:pPr>
+            <w:r>
+              <w:rPr>
+                <w:color w:val="1A1A1A"/>
+              </w:rPr>
+              <w:t xml:space="preserve">Front-end &amp; UI/UX Developer</w:t>
+            </w:r>
+          </w:p>
+        </w:tc>
+      </w:tr>
+      <w:tr>
+        <w:tc>
+          <w:tcPr>
+            <w:tcW w:type="dxa" w:w="3100"/>
+            <w:tcBorders>
+              <w:top w:val="single" w:color="BBBBBB" w:sz="1"/>
+              <w:left w:val="single" w:color="BBBBBB" w:sz="1"/>
+              <w:bottom w:val="single" w:color="BBBBBB" w:sz="1"/>
+              <w:right w:val="single" w:color="BBBBBB" w:sz="1"/>
+            </w:tcBorders>
+            <w:tcMar>
+              <w:top w:type="dxa" w:w="60"/>
+              <w:left w:type="dxa" w:w="110"/>
+              <w:bottom w:type="dxa" w:w="60"/>
+              <w:right w:type="dxa" w:w="110"/>
+            </w:tcMar>
+          </w:tcPr>
+          <w:p>
+            <w:pPr>
+              <w:spacing w:after="0" w:line="260"/>
+            </w:pPr>
+            <w:r>
+              <w:rPr>
+                <w:color w:val="1A1A1A"/>
+              </w:rPr>
+              <w:t xml:space="preserve">[ Full name ]</w:t>
+            </w:r>
+          </w:p>
+        </w:tc>
+        <w:tc>
+          <w:tcPr>
+            <w:tcW w:type="dxa" w:w="2400"/>
+            <w:tcBorders>
+              <w:top w:val="single" w:color="BBBBBB" w:sz="1"/>
+              <w:left w:val="single" w:color="BBBBBB" w:sz="1"/>
+              <w:bottom w:val="single" w:color="BBBBBB" w:sz="1"/>
+              <w:right w:val="single" w:color="BBBBBB" w:sz="1"/>
+            </w:tcBorders>
+            <w:tcMar>
+              <w:top w:type="dxa" w:w="60"/>
+              <w:left w:type="dxa" w:w="110"/>
+              <w:bottom w:type="dxa" w:w="60"/>
+              <w:right w:type="dxa" w:w="110"/>
+            </w:tcMar>
+          </w:tcPr>
+          <w:p>
+            <w:pPr>
+              <w:spacing w:after="0" w:line="260"/>
+            </w:pPr>
+            <w:r>
+              <w:rPr>
+                <w:color w:val="1A1A1A"/>
+              </w:rPr>
+              <w:t xml:space="preserve">[ Reg. no. ]</w:t>
+            </w:r>
+          </w:p>
+        </w:tc>
+        <w:tc>
+          <w:tcPr>
+            <w:tcW w:type="dxa" w:w="3526"/>
+            <w:tcBorders>
+              <w:top w:val="single" w:color="BBBBBB" w:sz="1"/>
+              <w:left w:val="single" w:color="BBBBBB" w:sz="1"/>
+              <w:bottom w:val="single" w:color="BBBBBB" w:sz="1"/>
+              <w:right w:val="single" w:color="BBBBBB" w:sz="1"/>
+            </w:tcBorders>
+            <w:tcMar>
+              <w:top w:type="dxa" w:w="60"/>
+              <w:left w:type="dxa" w:w="110"/>
+              <w:bottom w:type="dxa" w:w="60"/>
+              <w:right w:type="dxa" w:w="110"/>
+            </w:tcMar>
+          </w:tcPr>
+          <w:p>
+            <w:pPr>
+              <w:spacing w:after="0" w:line="260"/>
+            </w:pPr>
+            <w:r>
+              <w:rPr>
+                <w:color w:val="1A1A1A"/>
+              </w:rPr>
+              <w:t xml:space="preserve">Content &amp; Data Manager</w:t>
+            </w:r>
+          </w:p>
+        </w:tc>
+      </w:tr>
+      <w:tr>
+        <w:tc>
+          <w:tcPr>
+            <w:tcW w:type="dxa" w:w="3100"/>
+            <w:tcBorders>
+              <w:top w:val="single" w:color="BBBBBB" w:sz="1"/>
+              <w:left w:val="single" w:color="BBBBBB" w:sz="1"/>
+              <w:bottom w:val="single" w:color="BBBBBB" w:sz="1"/>
+              <w:right w:val="single" w:color="BBBBBB" w:sz="1"/>
+            </w:tcBorders>
+            <w:tcMar>
+              <w:top w:type="dxa" w:w="60"/>
+              <w:left w:type="dxa" w:w="110"/>
+              <w:bottom w:type="dxa" w:w="60"/>
+              <w:right w:type="dxa" w:w="110"/>
+            </w:tcMar>
+          </w:tcPr>
+          <w:p>
+            <w:pPr>
+              <w:spacing w:after="0" w:line="260"/>
+            </w:pPr>
+            <w:r>
+              <w:rPr>
+                <w:color w:val="1A1A1A"/>
+              </w:rPr>
+              <w:t xml:space="preserve">[ Full name ]</w:t>
+            </w:r>
+          </w:p>
+        </w:tc>
+        <w:tc>
+          <w:tcPr>
+            <w:tcW w:type="dxa" w:w="2400"/>
+            <w:tcBorders>
+              <w:top w:val="single" w:color="BBBBBB" w:sz="1"/>
+              <w:left w:val="single" w:color="BBBBBB" w:sz="1"/>
+              <w:bottom w:val="single" w:color="BBBBBB" w:sz="1"/>
+              <w:right w:val="single" w:color="BBBBBB" w:sz="1"/>
+            </w:tcBorders>
+            <w:tcMar>
+              <w:top w:type="dxa" w:w="60"/>
+              <w:left w:type="dxa" w:w="110"/>
+              <w:bottom w:type="dxa" w:w="60"/>
+              <w:right w:type="dxa" w:w="110"/>
+            </w:tcMar>
+          </w:tcPr>
+          <w:p>
+            <w:pPr>
+              <w:spacing w:after="0" w:line="260"/>
+            </w:pPr>
+            <w:r>
+              <w:rPr>
+                <w:color w:val="1A1A1A"/>
+              </w:rPr>
+              <w:t xml:space="preserve">[ Reg. no. ]</w:t>
+            </w:r>
+          </w:p>
+        </w:tc>
+        <w:tc>
+          <w:tcPr>
+            <w:tcW w:type="dxa" w:w="3526"/>
+            <w:tcBorders>
+              <w:top w:val="single" w:color="BBBBBB" w:sz="1"/>
+              <w:left w:val="single" w:color="BBBBBB" w:sz="1"/>
+              <w:bottom w:val="single" w:color="BBBBBB" w:sz="1"/>
+              <w:right w:val="single" w:color="BBBBBB" w:sz="1"/>
+            </w:tcBorders>
+            <w:tcMar>
+              <w:top w:type="dxa" w:w="60"/>
+              <w:left w:type="dxa" w:w="110"/>
+              <w:bottom w:type="dxa" w:w="60"/>
+              <w:right w:type="dxa" w:w="110"/>
+            </w:tcMar>
+          </w:tcPr>
+          <w:p>
+            <w:pPr>
+              <w:spacing w:after="0" w:line="260"/>
+            </w:pPr>
+            <w:r>
+              <w:rPr>
+                <w:color w:val="1A1A1A"/>
+              </w:rPr>
+              <w:t xml:space="preserve">Quality Assurance &amp; Testing</w:t>
+            </w:r>
+          </w:p>
+        </w:tc>
+      </w:tr>
+      <w:tr>
+        <w:tc>
+          <w:tcPr>
+            <w:tcW w:type="dxa" w:w="3100"/>
+            <w:tcBorders>
+              <w:top w:val="single" w:color="BBBBBB" w:sz="1"/>
+              <w:left w:val="single" w:color="BBBBBB" w:sz="1"/>
+              <w:bottom w:val="single" w:color="BBBBBB" w:sz="1"/>
+              <w:right w:val="single" w:color="BBBBBB" w:sz="1"/>
+            </w:tcBorders>
+            <w:tcMar>
+              <w:top w:type="dxa" w:w="60"/>
+              <w:left w:type="dxa" w:w="110"/>
+              <w:bottom w:type="dxa" w:w="60"/>
+              <w:right w:type="dxa" w:w="110"/>
+            </w:tcMar>
+          </w:tcPr>
+          <w:p>
+            <w:pPr>
+              <w:spacing w:after="0" w:line="260"/>
+            </w:pPr>
+            <w:r>
+              <w:rPr>
+                <w:color w:val="1A1A1A"/>
+              </w:rPr>
+              <w:t xml:space="preserve">[ Full name ]</w:t>
+            </w:r>
+          </w:p>
+        </w:tc>
+        <w:tc>
+          <w:tcPr>
+            <w:tcW w:type="dxa" w:w="2400"/>
+            <w:tcBorders>
+              <w:top w:val="single" w:color="BBBBBB" w:sz="1"/>
+              <w:left w:val="single" w:color="BBBBBB" w:sz="1"/>
+              <w:bottom w:val="single" w:color="BBBBBB" w:sz="1"/>
+              <w:right w:val="single" w:color="BBBBBB" w:sz="1"/>
+            </w:tcBorders>
+            <w:tcMar>
+              <w:top w:type="dxa" w:w="60"/>
+              <w:left w:type="dxa" w:w="110"/>
+              <w:bottom w:type="dxa" w:w="60"/>
+              <w:right w:type="dxa" w:w="110"/>
+            </w:tcMar>
+          </w:tcPr>
+          <w:p>
+            <w:pPr>
+              <w:spacing w:after="0" w:line="260"/>
+            </w:pPr>
+            <w:r>
+              <w:rPr>
+                <w:color w:val="1A1A1A"/>
+              </w:rPr>
+              <w:t xml:space="preserve">[ Reg. no. ]</w:t>
+            </w:r>
+          </w:p>
+        </w:tc>
+        <w:tc>
+          <w:tcPr>
+            <w:tcW w:type="dxa" w:w="3526"/>
+            <w:tcBorders>
+              <w:top w:val="single" w:color="BBBBBB" w:sz="1"/>
+              <w:left w:val="single" w:color="BBBBBB" w:sz="1"/>
+              <w:bottom w:val="single" w:color="BBBBBB" w:sz="1"/>
+              <w:right w:val="single" w:color="BBBBBB" w:sz="1"/>
+            </w:tcBorders>
+            <w:tcMar>
+              <w:top w:type="dxa" w:w="60"/>
+              <w:left w:type="dxa" w:w="110"/>
+              <w:bottom w:type="dxa" w:w="60"/>
+              <w:right w:type="dxa" w:w="110"/>
+            </w:tcMar>
+          </w:tcPr>
+          <w:p>
+            <w:pPr>
+              <w:spacing w:after="0" w:line="260"/>
+            </w:pPr>
+            <w:r>
+              <w:rPr>
+                <w:color w:val="1A1A1A"/>
+              </w:rPr>
+              <w:t xml:space="preserve">Deployment &amp; Maintenance (DevOps)</w:t>
+            </w:r>
+          </w:p>
+        </w:tc>
+      </w:tr>
+    </w:tbl>
+    <w:p>
+      <w:pPr>
+        <w:spacing w:after="60"/>
+      </w:pPr>
+    </w:p>
+    <w:p>
+      <w:pPr>
+        <w:spacing w:after="140" w:line="276"/>
+      </w:pPr>
+      <w:r>
+        <w:rPr>
+          <w:b/>
+          <w:bCs/>
+        </w:rPr>
+        <w:t xml:space="preserve">Faculty mentor (proposed): </w:t>
+      </w:r>
+      <w:r>
+        <w:t xml:space="preserve">____________________________     </w:t>
+      </w:r>
+      <w:r>
+        <w:rPr>
+          <w:b/>
+          <w:bCs/>
+        </w:rPr>
+        <w:t xml:space="preserve">Reporting to: </w:t>
+      </w:r>
+      <w:r>
+        <w:t xml:space="preserve">AMET CEII</w:t>
+      </w:r>
+    </w:p>
+    <w:p>
+      <w:pPr>
+        <w:pStyle w:val="Heading1"/>
+      </w:pPr>
+      <w:r>
+        <w:t xml:space="preserve">3.  Background — The CEII Website Today</w:t>
+      </w:r>
+    </w:p>
+    <w:p>
+      <w:pPr>
+        <w:spacing w:after="140" w:line="276"/>
+        <w:jc w:val="both"/>
+      </w:pPr>
+      <w:r>
+        <w:t xml:space="preserve">The following details are drawn directly from the current CEII website and materials:</w:t>
+      </w:r>
+    </w:p>
+    <w:tbl>
+      <w:tblPr>
+        <w:tblW w:type="dxa" w:w="9026"/>
+        <w:tblBorders>
+          <w:top w:val="single" w:color="auto" w:sz="4"/>
+          <w:left w:val="single" w:color="auto" w:sz="4"/>
+          <w:bottom w:val="single" w:color="auto" w:sz="4"/>
+          <w:right w:val="single" w:color="auto" w:sz="4"/>
+          <w:insideH w:val="single" w:color="auto" w:sz="4"/>
+          <w:insideV w:val="single" w:color="auto" w:sz="4"/>
+        </w:tblBorders>
+      </w:tblPr>
+      <w:tblGrid>
+        <w:gridCol w:w="2500"/>
+        <w:gridCol w:w="6526"/>
+      </w:tblGrid>
+      <w:tr>
+        <w:tc>
+          <w:tcPr>
+            <w:tcW w:type="dxa" w:w="2500"/>
+            <w:tcBorders>
+              <w:top w:val="single" w:color="BBBBBB" w:sz="1"/>
+              <w:left w:val="single" w:color="BBBBBB" w:sz="1"/>
+              <w:bottom w:val="single" w:color="BBBBBB" w:sz="1"/>
+              <w:right w:val="single" w:color="BBBBBB" w:sz="1"/>
+            </w:tcBorders>
+            <w:shd w:fill="EEF3F5" w:val="clear"/>
+            <w:tcMar>
+              <w:top w:type="dxa" w:w="60"/>
+              <w:left w:type="dxa" w:w="110"/>
+              <w:bottom w:type="dxa" w:w="60"/>
+              <w:right w:type="dxa" w:w="110"/>
+            </w:tcMar>
+          </w:tcPr>
+          <w:p>
+            <w:pPr>
+              <w:spacing w:after="0" w:line="260"/>
+            </w:pPr>
+            <w:r>
+              <w:rPr>
+                <w:b/>
+                <w:bCs/>
+                <w:color w:val="1A1A1A"/>
+              </w:rPr>
+              <w:t xml:space="preserve">Organisation</w:t>
+            </w:r>
+          </w:p>
+        </w:tc>
+        <w:tc>
+          <w:tcPr>
+            <w:tcW w:type="dxa" w:w="6526"/>
+            <w:tcBorders>
+              <w:top w:val="single" w:color="BBBBBB" w:sz="1"/>
+              <w:left w:val="single" w:color="BBBBBB" w:sz="1"/>
+              <w:bottom w:val="single" w:color="BBBBBB" w:sz="1"/>
+              <w:right w:val="single" w:color="BBBBBB" w:sz="1"/>
+            </w:tcBorders>
+            <w:tcMar>
+              <w:top w:type="dxa" w:w="60"/>
+              <w:left w:type="dxa" w:w="110"/>
+              <w:bottom w:type="dxa" w:w="60"/>
+              <w:right w:type="dxa" w:w="110"/>
+            </w:tcMar>
+          </w:tcPr>
+          <w:p>
+            <w:pPr>
+              <w:spacing w:after="0" w:line="260"/>
+            </w:pPr>
+            <w:r>
+              <w:rPr>
+                <w:color w:val="1A1A1A"/>
+              </w:rPr>
+              <w:t xml:space="preserve">AMET Centre for Entrepreneurship, Innovation and Incubation (AMET CEII)</w:t>
+            </w:r>
+          </w:p>
+        </w:tc>
+      </w:tr>
+      <w:tr>
+        <w:tc>
+          <w:tcPr>
+            <w:tcW w:type="dxa" w:w="2500"/>
+            <w:tcBorders>
+              <w:top w:val="single" w:color="BBBBBB" w:sz="1"/>
+              <w:left w:val="single" w:color="BBBBBB" w:sz="1"/>
+              <w:bottom w:val="single" w:color="BBBBBB" w:sz="1"/>
+              <w:right w:val="single" w:color="BBBBBB" w:sz="1"/>
+            </w:tcBorders>
+            <w:shd w:fill="EEF3F5" w:val="clear"/>
+            <w:tcMar>
+              <w:top w:type="dxa" w:w="60"/>
+              <w:left w:type="dxa" w:w="110"/>
+              <w:bottom w:type="dxa" w:w="60"/>
+              <w:right w:type="dxa" w:w="110"/>
+            </w:tcMar>
+          </w:tcPr>
+          <w:p>
+            <w:pPr>
+              <w:spacing w:after="0" w:line="260"/>
+            </w:pPr>
+            <w:r>
+              <w:rPr>
+                <w:b/>
+                <w:bCs/>
+                <w:color w:val="1A1A1A"/>
+              </w:rPr>
+              <w:t xml:space="preserve">Website</w:t>
+            </w:r>
+          </w:p>
+        </w:tc>
+        <w:tc>
+          <w:tcPr>
+            <w:tcW w:type="dxa" w:w="6526"/>
+            <w:tcBorders>
+              <w:top w:val="single" w:color="BBBBBB" w:sz="1"/>
+              <w:left w:val="single" w:color="BBBBBB" w:sz="1"/>
+              <w:bottom w:val="single" w:color="BBBBBB" w:sz="1"/>
+              <w:right w:val="single" w:color="BBBBBB" w:sz="1"/>
+            </w:tcBorders>
+            <w:tcMar>
+              <w:top w:type="dxa" w:w="60"/>
+              <w:left w:type="dxa" w:w="110"/>
+              <w:bottom w:type="dxa" w:w="60"/>
+              <w:right w:type="dxa" w:w="110"/>
+            </w:tcMar>
+          </w:tcPr>
+          <w:p>
+            <w:pPr>
+              <w:spacing w:after="0" w:line="260"/>
+            </w:pPr>
+            <w:r>
+              <w:rPr>
+                <w:color w:val="1A1A1A"/>
+              </w:rPr>
+              <w:t xml:space="preserve">aceii.in</w:t>
+            </w:r>
+          </w:p>
+        </w:tc>
+      </w:tr>
+      <w:tr>
+        <w:tc>
+          <w:tcPr>
+            <w:tcW w:type="dxa" w:w="2500"/>
+            <w:tcBorders>
+              <w:top w:val="single" w:color="BBBBBB" w:sz="1"/>
+              <w:left w:val="single" w:color="BBBBBB" w:sz="1"/>
+              <w:bottom w:val="single" w:color="BBBBBB" w:sz="1"/>
+              <w:right w:val="single" w:color="BBBBBB" w:sz="1"/>
+            </w:tcBorders>
+            <w:shd w:fill="EEF3F5" w:val="clear"/>
+            <w:tcMar>
+              <w:top w:type="dxa" w:w="60"/>
+              <w:left w:type="dxa" w:w="110"/>
+              <w:bottom w:type="dxa" w:w="60"/>
+              <w:right w:type="dxa" w:w="110"/>
+            </w:tcMar>
+          </w:tcPr>
+          <w:p>
+            <w:pPr>
+              <w:spacing w:after="0" w:line="260"/>
+            </w:pPr>
+            <w:r>
+              <w:rPr>
+                <w:b/>
+                <w:bCs/>
+                <w:color w:val="1A1A1A"/>
+              </w:rPr>
+              <w:t xml:space="preserve">Vision</w:t>
+            </w:r>
+          </w:p>
+        </w:tc>
+        <w:tc>
+          <w:tcPr>
+            <w:tcW w:type="dxa" w:w="6526"/>
+            <w:tcBorders>
+              <w:top w:val="single" w:color="BBBBBB" w:sz="1"/>
+              <w:left w:val="single" w:color="BBBBBB" w:sz="1"/>
+              <w:bottom w:val="single" w:color="BBBBBB" w:sz="1"/>
+              <w:right w:val="single" w:color="BBBBBB" w:sz="1"/>
+            </w:tcBorders>
+            <w:tcMar>
+              <w:top w:type="dxa" w:w="60"/>
+              <w:left w:type="dxa" w:w="110"/>
+              <w:bottom w:type="dxa" w:w="60"/>
+              <w:right w:type="dxa" w:w="110"/>
+            </w:tcMar>
+          </w:tcPr>
+          <w:p>
+            <w:pPr>
+              <w:spacing w:after="0" w:line="260"/>
+            </w:pPr>
+            <w:r>
+              <w:rPr>
+                <w:color w:val="1A1A1A"/>
+              </w:rPr>
+              <w:t xml:space="preserve">“To play a commendable role in fostering Entrepreneurship and Innovation, thereby providing a platform for incubating business ideas in the maritime sector and augmenting its contribution to the economy.”</w:t>
+            </w:r>
+          </w:p>
+        </w:tc>
+      </w:tr>
+      <w:tr>
+        <w:tc>
+          <w:tcPr>
+            <w:tcW w:type="dxa" w:w="2500"/>
+            <w:tcBorders>
+              <w:top w:val="single" w:color="BBBBBB" w:sz="1"/>
+              <w:left w:val="single" w:color="BBBBBB" w:sz="1"/>
+              <w:bottom w:val="single" w:color="BBBBBB" w:sz="1"/>
+              <w:right w:val="single" w:color="BBBBBB" w:sz="1"/>
+            </w:tcBorders>
+            <w:shd w:fill="EEF3F5" w:val="clear"/>
+            <w:tcMar>
+              <w:top w:type="dxa" w:w="60"/>
+              <w:left w:type="dxa" w:w="110"/>
+              <w:bottom w:type="dxa" w:w="60"/>
+              <w:right w:type="dxa" w:w="110"/>
+            </w:tcMar>
+          </w:tcPr>
+          <w:p>
+            <w:pPr>
+              <w:spacing w:after="0" w:line="260"/>
+            </w:pPr>
+            <w:r>
+              <w:rPr>
+                <w:b/>
+                <w:bCs/>
+                <w:color w:val="1A1A1A"/>
+              </w:rPr>
+              <w:t xml:space="preserve">Mission</w:t>
+            </w:r>
+          </w:p>
+        </w:tc>
+        <w:tc>
+          <w:tcPr>
+            <w:tcW w:type="dxa" w:w="6526"/>
+            <w:tcBorders>
+              <w:top w:val="single" w:color="BBBBBB" w:sz="1"/>
+              <w:left w:val="single" w:color="BBBBBB" w:sz="1"/>
+              <w:bottom w:val="single" w:color="BBBBBB" w:sz="1"/>
+              <w:right w:val="single" w:color="BBBBBB" w:sz="1"/>
+            </w:tcBorders>
+            <w:tcMar>
+              <w:top w:type="dxa" w:w="60"/>
+              <w:left w:type="dxa" w:w="110"/>
+              <w:bottom w:type="dxa" w:w="60"/>
+              <w:right w:type="dxa" w:w="110"/>
+            </w:tcMar>
+          </w:tcPr>
+          <w:p>
+            <w:pPr>
+              <w:spacing w:after="0" w:line="260"/>
+            </w:pPr>
+            <w:r>
+              <w:rPr>
+                <w:color w:val="1A1A1A"/>
+              </w:rPr>
+              <w:t xml:space="preserve">“To empower young innovators by fostering creative thinking and providing essential support, guidance, and resources to help them navigate challenges and achieve sustainable growth during their startup journey.”</w:t>
+            </w:r>
+          </w:p>
+        </w:tc>
+      </w:tr>
+      <w:tr>
+        <w:tc>
+          <w:tcPr>
+            <w:tcW w:type="dxa" w:w="2500"/>
+            <w:tcBorders>
+              <w:top w:val="single" w:color="BBBBBB" w:sz="1"/>
+              <w:left w:val="single" w:color="BBBBBB" w:sz="1"/>
+              <w:bottom w:val="single" w:color="BBBBBB" w:sz="1"/>
+              <w:right w:val="single" w:color="BBBBBB" w:sz="1"/>
+            </w:tcBorders>
+            <w:shd w:fill="EEF3F5" w:val="clear"/>
+            <w:tcMar>
+              <w:top w:type="dxa" w:w="60"/>
+              <w:left w:type="dxa" w:w="110"/>
+              <w:bottom w:type="dxa" w:w="60"/>
+              <w:right w:type="dxa" w:w="110"/>
+            </w:tcMar>
+          </w:tcPr>
+          <w:p>
+            <w:pPr>
+              <w:spacing w:after="0" w:line="260"/>
+            </w:pPr>
+            <w:r>
+              <w:rPr>
+                <w:b/>
+                <w:bCs/>
+                <w:color w:val="1A1A1A"/>
+              </w:rPr>
+              <w:t xml:space="preserve">Current pages</w:t>
+            </w:r>
+          </w:p>
+        </w:tc>
+        <w:tc>
+          <w:tcPr>
+            <w:tcW w:type="dxa" w:w="6526"/>
+            <w:tcBorders>
+              <w:top w:val="single" w:color="BBBBBB" w:sz="1"/>
+              <w:left w:val="single" w:color="BBBBBB" w:sz="1"/>
+              <w:bottom w:val="single" w:color="BBBBBB" w:sz="1"/>
+              <w:right w:val="single" w:color="BBBBBB" w:sz="1"/>
+            </w:tcBorders>
+            <w:tcMar>
+              <w:top w:type="dxa" w:w="60"/>
+              <w:left w:type="dxa" w:w="110"/>
+              <w:bottom w:type="dxa" w:w="60"/>
+              <w:right w:type="dxa" w:w="110"/>
+            </w:tcMar>
+          </w:tcPr>
+          <w:p>
+            <w:pPr>
+              <w:spacing w:after="0" w:line="260"/>
+            </w:pPr>
+            <w:r>
+              <w:rPr>
+                <w:color w:val="1A1A1A"/>
+              </w:rPr>
+              <w:t xml:space="preserve">Home, Portfolio, Events, Apply Now, Contact, Blog, and a link to AMET University.</w:t>
+            </w:r>
+          </w:p>
+        </w:tc>
+      </w:tr>
+      <w:tr>
+        <w:tc>
+          <w:tcPr>
+            <w:tcW w:type="dxa" w:w="2500"/>
+            <w:tcBorders>
+              <w:top w:val="single" w:color="BBBBBB" w:sz="1"/>
+              <w:left w:val="single" w:color="BBBBBB" w:sz="1"/>
+              <w:bottom w:val="single" w:color="BBBBBB" w:sz="1"/>
+              <w:right w:val="single" w:color="BBBBBB" w:sz="1"/>
+            </w:tcBorders>
+            <w:shd w:fill="EEF3F5" w:val="clear"/>
+            <w:tcMar>
+              <w:top w:type="dxa" w:w="60"/>
+              <w:left w:type="dxa" w:w="110"/>
+              <w:bottom w:type="dxa" w:w="60"/>
+              <w:right w:type="dxa" w:w="110"/>
+            </w:tcMar>
+          </w:tcPr>
+          <w:p>
+            <w:pPr>
+              <w:spacing w:after="0" w:line="260"/>
+            </w:pPr>
+            <w:r>
+              <w:rPr>
+                <w:b/>
+                <w:bCs/>
+                <w:color w:val="1A1A1A"/>
+              </w:rPr>
+              <w:t xml:space="preserve">Current platform</w:t>
+            </w:r>
+          </w:p>
+        </w:tc>
+        <w:tc>
+          <w:tcPr>
+            <w:tcW w:type="dxa" w:w="6526"/>
+            <w:tcBorders>
+              <w:top w:val="single" w:color="BBBBBB" w:sz="1"/>
+              <w:left w:val="single" w:color="BBBBBB" w:sz="1"/>
+              <w:bottom w:val="single" w:color="BBBBBB" w:sz="1"/>
+              <w:right w:val="single" w:color="BBBBBB" w:sz="1"/>
+            </w:tcBorders>
+            <w:tcMar>
+              <w:top w:type="dxa" w:w="60"/>
+              <w:left w:type="dxa" w:w="110"/>
+              <w:bottom w:type="dxa" w:w="60"/>
+              <w:right w:type="dxa" w:w="110"/>
+            </w:tcMar>
+          </w:tcPr>
+          <w:p>
+            <w:pPr>
+              <w:spacing w:after="0" w:line="260"/>
+            </w:pPr>
+            <w:r>
+              <w:rPr>
+                <w:color w:val="1A1A1A"/>
+              </w:rPr>
+              <w:t xml:space="preserve">Built on Zoho Sites and maintained by an external vendor (TEMS Tech Solutions).</w:t>
+            </w:r>
+          </w:p>
+        </w:tc>
+      </w:tr>
+      <w:tr>
+        <w:tc>
+          <w:tcPr>
+            <w:tcW w:type="dxa" w:w="2500"/>
+            <w:tcBorders>
+              <w:top w:val="single" w:color="BBBBBB" w:sz="1"/>
+              <w:left w:val="single" w:color="BBBBBB" w:sz="1"/>
+              <w:bottom w:val="single" w:color="BBBBBB" w:sz="1"/>
+              <w:right w:val="single" w:color="BBBBBB" w:sz="1"/>
+            </w:tcBorders>
+            <w:shd w:fill="EEF3F5" w:val="clear"/>
+            <w:tcMar>
+              <w:top w:type="dxa" w:w="60"/>
+              <w:left w:type="dxa" w:w="110"/>
+              <w:bottom w:type="dxa" w:w="60"/>
+              <w:right w:type="dxa" w:w="110"/>
+            </w:tcMar>
+          </w:tcPr>
+          <w:p>
+            <w:pPr>
+              <w:spacing w:after="0" w:line="260"/>
+            </w:pPr>
+            <w:r>
+              <w:rPr>
+                <w:b/>
+                <w:bCs/>
+                <w:color w:val="1A1A1A"/>
+              </w:rPr>
+              <w:t xml:space="preserve">CEII team</w:t>
+            </w:r>
+          </w:p>
+        </w:tc>
+        <w:tc>
+          <w:tcPr>
+            <w:tcW w:type="dxa" w:w="6526"/>
+            <w:tcBorders>
+              <w:top w:val="single" w:color="BBBBBB" w:sz="1"/>
+              <w:left w:val="single" w:color="BBBBBB" w:sz="1"/>
+              <w:bottom w:val="single" w:color="BBBBBB" w:sz="1"/>
+              <w:right w:val="single" w:color="BBBBBB" w:sz="1"/>
+            </w:tcBorders>
+            <w:tcMar>
+              <w:top w:type="dxa" w:w="60"/>
+              <w:left w:type="dxa" w:w="110"/>
+              <w:bottom w:type="dxa" w:w="60"/>
+              <w:right w:type="dxa" w:w="110"/>
+            </w:tcMar>
+          </w:tcPr>
+          <w:p>
+            <w:pPr>
+              <w:spacing w:after="0" w:line="260"/>
+            </w:pPr>
+            <w:r>
+              <w:rPr>
+                <w:color w:val="1A1A1A"/>
+              </w:rPr>
+              <w:t xml:space="preserve">Mr. G. Nirmal Raj (CEO); Dr. Anitha Rexalin Devaraj (Director, AMET-IIC); Mr. V. Velavan (Incubation Associate).</w:t>
+            </w:r>
+          </w:p>
+        </w:tc>
+      </w:tr>
+      <w:tr>
+        <w:tc>
+          <w:tcPr>
+            <w:tcW w:type="dxa" w:w="2500"/>
+            <w:tcBorders>
+              <w:top w:val="single" w:color="BBBBBB" w:sz="1"/>
+              <w:left w:val="single" w:color="BBBBBB" w:sz="1"/>
+              <w:bottom w:val="single" w:color="BBBBBB" w:sz="1"/>
+              <w:right w:val="single" w:color="BBBBBB" w:sz="1"/>
+            </w:tcBorders>
+            <w:shd w:fill="EEF3F5" w:val="clear"/>
+            <w:tcMar>
+              <w:top w:type="dxa" w:w="60"/>
+              <w:left w:type="dxa" w:w="110"/>
+              <w:bottom w:type="dxa" w:w="60"/>
+              <w:right w:type="dxa" w:w="110"/>
+            </w:tcMar>
+          </w:tcPr>
+          <w:p>
+            <w:pPr>
+              <w:spacing w:after="0" w:line="260"/>
+            </w:pPr>
+            <w:r>
+              <w:rPr>
+                <w:b/>
+                <w:bCs/>
+                <w:color w:val="1A1A1A"/>
+              </w:rPr>
+              <w:t xml:space="preserve">Contact</w:t>
+            </w:r>
+          </w:p>
+        </w:tc>
+        <w:tc>
+          <w:tcPr>
+            <w:tcW w:type="dxa" w:w="6526"/>
+            <w:tcBorders>
+              <w:top w:val="single" w:color="BBBBBB" w:sz="1"/>
+              <w:left w:val="single" w:color="BBBBBB" w:sz="1"/>
+              <w:bottom w:val="single" w:color="BBBBBB" w:sz="1"/>
+              <w:right w:val="single" w:color="BBBBBB" w:sz="1"/>
+            </w:tcBorders>
+            <w:tcMar>
+              <w:top w:type="dxa" w:w="60"/>
+              <w:left w:type="dxa" w:w="110"/>
+              <w:bottom w:type="dxa" w:w="60"/>
+              <w:right w:type="dxa" w:w="110"/>
+            </w:tcMar>
+          </w:tcPr>
+          <w:p>
+            <w:pPr>
+              <w:spacing w:after="0" w:line="260"/>
+            </w:pPr>
+            <w:r>
+              <w:rPr>
+                <w:color w:val="1A1A1A"/>
+              </w:rPr>
+              <w:t xml:space="preserve">aceii@ametuniv.ac.in  ·  +91 94863 03654, +91 96296 95776  ·  135, SH 49, Kanathur Reddykuppam, Tamil Nadu 603112.</w:t>
+            </w:r>
+          </w:p>
+        </w:tc>
+      </w:tr>
+    </w:tbl>
+    <w:p>
+      <w:pPr>
+        <w:pStyle w:val="Heading1"/>
+      </w:pPr>
+      <w:r>
+        <w:t xml:space="preserve">4.  Why a Redesign — Problem &amp; Opportunity</w:t>
+      </w:r>
+    </w:p>
+    <w:p>
+      <w:pPr>
+        <w:spacing w:after="140" w:line="276"/>
+        <w:jc w:val="both"/>
+      </w:pPr>
+      <w:r>
+        <w:t xml:space="preserve">The current website serves its basic purpose, but it under-represents the ambition of a maritime incubation cell. We see the following gaps and opportunities:</w:t>
+      </w:r>
+    </w:p>
+    <w:p>
+      <w:pPr>
+        <w:pStyle w:val="ListParagraph"/>
+        <w:numPr>
+          <w:ilvl w:val="0"/>
+          <w:numId w:val="2"/>
+        </w:numPr>
+        <w:spacing w:after="70" w:line="270"/>
+      </w:pPr>
+      <w:r>
+        <w:rPr>
+          <w:b/>
+          <w:bCs/>
+        </w:rPr>
+        <w:t xml:space="preserve">Limited depth: </w:t>
+      </w:r>
+      <w:r>
+        <w:t xml:space="preserve">key information a founder looks for — incubation programmes, facilities, mentors, success stories — is not presented in detail.</w:t>
+      </w:r>
+    </w:p>
+    <w:p>
+      <w:pPr>
+        <w:pStyle w:val="ListParagraph"/>
+        <w:numPr>
+          <w:ilvl w:val="0"/>
+          <w:numId w:val="2"/>
+        </w:numPr>
+        <w:spacing w:after="70" w:line="270"/>
+      </w:pPr>
+      <w:r>
+        <w:rPr>
+          <w:b/>
+          <w:bCs/>
+        </w:rPr>
+        <w:t xml:space="preserve">Dated first impression: </w:t>
+      </w:r>
+      <w:r>
+        <w:t xml:space="preserve">the design does not yet convey a ‘leading incubator’ image to founders, investors and partners.</w:t>
+      </w:r>
+    </w:p>
+    <w:p>
+      <w:pPr>
+        <w:pStyle w:val="ListParagraph"/>
+        <w:numPr>
+          <w:ilvl w:val="0"/>
+          <w:numId w:val="2"/>
+        </w:numPr>
+        <w:spacing w:after="70" w:line="270"/>
+      </w:pPr>
+      <w:r>
+        <w:rPr>
+          <w:b/>
+          <w:bCs/>
+        </w:rPr>
+        <w:t xml:space="preserve">External dependency: </w:t>
+      </w:r>
+      <w:r>
+        <w:t xml:space="preserve">every content change (a new event, a new startup, an updated contact) must go through the external vendor, TEMS Tech Solutions — adding cost and delay.</w:t>
+      </w:r>
+    </w:p>
+    <w:p>
+      <w:pPr>
+        <w:pStyle w:val="ListParagraph"/>
+        <w:numPr>
+          <w:ilvl w:val="0"/>
+          <w:numId w:val="2"/>
+        </w:numPr>
+        <w:spacing w:after="70" w:line="270"/>
+      </w:pPr>
+      <w:r>
+        <w:rPr>
+          <w:b/>
+          <w:bCs/>
+        </w:rPr>
+        <w:t xml:space="preserve">Missed engagement: </w:t>
+      </w:r>
+      <w:r>
+        <w:t xml:space="preserve">there is no rich, guided online application or enquiry experience to capture and organise interest from founders.</w:t>
+      </w:r>
+    </w:p>
+    <w:p>
+      <w:pPr>
+        <w:spacing w:after="140" w:line="276"/>
+        <w:jc w:val="both"/>
+      </w:pPr>
+      <w:r>
+        <w:t xml:space="preserve">The opportunity is to turn the website into CEII’s strongest ambassador — and to bring its upkeep inside the university, where it becomes both cheaper and a live learning platform for students. </w:t>
+      </w:r>
+      <w:r>
+        <w:rPr>
+          <w:b/>
+          <w:bCs/>
+        </w:rPr>
+        <w:t xml:space="preserve">Our prototype (amet-ceii.vercel.app) already demonstrates what this can look like.</w:t>
+      </w:r>
+    </w:p>
+    <w:p>
+      <w:pPr>
+        <w:pStyle w:val="Heading1"/>
+      </w:pPr>
+      <w:r>
+        <w:t xml:space="preserve">5.  The Proposed Solution</w:t>
+      </w:r>
+    </w:p>
+    <w:p>
+      <w:pPr>
+        <w:pStyle w:val="Heading2"/>
+      </w:pPr>
+      <w:r>
+        <w:t xml:space="preserve">5.1  A ten-page site built around the founder’s journey</w:t>
+      </w:r>
+    </w:p>
+    <w:tbl>
+      <w:tblPr>
+        <w:tblW w:type="dxa" w:w="9026"/>
+        <w:tblBorders>
+          <w:top w:val="single" w:color="auto" w:sz="4"/>
+          <w:left w:val="single" w:color="auto" w:sz="4"/>
+          <w:bottom w:val="single" w:color="auto" w:sz="4"/>
+          <w:right w:val="single" w:color="auto" w:sz="4"/>
+          <w:insideH w:val="single" w:color="auto" w:sz="4"/>
+          <w:insideV w:val="single" w:color="auto" w:sz="4"/>
+        </w:tblBorders>
+      </w:tblPr>
+      <w:tblGrid>
+        <w:gridCol w:w="2200"/>
+        <w:gridCol w:w="6826"/>
+      </w:tblGrid>
+      <w:tr>
+        <w:trPr>
+          <w:tblHeader/>
+        </w:trPr>
+        <w:tc>
+          <w:tcPr>
+            <w:tcW w:type="dxa" w:w="2200"/>
+            <w:tcBorders>
+              <w:top w:val="single" w:color="BBBBBB" w:sz="1"/>
+              <w:left w:val="single" w:color="BBBBBB" w:sz="1"/>
+              <w:bottom w:val="single" w:color="BBBBBB" w:sz="1"/>
+              <w:right w:val="single" w:color="BBBBBB" w:sz="1"/>
+            </w:tcBorders>
+            <w:shd w:fill="0E2E42" w:val="clear"/>
+            <w:tcMar>
+              <w:top w:type="dxa" w:w="60"/>
+              <w:left w:type="dxa" w:w="110"/>
+              <w:bottom w:type="dxa" w:w="60"/>
+              <w:right w:type="dxa" w:w="110"/>
+            </w:tcMar>
+          </w:tcPr>
+          <w:p>
+            <w:pPr>
+              <w:spacing w:after="0" w:line="260"/>
+            </w:pPr>
+            <w:r>
+              <w:rPr>
+                <w:b/>
+                <w:bCs/>
+                <w:color w:val="FFFFFF"/>
+              </w:rPr>
+              <w:t xml:space="preserve">Page</w:t>
+            </w:r>
+          </w:p>
+        </w:tc>
+        <w:tc>
+          <w:tcPr>
+            <w:tcW w:type="dxa" w:w="6826"/>
+            <w:tcBorders>
+              <w:top w:val="single" w:color="BBBBBB" w:sz="1"/>
+              <w:left w:val="single" w:color="BBBBBB" w:sz="1"/>
+              <w:bottom w:val="single" w:color="BBBBBB" w:sz="1"/>
+              <w:right w:val="single" w:color="BBBBBB" w:sz="1"/>
+            </w:tcBorders>
+            <w:shd w:fill="0E2E42" w:val="clear"/>
+            <w:tcMar>
+              <w:top w:type="dxa" w:w="60"/>
+              <w:left w:type="dxa" w:w="110"/>
+              <w:bottom w:type="dxa" w:w="60"/>
+              <w:right w:type="dxa" w:w="110"/>
+            </w:tcMar>
+          </w:tcPr>
+          <w:p>
+            <w:pPr>
+              <w:spacing w:after="0" w:line="260"/>
+            </w:pPr>
+            <w:r>
+              <w:rPr>
+                <w:b/>
+                <w:bCs/>
+                <w:color w:val="FFFFFF"/>
+              </w:rPr>
+              <w:t xml:space="preserve">Purpose</w:t>
+            </w:r>
+          </w:p>
+        </w:tc>
+      </w:tr>
+      <w:tr>
+        <w:tc>
+          <w:tcPr>
+            <w:tcW w:type="dxa" w:w="2200"/>
+            <w:tcBorders>
+              <w:top w:val="single" w:color="BBBBBB" w:sz="1"/>
+              <w:left w:val="single" w:color="BBBBBB" w:sz="1"/>
+              <w:bottom w:val="single" w:color="BBBBBB" w:sz="1"/>
+              <w:right w:val="single" w:color="BBBBBB" w:sz="1"/>
+            </w:tcBorders>
+            <w:tcMar>
+              <w:top w:type="dxa" w:w="60"/>
+              <w:left w:type="dxa" w:w="110"/>
+              <w:bottom w:type="dxa" w:w="60"/>
+              <w:right w:type="dxa" w:w="110"/>
+            </w:tcMar>
+          </w:tcPr>
+          <w:p>
+            <w:pPr>
+              <w:spacing w:after="0" w:line="260"/>
+            </w:pPr>
+            <w:r>
+              <w:rPr>
+                <w:b/>
+                <w:bCs/>
+                <w:color w:val="1A1A1A"/>
+              </w:rPr>
+              <w:t xml:space="preserve">Home</w:t>
+            </w:r>
+          </w:p>
+        </w:tc>
+        <w:tc>
+          <w:tcPr>
+            <w:tcW w:type="dxa" w:w="6826"/>
+            <w:tcBorders>
+              <w:top w:val="single" w:color="BBBBBB" w:sz="1"/>
+              <w:left w:val="single" w:color="BBBBBB" w:sz="1"/>
+              <w:bottom w:val="single" w:color="BBBBBB" w:sz="1"/>
+              <w:right w:val="single" w:color="BBBBBB" w:sz="1"/>
+            </w:tcBorders>
+            <w:tcMar>
+              <w:top w:type="dxa" w:w="60"/>
+              <w:left w:type="dxa" w:w="110"/>
+              <w:bottom w:type="dxa" w:w="60"/>
+              <w:right w:type="dxa" w:w="110"/>
+            </w:tcMar>
+          </w:tcPr>
+          <w:p>
+            <w:pPr>
+              <w:spacing w:after="0" w:line="260"/>
+            </w:pPr>
+            <w:r>
+              <w:rPr>
+                <w:color w:val="1A1A1A"/>
+              </w:rPr>
+              <w:t xml:space="preserve">Bold introduction to CEII, the maritime focus, key highlights and clear calls to action.</w:t>
+            </w:r>
+          </w:p>
+        </w:tc>
+      </w:tr>
+      <w:tr>
+        <w:tc>
+          <w:tcPr>
+            <w:tcW w:type="dxa" w:w="2200"/>
+            <w:tcBorders>
+              <w:top w:val="single" w:color="BBBBBB" w:sz="1"/>
+              <w:left w:val="single" w:color="BBBBBB" w:sz="1"/>
+              <w:bottom w:val="single" w:color="BBBBBB" w:sz="1"/>
+              <w:right w:val="single" w:color="BBBBBB" w:sz="1"/>
+            </w:tcBorders>
+            <w:tcMar>
+              <w:top w:type="dxa" w:w="60"/>
+              <w:left w:type="dxa" w:w="110"/>
+              <w:bottom w:type="dxa" w:w="60"/>
+              <w:right w:type="dxa" w:w="110"/>
+            </w:tcMar>
+          </w:tcPr>
+          <w:p>
+            <w:pPr>
+              <w:spacing w:after="0" w:line="260"/>
+            </w:pPr>
+            <w:r>
+              <w:rPr>
+                <w:b/>
+                <w:bCs/>
+                <w:color w:val="1A1A1A"/>
+              </w:rPr>
+              <w:t xml:space="preserve">About</w:t>
+            </w:r>
+          </w:p>
+        </w:tc>
+        <w:tc>
+          <w:tcPr>
+            <w:tcW w:type="dxa" w:w="6826"/>
+            <w:tcBorders>
+              <w:top w:val="single" w:color="BBBBBB" w:sz="1"/>
+              <w:left w:val="single" w:color="BBBBBB" w:sz="1"/>
+              <w:bottom w:val="single" w:color="BBBBBB" w:sz="1"/>
+              <w:right w:val="single" w:color="BBBBBB" w:sz="1"/>
+            </w:tcBorders>
+            <w:tcMar>
+              <w:top w:type="dxa" w:w="60"/>
+              <w:left w:type="dxa" w:w="110"/>
+              <w:bottom w:type="dxa" w:w="60"/>
+              <w:right w:type="dxa" w:w="110"/>
+            </w:tcMar>
+          </w:tcPr>
+          <w:p>
+            <w:pPr>
+              <w:spacing w:after="0" w:line="260"/>
+            </w:pPr>
+            <w:r>
+              <w:rPr>
+                <w:color w:val="1A1A1A"/>
+              </w:rPr>
+              <w:t xml:space="preserve">Vision, mission (as above), story, values and the CEII’s place within AMET University.</w:t>
+            </w:r>
+          </w:p>
+        </w:tc>
+      </w:tr>
+      <w:tr>
+        <w:tc>
+          <w:tcPr>
+            <w:tcW w:type="dxa" w:w="2200"/>
+            <w:tcBorders>
+              <w:top w:val="single" w:color="BBBBBB" w:sz="1"/>
+              <w:left w:val="single" w:color="BBBBBB" w:sz="1"/>
+              <w:bottom w:val="single" w:color="BBBBBB" w:sz="1"/>
+              <w:right w:val="single" w:color="BBBBBB" w:sz="1"/>
+            </w:tcBorders>
+            <w:tcMar>
+              <w:top w:type="dxa" w:w="60"/>
+              <w:left w:type="dxa" w:w="110"/>
+              <w:bottom w:type="dxa" w:w="60"/>
+              <w:right w:type="dxa" w:w="110"/>
+            </w:tcMar>
+          </w:tcPr>
+          <w:p>
+            <w:pPr>
+              <w:spacing w:after="0" w:line="260"/>
+            </w:pPr>
+            <w:r>
+              <w:rPr>
+                <w:b/>
+                <w:bCs/>
+                <w:color w:val="1A1A1A"/>
+              </w:rPr>
+              <w:t xml:space="preserve">Programs</w:t>
+            </w:r>
+          </w:p>
+        </w:tc>
+        <w:tc>
+          <w:tcPr>
+            <w:tcW w:type="dxa" w:w="6826"/>
+            <w:tcBorders>
+              <w:top w:val="single" w:color="BBBBBB" w:sz="1"/>
+              <w:left w:val="single" w:color="BBBBBB" w:sz="1"/>
+              <w:bottom w:val="single" w:color="BBBBBB" w:sz="1"/>
+              <w:right w:val="single" w:color="BBBBBB" w:sz="1"/>
+            </w:tcBorders>
+            <w:tcMar>
+              <w:top w:type="dxa" w:w="60"/>
+              <w:left w:type="dxa" w:w="110"/>
+              <w:bottom w:type="dxa" w:w="60"/>
+              <w:right w:type="dxa" w:w="110"/>
+            </w:tcMar>
+          </w:tcPr>
+          <w:p>
+            <w:pPr>
+              <w:spacing w:after="0" w:line="260"/>
+            </w:pPr>
+            <w:r>
+              <w:rPr>
+                <w:color w:val="1A1A1A"/>
+              </w:rPr>
+              <w:t xml:space="preserve">The incubation journey — pre-incubation, incubation, acceleration and always-on community support.</w:t>
+            </w:r>
+          </w:p>
+        </w:tc>
+      </w:tr>
+      <w:tr>
+        <w:tc>
+          <w:tcPr>
+            <w:tcW w:type="dxa" w:w="2200"/>
+            <w:tcBorders>
+              <w:top w:val="single" w:color="BBBBBB" w:sz="1"/>
+              <w:left w:val="single" w:color="BBBBBB" w:sz="1"/>
+              <w:bottom w:val="single" w:color="BBBBBB" w:sz="1"/>
+              <w:right w:val="single" w:color="BBBBBB" w:sz="1"/>
+            </w:tcBorders>
+            <w:tcMar>
+              <w:top w:type="dxa" w:w="60"/>
+              <w:left w:type="dxa" w:w="110"/>
+              <w:bottom w:type="dxa" w:w="60"/>
+              <w:right w:type="dxa" w:w="110"/>
+            </w:tcMar>
+          </w:tcPr>
+          <w:p>
+            <w:pPr>
+              <w:spacing w:after="0" w:line="260"/>
+            </w:pPr>
+            <w:r>
+              <w:rPr>
+                <w:b/>
+                <w:bCs/>
+                <w:color w:val="1A1A1A"/>
+              </w:rPr>
+              <w:t xml:space="preserve">Portfolio</w:t>
+            </w:r>
+          </w:p>
+        </w:tc>
+        <w:tc>
+          <w:tcPr>
+            <w:tcW w:type="dxa" w:w="6826"/>
+            <w:tcBorders>
+              <w:top w:val="single" w:color="BBBBBB" w:sz="1"/>
+              <w:left w:val="single" w:color="BBBBBB" w:sz="1"/>
+              <w:bottom w:val="single" w:color="BBBBBB" w:sz="1"/>
+              <w:right w:val="single" w:color="BBBBBB" w:sz="1"/>
+            </w:tcBorders>
+            <w:tcMar>
+              <w:top w:type="dxa" w:w="60"/>
+              <w:left w:type="dxa" w:w="110"/>
+              <w:bottom w:type="dxa" w:w="60"/>
+              <w:right w:type="dxa" w:w="110"/>
+            </w:tcMar>
+          </w:tcPr>
+          <w:p>
+            <w:pPr>
+              <w:spacing w:after="0" w:line="260"/>
+            </w:pPr>
+            <w:r>
+              <w:rPr>
+                <w:color w:val="1A1A1A"/>
+              </w:rPr>
+              <w:t xml:space="preserve">Startups incubated at CEII, filterable by sector (ocean-tech, logistics, aquaculture, etc.).</w:t>
+            </w:r>
+          </w:p>
+        </w:tc>
+      </w:tr>
+      <w:tr>
+        <w:tc>
+          <w:tcPr>
+            <w:tcW w:type="dxa" w:w="2200"/>
+            <w:tcBorders>
+              <w:top w:val="single" w:color="BBBBBB" w:sz="1"/>
+              <w:left w:val="single" w:color="BBBBBB" w:sz="1"/>
+              <w:bottom w:val="single" w:color="BBBBBB" w:sz="1"/>
+              <w:right w:val="single" w:color="BBBBBB" w:sz="1"/>
+            </w:tcBorders>
+            <w:tcMar>
+              <w:top w:type="dxa" w:w="60"/>
+              <w:left w:type="dxa" w:w="110"/>
+              <w:bottom w:type="dxa" w:w="60"/>
+              <w:right w:type="dxa" w:w="110"/>
+            </w:tcMar>
+          </w:tcPr>
+          <w:p>
+            <w:pPr>
+              <w:spacing w:after="0" w:line="260"/>
+            </w:pPr>
+            <w:r>
+              <w:rPr>
+                <w:b/>
+                <w:bCs/>
+                <w:color w:val="1A1A1A"/>
+              </w:rPr>
+              <w:t xml:space="preserve">Events</w:t>
+            </w:r>
+          </w:p>
+        </w:tc>
+        <w:tc>
+          <w:tcPr>
+            <w:tcW w:type="dxa" w:w="6826"/>
+            <w:tcBorders>
+              <w:top w:val="single" w:color="BBBBBB" w:sz="1"/>
+              <w:left w:val="single" w:color="BBBBBB" w:sz="1"/>
+              <w:bottom w:val="single" w:color="BBBBBB" w:sz="1"/>
+              <w:right w:val="single" w:color="BBBBBB" w:sz="1"/>
+            </w:tcBorders>
+            <w:tcMar>
+              <w:top w:type="dxa" w:w="60"/>
+              <w:left w:type="dxa" w:w="110"/>
+              <w:bottom w:type="dxa" w:w="60"/>
+              <w:right w:type="dxa" w:w="110"/>
+            </w:tcMar>
+          </w:tcPr>
+          <w:p>
+            <w:pPr>
+              <w:spacing w:after="0" w:line="260"/>
+            </w:pPr>
+            <w:r>
+              <w:rPr>
+                <w:color w:val="1A1A1A"/>
+              </w:rPr>
+              <w:t xml:space="preserve">Demo days, workshops, hackathons and the annual calendar.</w:t>
+            </w:r>
+          </w:p>
+        </w:tc>
+      </w:tr>
+      <w:tr>
+        <w:tc>
+          <w:tcPr>
+            <w:tcW w:type="dxa" w:w="2200"/>
+            <w:tcBorders>
+              <w:top w:val="single" w:color="BBBBBB" w:sz="1"/>
+              <w:left w:val="single" w:color="BBBBBB" w:sz="1"/>
+              <w:bottom w:val="single" w:color="BBBBBB" w:sz="1"/>
+              <w:right w:val="single" w:color="BBBBBB" w:sz="1"/>
+            </w:tcBorders>
+            <w:tcMar>
+              <w:top w:type="dxa" w:w="60"/>
+              <w:left w:type="dxa" w:w="110"/>
+              <w:bottom w:type="dxa" w:w="60"/>
+              <w:right w:type="dxa" w:w="110"/>
+            </w:tcMar>
+          </w:tcPr>
+          <w:p>
+            <w:pPr>
+              <w:spacing w:after="0" w:line="260"/>
+            </w:pPr>
+            <w:r>
+              <w:rPr>
+                <w:b/>
+                <w:bCs/>
+                <w:color w:val="1A1A1A"/>
+              </w:rPr>
+              <w:t xml:space="preserve">Team &amp; Mentors</w:t>
+            </w:r>
+          </w:p>
+        </w:tc>
+        <w:tc>
+          <w:tcPr>
+            <w:tcW w:type="dxa" w:w="6826"/>
+            <w:tcBorders>
+              <w:top w:val="single" w:color="BBBBBB" w:sz="1"/>
+              <w:left w:val="single" w:color="BBBBBB" w:sz="1"/>
+              <w:bottom w:val="single" w:color="BBBBBB" w:sz="1"/>
+              <w:right w:val="single" w:color="BBBBBB" w:sz="1"/>
+            </w:tcBorders>
+            <w:tcMar>
+              <w:top w:type="dxa" w:w="60"/>
+              <w:left w:type="dxa" w:w="110"/>
+              <w:bottom w:type="dxa" w:w="60"/>
+              <w:right w:type="dxa" w:w="110"/>
+            </w:tcMar>
+          </w:tcPr>
+          <w:p>
+            <w:pPr>
+              <w:spacing w:after="0" w:line="260"/>
+            </w:pPr>
+            <w:r>
+              <w:rPr>
+                <w:color w:val="1A1A1A"/>
+              </w:rPr>
+              <w:t xml:space="preserve">The CEII team (real) and the mentor / advisor network.</w:t>
+            </w:r>
+          </w:p>
+        </w:tc>
+      </w:tr>
+      <w:tr>
+        <w:tc>
+          <w:tcPr>
+            <w:tcW w:type="dxa" w:w="2200"/>
+            <w:tcBorders>
+              <w:top w:val="single" w:color="BBBBBB" w:sz="1"/>
+              <w:left w:val="single" w:color="BBBBBB" w:sz="1"/>
+              <w:bottom w:val="single" w:color="BBBBBB" w:sz="1"/>
+              <w:right w:val="single" w:color="BBBBBB" w:sz="1"/>
+            </w:tcBorders>
+            <w:tcMar>
+              <w:top w:type="dxa" w:w="60"/>
+              <w:left w:type="dxa" w:w="110"/>
+              <w:bottom w:type="dxa" w:w="60"/>
+              <w:right w:type="dxa" w:w="110"/>
+            </w:tcMar>
+          </w:tcPr>
+          <w:p>
+            <w:pPr>
+              <w:spacing w:after="0" w:line="260"/>
+            </w:pPr>
+            <w:r>
+              <w:rPr>
+                <w:b/>
+                <w:bCs/>
+                <w:color w:val="1A1A1A"/>
+              </w:rPr>
+              <w:t xml:space="preserve">Resources</w:t>
+            </w:r>
+          </w:p>
+        </w:tc>
+        <w:tc>
+          <w:tcPr>
+            <w:tcW w:type="dxa" w:w="6826"/>
+            <w:tcBorders>
+              <w:top w:val="single" w:color="BBBBBB" w:sz="1"/>
+              <w:left w:val="single" w:color="BBBBBB" w:sz="1"/>
+              <w:bottom w:val="single" w:color="BBBBBB" w:sz="1"/>
+              <w:right w:val="single" w:color="BBBBBB" w:sz="1"/>
+            </w:tcBorders>
+            <w:tcMar>
+              <w:top w:type="dxa" w:w="60"/>
+              <w:left w:type="dxa" w:w="110"/>
+              <w:bottom w:type="dxa" w:w="60"/>
+              <w:right w:type="dxa" w:w="110"/>
+            </w:tcMar>
+          </w:tcPr>
+          <w:p>
+            <w:pPr>
+              <w:spacing w:after="0" w:line="260"/>
+            </w:pPr>
+            <w:r>
+              <w:rPr>
+                <w:color w:val="1A1A1A"/>
+              </w:rPr>
+              <w:t xml:space="preserve">Facilities, labs, funding routes, legal and IP support, and partner networks.</w:t>
+            </w:r>
+          </w:p>
+        </w:tc>
+      </w:tr>
+      <w:tr>
+        <w:tc>
+          <w:tcPr>
+            <w:tcW w:type="dxa" w:w="2200"/>
+            <w:tcBorders>
+              <w:top w:val="single" w:color="BBBBBB" w:sz="1"/>
+              <w:left w:val="single" w:color="BBBBBB" w:sz="1"/>
+              <w:bottom w:val="single" w:color="BBBBBB" w:sz="1"/>
+              <w:right w:val="single" w:color="BBBBBB" w:sz="1"/>
+            </w:tcBorders>
+            <w:tcMar>
+              <w:top w:type="dxa" w:w="60"/>
+              <w:left w:type="dxa" w:w="110"/>
+              <w:bottom w:type="dxa" w:w="60"/>
+              <w:right w:type="dxa" w:w="110"/>
+            </w:tcMar>
+          </w:tcPr>
+          <w:p>
+            <w:pPr>
+              <w:spacing w:after="0" w:line="260"/>
+            </w:pPr>
+            <w:r>
+              <w:rPr>
+                <w:b/>
+                <w:bCs/>
+                <w:color w:val="1A1A1A"/>
+              </w:rPr>
+              <w:t xml:space="preserve">Journal (Blog)</w:t>
+            </w:r>
+          </w:p>
+        </w:tc>
+        <w:tc>
+          <w:tcPr>
+            <w:tcW w:type="dxa" w:w="6826"/>
+            <w:tcBorders>
+              <w:top w:val="single" w:color="BBBBBB" w:sz="1"/>
+              <w:left w:val="single" w:color="BBBBBB" w:sz="1"/>
+              <w:bottom w:val="single" w:color="BBBBBB" w:sz="1"/>
+              <w:right w:val="single" w:color="BBBBBB" w:sz="1"/>
+            </w:tcBorders>
+            <w:tcMar>
+              <w:top w:type="dxa" w:w="60"/>
+              <w:left w:type="dxa" w:w="110"/>
+              <w:bottom w:type="dxa" w:w="60"/>
+              <w:right w:type="dxa" w:w="110"/>
+            </w:tcMar>
+          </w:tcPr>
+          <w:p>
+            <w:pPr>
+              <w:spacing w:after="0" w:line="260"/>
+            </w:pPr>
+            <w:r>
+              <w:rPr>
+                <w:color w:val="1A1A1A"/>
+              </w:rPr>
+              <w:t xml:space="preserve">Articles, founder stories and blue-economy insight.</w:t>
+            </w:r>
+          </w:p>
+        </w:tc>
+      </w:tr>
+      <w:tr>
+        <w:tc>
+          <w:tcPr>
+            <w:tcW w:type="dxa" w:w="2200"/>
+            <w:tcBorders>
+              <w:top w:val="single" w:color="BBBBBB" w:sz="1"/>
+              <w:left w:val="single" w:color="BBBBBB" w:sz="1"/>
+              <w:bottom w:val="single" w:color="BBBBBB" w:sz="1"/>
+              <w:right w:val="single" w:color="BBBBBB" w:sz="1"/>
+            </w:tcBorders>
+            <w:tcMar>
+              <w:top w:type="dxa" w:w="60"/>
+              <w:left w:type="dxa" w:w="110"/>
+              <w:bottom w:type="dxa" w:w="60"/>
+              <w:right w:type="dxa" w:w="110"/>
+            </w:tcMar>
+          </w:tcPr>
+          <w:p>
+            <w:pPr>
+              <w:spacing w:after="0" w:line="260"/>
+            </w:pPr>
+            <w:r>
+              <w:rPr>
+                <w:b/>
+                <w:bCs/>
+                <w:color w:val="1A1A1A"/>
+              </w:rPr>
+              <w:t xml:space="preserve">Apply</w:t>
+            </w:r>
+          </w:p>
+        </w:tc>
+        <w:tc>
+          <w:tcPr>
+            <w:tcW w:type="dxa" w:w="6826"/>
+            <w:tcBorders>
+              <w:top w:val="single" w:color="BBBBBB" w:sz="1"/>
+              <w:left w:val="single" w:color="BBBBBB" w:sz="1"/>
+              <w:bottom w:val="single" w:color="BBBBBB" w:sz="1"/>
+              <w:right w:val="single" w:color="BBBBBB" w:sz="1"/>
+            </w:tcBorders>
+            <w:tcMar>
+              <w:top w:type="dxa" w:w="60"/>
+              <w:left w:type="dxa" w:w="110"/>
+              <w:bottom w:type="dxa" w:w="60"/>
+              <w:right w:type="dxa" w:w="110"/>
+            </w:tcMar>
+          </w:tcPr>
+          <w:p>
+            <w:pPr>
+              <w:spacing w:after="0" w:line="260"/>
+            </w:pPr>
+            <w:r>
+              <w:rPr>
+                <w:color w:val="1A1A1A"/>
+              </w:rPr>
+              <w:t xml:space="preserve">A short, guided multi-step application form for founders.</w:t>
+            </w:r>
+          </w:p>
+        </w:tc>
+      </w:tr>
+      <w:tr>
+        <w:tc>
+          <w:tcPr>
+            <w:tcW w:type="dxa" w:w="2200"/>
+            <w:tcBorders>
+              <w:top w:val="single" w:color="BBBBBB" w:sz="1"/>
+              <w:left w:val="single" w:color="BBBBBB" w:sz="1"/>
+              <w:bottom w:val="single" w:color="BBBBBB" w:sz="1"/>
+              <w:right w:val="single" w:color="BBBBBB" w:sz="1"/>
+            </w:tcBorders>
+            <w:tcMar>
+              <w:top w:type="dxa" w:w="60"/>
+              <w:left w:type="dxa" w:w="110"/>
+              <w:bottom w:type="dxa" w:w="60"/>
+              <w:right w:type="dxa" w:w="110"/>
+            </w:tcMar>
+          </w:tcPr>
+          <w:p>
+            <w:pPr>
+              <w:spacing w:after="0" w:line="260"/>
+            </w:pPr>
+            <w:r>
+              <w:rPr>
+                <w:b/>
+                <w:bCs/>
+                <w:color w:val="1A1A1A"/>
+              </w:rPr>
+              <w:t xml:space="preserve">Contact</w:t>
+            </w:r>
+          </w:p>
+        </w:tc>
+        <w:tc>
+          <w:tcPr>
+            <w:tcW w:type="dxa" w:w="6826"/>
+            <w:tcBorders>
+              <w:top w:val="single" w:color="BBBBBB" w:sz="1"/>
+              <w:left w:val="single" w:color="BBBBBB" w:sz="1"/>
+              <w:bottom w:val="single" w:color="BBBBBB" w:sz="1"/>
+              <w:right w:val="single" w:color="BBBBBB" w:sz="1"/>
+            </w:tcBorders>
+            <w:tcMar>
+              <w:top w:type="dxa" w:w="60"/>
+              <w:left w:type="dxa" w:w="110"/>
+              <w:bottom w:type="dxa" w:w="60"/>
+              <w:right w:type="dxa" w:w="110"/>
+            </w:tcMar>
+          </w:tcPr>
+          <w:p>
+            <w:pPr>
+              <w:spacing w:after="0" w:line="260"/>
+            </w:pPr>
+            <w:r>
+              <w:rPr>
+                <w:color w:val="1A1A1A"/>
+              </w:rPr>
+              <w:t xml:space="preserve">All contact details, location map and an enquiry form.</w:t>
+            </w:r>
+          </w:p>
+        </w:tc>
+      </w:tr>
+    </w:tbl>
+    <w:p>
+      <w:pPr>
+        <w:spacing w:after="140" w:line="276"/>
+        <w:jc w:val="both"/>
+      </w:pPr>
+      <w:r>
+        <w:t xml:space="preserve">Note: </w:t>
+      </w:r>
+      <w:r>
+        <w:rPr>
+          <w:i/>
+          <w:iCs/>
+        </w:rPr>
+        <w:t xml:space="preserve">the prototype currently shows clearly-labelled sample content (e.g., example startups and events). During the project, all such placeholders will be replaced with real information supplied by the CEII.</w:t>
+      </w:r>
+    </w:p>
+    <w:p>
+      <w:pPr>
+        <w:pStyle w:val="Heading2"/>
+      </w:pPr>
+      <w:r>
+        <w:t xml:space="preserve">5.2  Key features</w:t>
+      </w:r>
+    </w:p>
+    <w:p>
+      <w:pPr>
+        <w:pStyle w:val="ListParagraph"/>
+        <w:numPr>
+          <w:ilvl w:val="0"/>
+          <w:numId w:val="2"/>
+        </w:numPr>
+        <w:spacing w:after="70" w:line="270"/>
+      </w:pPr>
+      <w:r>
+        <w:rPr>
+          <w:b/>
+          <w:bCs/>
+        </w:rPr>
+        <w:t xml:space="preserve">Distinctive maritime identity </w:t>
+      </w:r>
+      <w:r>
+        <w:t xml:space="preserve">— a professional ‘harbour’ theme (deep-ocean palette, nautical detailing) fitting a maritime university.</w:t>
+      </w:r>
+    </w:p>
+    <w:p>
+      <w:pPr>
+        <w:pStyle w:val="ListParagraph"/>
+        <w:numPr>
+          <w:ilvl w:val="0"/>
+          <w:numId w:val="2"/>
+        </w:numPr>
+        <w:spacing w:after="70" w:line="270"/>
+      </w:pPr>
+      <w:r>
+        <w:rPr>
+          <w:b/>
+          <w:bCs/>
+        </w:rPr>
+        <w:t xml:space="preserve">Fully mobile-responsive </w:t>
+      </w:r>
+      <w:r>
+        <w:t xml:space="preserve">— works cleanly on phones, tablets and desktops.</w:t>
+      </w:r>
+    </w:p>
+    <w:p>
+      <w:pPr>
+        <w:pStyle w:val="ListParagraph"/>
+        <w:numPr>
+          <w:ilvl w:val="0"/>
+          <w:numId w:val="2"/>
+        </w:numPr>
+        <w:spacing w:after="70" w:line="270"/>
+      </w:pPr>
+      <w:r>
+        <w:rPr>
+          <w:b/>
+          <w:bCs/>
+        </w:rPr>
+        <w:t xml:space="preserve">Online application &amp; enquiry system </w:t>
+      </w:r>
+      <w:r>
+        <w:t xml:space="preserve">— submissions are emailed directly to aceii@ametuniv.ac.in.</w:t>
+      </w:r>
+    </w:p>
+    <w:p>
+      <w:pPr>
+        <w:pStyle w:val="ListParagraph"/>
+        <w:numPr>
+          <w:ilvl w:val="0"/>
+          <w:numId w:val="2"/>
+        </w:numPr>
+        <w:spacing w:after="70" w:line="270"/>
+      </w:pPr>
+      <w:r>
+        <w:rPr>
+          <w:b/>
+          <w:bCs/>
+        </w:rPr>
+        <w:t xml:space="preserve">Fast and accessible </w:t>
+      </w:r>
+      <w:r>
+        <w:t xml:space="preserve">— lightweight pages, good search-engine visibility, readable for everyone.</w:t>
+      </w:r>
+    </w:p>
+    <w:p>
+      <w:pPr>
+        <w:pStyle w:val="ListParagraph"/>
+        <w:numPr>
+          <w:ilvl w:val="0"/>
+          <w:numId w:val="2"/>
+        </w:numPr>
+        <w:spacing w:after="70" w:line="270"/>
+      </w:pPr>
+      <w:r>
+        <w:rPr>
+          <w:b/>
+          <w:bCs/>
+        </w:rPr>
+        <w:t xml:space="preserve">Easy to update </w:t>
+      </w:r>
+      <w:r>
+        <w:t xml:space="preserve">— a shared design system means content can be changed quickly and consistently.</w:t>
+      </w:r>
+    </w:p>
+    <w:p>
+      <w:pPr>
+        <w:pStyle w:val="Heading2"/>
+      </w:pPr>
+      <w:r>
+        <w:t xml:space="preserve">5.3  Prototype preview</w:t>
       </w:r>
     </w:p>
     <w:p>
@@ -2409,7 +2474,7 @@
           <wp:inline distT="0" distB="0" distL="0" distR="0">
             <wp:extent cx="5334000" cy="3257550"/>
             <wp:effectExtent t="0" r="0" b="0" l="0"/>
-            <wp:docPr id="1" name="apply_top.png" descr="Figure 2 — Guided multi-step Apply form (working prototype)." title="Figure 2 — Guided multi-step Apply form (working prototype)."/>
+            <wp:docPr id="1" name="home_top.png" descr="Figure 1 — Redesigned Home page (working prototype)." title="Figure 1 — Redesigned Home page (working prototype)."/>
             <wp:cNvGraphicFramePr>
               <a:graphicFrameLocks xmlns:a="http://schemas.openxmlformats.org/drawingml/2006/main" noChangeAspect="1"/>
             </wp:cNvGraphicFramePr>
@@ -2458,7 +2523,7 @@
           <w:sz w:val="18"/>
           <w:szCs w:val="18"/>
         </w:rPr>
-        <w:t xml:space="preserve">Figure 2 — Guided multi-step Apply form (working prototype).</w:t>
+        <w:t xml:space="preserve">Figure 1 — Redesigned Home page (working prototype).</w:t>
       </w:r>
     </w:p>
     <w:p>
@@ -2471,7 +2536,7 @@
           <wp:inline distT="0" distB="0" distL="0" distR="0">
             <wp:extent cx="5334000" cy="3257550"/>
             <wp:effectExtent t="0" r="0" b="0" l="0"/>
-            <wp:docPr id="1" name="portfolio_top.png" descr="Figure 3 — Portfolio page with sector filters (sample content shown)." title="Figure 3 — Portfolio page with sector filters (sample content shown)."/>
+            <wp:docPr id="1" name="apply_top.png" descr="Figure 2 — Guided multi-step Apply form (working prototype)." title="Figure 2 — Guided multi-step Apply form (working prototype)."/>
             <wp:cNvGraphicFramePr>
               <a:graphicFrameLocks xmlns:a="http://schemas.openxmlformats.org/drawingml/2006/main" noChangeAspect="1"/>
             </wp:cNvGraphicFramePr>
@@ -2520,6 +2585,68 @@
           <w:sz w:val="18"/>
           <w:szCs w:val="18"/>
         </w:rPr>
+        <w:t xml:space="preserve">Figure 2 — Guided multi-step Apply form (working prototype).</w:t>
+      </w:r>
+    </w:p>
+    <w:p>
+      <w:pPr>
+        <w:spacing w:after="40" w:before="100"/>
+        <w:jc w:val="center"/>
+      </w:pPr>
+      <w:r>
+        <w:drawing>
+          <wp:inline distT="0" distB="0" distL="0" distR="0">
+            <wp:extent cx="5334000" cy="3257550"/>
+            <wp:effectExtent t="0" r="0" b="0" l="0"/>
+            <wp:docPr id="1" name="portfolio_top.png" descr="Figure 3 — Portfolio page with sector filters (sample content shown)." title="Figure 3 — Portfolio page with sector filters (sample content shown)."/>
+            <wp:cNvGraphicFramePr>
+              <a:graphicFrameLocks xmlns:a="http://schemas.openxmlformats.org/drawingml/2006/main" noChangeAspect="1"/>
+            </wp:cNvGraphicFramePr>
+            <a:graphic xmlns:a="http://schemas.openxmlformats.org/drawingml/2006/main">
+              <a:graphicData uri="http://schemas.openxmlformats.org/drawingml/2006/picture">
+                <pic:pic xmlns:pic="http://schemas.openxmlformats.org/drawingml/2006/picture">
+                  <pic:nvPicPr>
+                    <pic:cNvPr id="0" name="" descr=""/>
+                    <pic:cNvPicPr>
+                      <a:picLocks noChangeAspect="1" noChangeArrowheads="1"/>
+                    </pic:cNvPicPr>
+                  </pic:nvPicPr>
+                  <pic:blipFill>
+                    <a:blip r:embed="rId12" cstate="none"/>
+                    <a:srcRect/>
+                    <a:stretch>
+                      <a:fillRect/>
+                    </a:stretch>
+                  </pic:blipFill>
+                  <pic:spPr bwMode="auto">
+                    <a:xfrm>
+                      <a:off x="0" y="0"/>
+                      <a:ext cx="5334000" cy="3257550"/>
+                    </a:xfrm>
+                    <a:prstGeom prst="rect">
+                      <a:avLst/>
+                    </a:prstGeom>
+                  </pic:spPr>
+                </pic:pic>
+              </a:graphicData>
+            </a:graphic>
+          </wp:inline>
+        </w:drawing>
+      </w:r>
+    </w:p>
+    <w:p>
+      <w:pPr>
+        <w:spacing w:after="160"/>
+        <w:jc w:val="center"/>
+      </w:pPr>
+      <w:r>
+        <w:rPr>
+          <w:i/>
+          <w:iCs/>
+          <w:color w:val="595959"/>
+          <w:sz w:val="18"/>
+          <w:szCs w:val="18"/>
+        </w:rPr>
         <w:t xml:space="preserve">Figure 3 — Portfolio page with sector filters (sample content shown).</w:t>
       </w:r>
     </w:p>
@@ -3095,7 +3222,7 @@
                 <w:bCs/>
                 <w:color w:val="FFFFFF"/>
               </w:rPr>
-              <w:t xml:space="preserve">External vendor (current)</w:t>
+              <w:t xml:space="preserve">TEMS Tech Solutions (current)</w:t>
             </w:r>
           </w:p>
         </w:tc>

</xml_diff>

<commit_message>
Add real university leadership photos (Chancellor to IQAC) from old site to team page
</commit_message>
<xml_diff>
--- a/pitch/AMET-CEII-Website-Redesign-Proposal.docx
+++ b/pitch/AMET-CEII-Website-Redesign-Proposal.docx
@@ -1514,6 +1514,541 @@
                 <w:color w:val="1A1A1A"/>
               </w:rPr>
               <w:t xml:space="preserve">aceii@ametuniv.ac.in  ·  +91 94863 03654, +91 96296 95776  ·  135, SH 49, Kanathur Reddykuppam, Tamil Nadu 603112.</w:t>
+            </w:r>
+          </w:p>
+        </w:tc>
+      </w:tr>
+    </w:tbl>
+    <w:p>
+      <w:pPr>
+        <w:pStyle w:val="Heading2"/>
+      </w:pPr>
+      <w:r>
+        <w:t xml:space="preserve">3.1  University leadership</w:t>
+      </w:r>
+    </w:p>
+    <w:p>
+      <w:pPr>
+        <w:spacing w:after="140" w:line="276"/>
+        <w:jc w:val="both"/>
+      </w:pPr>
+      <w:r>
+        <w:t xml:space="preserve">CEII operates under the leadership of AMET University. This proposal is respectfully submitted to the Registrar for approval.</w:t>
+      </w:r>
+    </w:p>
+    <w:tbl>
+      <w:tblPr>
+        <w:tblW w:type="dxa" w:w="9026"/>
+        <w:tblBorders>
+          <w:top w:val="single" w:color="auto" w:sz="4"/>
+          <w:left w:val="single" w:color="auto" w:sz="4"/>
+          <w:bottom w:val="single" w:color="auto" w:sz="4"/>
+          <w:right w:val="single" w:color="auto" w:sz="4"/>
+          <w:insideH w:val="single" w:color="auto" w:sz="4"/>
+          <w:insideV w:val="single" w:color="auto" w:sz="4"/>
+        </w:tblBorders>
+      </w:tblPr>
+      <w:tblGrid>
+        <w:gridCol w:w="4513"/>
+        <w:gridCol w:w="4513"/>
+      </w:tblGrid>
+      <w:tr>
+        <w:trPr>
+          <w:tblHeader/>
+        </w:trPr>
+        <w:tc>
+          <w:tcPr>
+            <w:tcW w:type="dxa" w:w="4513"/>
+            <w:tcBorders>
+              <w:top w:val="single" w:color="BBBBBB" w:sz="1"/>
+              <w:left w:val="single" w:color="BBBBBB" w:sz="1"/>
+              <w:bottom w:val="single" w:color="BBBBBB" w:sz="1"/>
+              <w:right w:val="single" w:color="BBBBBB" w:sz="1"/>
+            </w:tcBorders>
+            <w:shd w:fill="0E2E42" w:val="clear"/>
+            <w:tcMar>
+              <w:top w:type="dxa" w:w="60"/>
+              <w:left w:type="dxa" w:w="110"/>
+              <w:bottom w:type="dxa" w:w="60"/>
+              <w:right w:type="dxa" w:w="110"/>
+            </w:tcMar>
+          </w:tcPr>
+          <w:p>
+            <w:pPr>
+              <w:spacing w:after="0" w:line="260"/>
+            </w:pPr>
+            <w:r>
+              <w:rPr>
+                <w:b/>
+                <w:bCs/>
+                <w:color w:val="FFFFFF"/>
+              </w:rPr>
+              <w:t xml:space="preserve">Name</w:t>
+            </w:r>
+          </w:p>
+        </w:tc>
+        <w:tc>
+          <w:tcPr>
+            <w:tcW w:type="dxa" w:w="4513"/>
+            <w:tcBorders>
+              <w:top w:val="single" w:color="BBBBBB" w:sz="1"/>
+              <w:left w:val="single" w:color="BBBBBB" w:sz="1"/>
+              <w:bottom w:val="single" w:color="BBBBBB" w:sz="1"/>
+              <w:right w:val="single" w:color="BBBBBB" w:sz="1"/>
+            </w:tcBorders>
+            <w:shd w:fill="0E2E42" w:val="clear"/>
+            <w:tcMar>
+              <w:top w:type="dxa" w:w="60"/>
+              <w:left w:type="dxa" w:w="110"/>
+              <w:bottom w:type="dxa" w:w="60"/>
+              <w:right w:type="dxa" w:w="110"/>
+            </w:tcMar>
+          </w:tcPr>
+          <w:p>
+            <w:pPr>
+              <w:spacing w:after="0" w:line="260"/>
+            </w:pPr>
+            <w:r>
+              <w:rPr>
+                <w:b/>
+                <w:bCs/>
+                <w:color w:val="FFFFFF"/>
+              </w:rPr>
+              <w:t xml:space="preserve">Position</w:t>
+            </w:r>
+          </w:p>
+        </w:tc>
+      </w:tr>
+      <w:tr>
+        <w:tc>
+          <w:tcPr>
+            <w:tcW w:type="dxa" w:w="4513"/>
+            <w:tcBorders>
+              <w:top w:val="single" w:color="BBBBBB" w:sz="1"/>
+              <w:left w:val="single" w:color="BBBBBB" w:sz="1"/>
+              <w:bottom w:val="single" w:color="BBBBBB" w:sz="1"/>
+              <w:right w:val="single" w:color="BBBBBB" w:sz="1"/>
+            </w:tcBorders>
+            <w:tcMar>
+              <w:top w:type="dxa" w:w="60"/>
+              <w:left w:type="dxa" w:w="110"/>
+              <w:bottom w:type="dxa" w:w="60"/>
+              <w:right w:type="dxa" w:w="110"/>
+            </w:tcMar>
+          </w:tcPr>
+          <w:p>
+            <w:pPr>
+              <w:spacing w:after="0" w:line="260"/>
+            </w:pPr>
+            <w:r>
+              <w:rPr>
+                <w:b w:val="false"/>
+                <w:bCs w:val="false"/>
+                <w:color w:val="1A1A1A"/>
+              </w:rPr>
+              <w:t xml:space="preserve">Dr. J. Ramachandran</w:t>
+            </w:r>
+          </w:p>
+        </w:tc>
+        <w:tc>
+          <w:tcPr>
+            <w:tcW w:type="dxa" w:w="4513"/>
+            <w:tcBorders>
+              <w:top w:val="single" w:color="BBBBBB" w:sz="1"/>
+              <w:left w:val="single" w:color="BBBBBB" w:sz="1"/>
+              <w:bottom w:val="single" w:color="BBBBBB" w:sz="1"/>
+              <w:right w:val="single" w:color="BBBBBB" w:sz="1"/>
+            </w:tcBorders>
+            <w:tcMar>
+              <w:top w:type="dxa" w:w="60"/>
+              <w:left w:type="dxa" w:w="110"/>
+              <w:bottom w:type="dxa" w:w="60"/>
+              <w:right w:type="dxa" w:w="110"/>
+            </w:tcMar>
+          </w:tcPr>
+          <w:p>
+            <w:pPr>
+              <w:spacing w:after="0" w:line="260"/>
+            </w:pPr>
+            <w:r>
+              <w:rPr>
+                <w:b w:val="false"/>
+                <w:bCs w:val="false"/>
+                <w:color w:val="1A1A1A"/>
+              </w:rPr>
+              <w:t xml:space="preserve">Chancellor</w:t>
+            </w:r>
+          </w:p>
+        </w:tc>
+      </w:tr>
+      <w:tr>
+        <w:tc>
+          <w:tcPr>
+            <w:tcW w:type="dxa" w:w="4513"/>
+            <w:tcBorders>
+              <w:top w:val="single" w:color="BBBBBB" w:sz="1"/>
+              <w:left w:val="single" w:color="BBBBBB" w:sz="1"/>
+              <w:bottom w:val="single" w:color="BBBBBB" w:sz="1"/>
+              <w:right w:val="single" w:color="BBBBBB" w:sz="1"/>
+            </w:tcBorders>
+            <w:tcMar>
+              <w:top w:type="dxa" w:w="60"/>
+              <w:left w:type="dxa" w:w="110"/>
+              <w:bottom w:type="dxa" w:w="60"/>
+              <w:right w:type="dxa" w:w="110"/>
+            </w:tcMar>
+          </w:tcPr>
+          <w:p>
+            <w:pPr>
+              <w:spacing w:after="0" w:line="260"/>
+            </w:pPr>
+            <w:r>
+              <w:rPr>
+                <w:b w:val="false"/>
+                <w:bCs w:val="false"/>
+                <w:color w:val="1A1A1A"/>
+              </w:rPr>
+              <w:t xml:space="preserve">Dr. Rajesh Ramachandran</w:t>
+            </w:r>
+          </w:p>
+        </w:tc>
+        <w:tc>
+          <w:tcPr>
+            <w:tcW w:type="dxa" w:w="4513"/>
+            <w:tcBorders>
+              <w:top w:val="single" w:color="BBBBBB" w:sz="1"/>
+              <w:left w:val="single" w:color="BBBBBB" w:sz="1"/>
+              <w:bottom w:val="single" w:color="BBBBBB" w:sz="1"/>
+              <w:right w:val="single" w:color="BBBBBB" w:sz="1"/>
+            </w:tcBorders>
+            <w:tcMar>
+              <w:top w:type="dxa" w:w="60"/>
+              <w:left w:type="dxa" w:w="110"/>
+              <w:bottom w:type="dxa" w:w="60"/>
+              <w:right w:type="dxa" w:w="110"/>
+            </w:tcMar>
+          </w:tcPr>
+          <w:p>
+            <w:pPr>
+              <w:spacing w:after="0" w:line="260"/>
+            </w:pPr>
+            <w:r>
+              <w:rPr>
+                <w:b w:val="false"/>
+                <w:bCs w:val="false"/>
+                <w:color w:val="1A1A1A"/>
+              </w:rPr>
+              <w:t xml:space="preserve">President</w:t>
+            </w:r>
+          </w:p>
+        </w:tc>
+      </w:tr>
+      <w:tr>
+        <w:tc>
+          <w:tcPr>
+            <w:tcW w:type="dxa" w:w="4513"/>
+            <w:tcBorders>
+              <w:top w:val="single" w:color="BBBBBB" w:sz="1"/>
+              <w:left w:val="single" w:color="BBBBBB" w:sz="1"/>
+              <w:bottom w:val="single" w:color="BBBBBB" w:sz="1"/>
+              <w:right w:val="single" w:color="BBBBBB" w:sz="1"/>
+            </w:tcBorders>
+            <w:tcMar>
+              <w:top w:type="dxa" w:w="60"/>
+              <w:left w:type="dxa" w:w="110"/>
+              <w:bottom w:type="dxa" w:w="60"/>
+              <w:right w:type="dxa" w:w="110"/>
+            </w:tcMar>
+          </w:tcPr>
+          <w:p>
+            <w:pPr>
+              <w:spacing w:after="0" w:line="260"/>
+            </w:pPr>
+            <w:r>
+              <w:rPr>
+                <w:b w:val="false"/>
+                <w:bCs w:val="false"/>
+                <w:color w:val="1A1A1A"/>
+              </w:rPr>
+              <w:t xml:space="preserve">Col. Dr. G. Thiruvasagam</w:t>
+            </w:r>
+          </w:p>
+        </w:tc>
+        <w:tc>
+          <w:tcPr>
+            <w:tcW w:type="dxa" w:w="4513"/>
+            <w:tcBorders>
+              <w:top w:val="single" w:color="BBBBBB" w:sz="1"/>
+              <w:left w:val="single" w:color="BBBBBB" w:sz="1"/>
+              <w:bottom w:val="single" w:color="BBBBBB" w:sz="1"/>
+              <w:right w:val="single" w:color="BBBBBB" w:sz="1"/>
+            </w:tcBorders>
+            <w:tcMar>
+              <w:top w:type="dxa" w:w="60"/>
+              <w:left w:type="dxa" w:w="110"/>
+              <w:bottom w:type="dxa" w:w="60"/>
+              <w:right w:type="dxa" w:w="110"/>
+            </w:tcMar>
+          </w:tcPr>
+          <w:p>
+            <w:pPr>
+              <w:spacing w:after="0" w:line="260"/>
+            </w:pPr>
+            <w:r>
+              <w:rPr>
+                <w:b w:val="false"/>
+                <w:bCs w:val="false"/>
+                <w:color w:val="1A1A1A"/>
+              </w:rPr>
+              <w:t xml:space="preserve">Provost</w:t>
+            </w:r>
+          </w:p>
+        </w:tc>
+      </w:tr>
+      <w:tr>
+        <w:tc>
+          <w:tcPr>
+            <w:tcW w:type="dxa" w:w="4513"/>
+            <w:tcBorders>
+              <w:top w:val="single" w:color="BBBBBB" w:sz="1"/>
+              <w:left w:val="single" w:color="BBBBBB" w:sz="1"/>
+              <w:bottom w:val="single" w:color="BBBBBB" w:sz="1"/>
+              <w:right w:val="single" w:color="BBBBBB" w:sz="1"/>
+            </w:tcBorders>
+            <w:tcMar>
+              <w:top w:type="dxa" w:w="60"/>
+              <w:left w:type="dxa" w:w="110"/>
+              <w:bottom w:type="dxa" w:w="60"/>
+              <w:right w:type="dxa" w:w="110"/>
+            </w:tcMar>
+          </w:tcPr>
+          <w:p>
+            <w:pPr>
+              <w:spacing w:after="0" w:line="260"/>
+            </w:pPr>
+            <w:r>
+              <w:rPr>
+                <w:b w:val="false"/>
+                <w:bCs w:val="false"/>
+                <w:color w:val="1A1A1A"/>
+              </w:rPr>
+              <w:t xml:space="preserve">Dr. Deepa Rajesh</w:t>
+            </w:r>
+          </w:p>
+        </w:tc>
+        <w:tc>
+          <w:tcPr>
+            <w:tcW w:type="dxa" w:w="4513"/>
+            <w:tcBorders>
+              <w:top w:val="single" w:color="BBBBBB" w:sz="1"/>
+              <w:left w:val="single" w:color="BBBBBB" w:sz="1"/>
+              <w:bottom w:val="single" w:color="BBBBBB" w:sz="1"/>
+              <w:right w:val="single" w:color="BBBBBB" w:sz="1"/>
+            </w:tcBorders>
+            <w:tcMar>
+              <w:top w:type="dxa" w:w="60"/>
+              <w:left w:type="dxa" w:w="110"/>
+              <w:bottom w:type="dxa" w:w="60"/>
+              <w:right w:type="dxa" w:w="110"/>
+            </w:tcMar>
+          </w:tcPr>
+          <w:p>
+            <w:pPr>
+              <w:spacing w:after="0" w:line="260"/>
+            </w:pPr>
+            <w:r>
+              <w:rPr>
+                <w:b w:val="false"/>
+                <w:bCs w:val="false"/>
+                <w:color w:val="1A1A1A"/>
+              </w:rPr>
+              <w:t xml:space="preserve">Vice President (Academics)</w:t>
+            </w:r>
+          </w:p>
+        </w:tc>
+      </w:tr>
+      <w:tr>
+        <w:tc>
+          <w:tcPr>
+            <w:tcW w:type="dxa" w:w="4513"/>
+            <w:tcBorders>
+              <w:top w:val="single" w:color="BBBBBB" w:sz="1"/>
+              <w:left w:val="single" w:color="BBBBBB" w:sz="1"/>
+              <w:bottom w:val="single" w:color="BBBBBB" w:sz="1"/>
+              <w:right w:val="single" w:color="BBBBBB" w:sz="1"/>
+            </w:tcBorders>
+            <w:tcMar>
+              <w:top w:type="dxa" w:w="60"/>
+              <w:left w:type="dxa" w:w="110"/>
+              <w:bottom w:type="dxa" w:w="60"/>
+              <w:right w:type="dxa" w:w="110"/>
+            </w:tcMar>
+          </w:tcPr>
+          <w:p>
+            <w:pPr>
+              <w:spacing w:after="0" w:line="260"/>
+            </w:pPr>
+            <w:r>
+              <w:rPr>
+                <w:b w:val="false"/>
+                <w:bCs w:val="false"/>
+                <w:color w:val="1A1A1A"/>
+              </w:rPr>
+              <w:t xml:space="preserve">Dr. V. Rajendran</w:t>
+            </w:r>
+          </w:p>
+        </w:tc>
+        <w:tc>
+          <w:tcPr>
+            <w:tcW w:type="dxa" w:w="4513"/>
+            <w:tcBorders>
+              <w:top w:val="single" w:color="BBBBBB" w:sz="1"/>
+              <w:left w:val="single" w:color="BBBBBB" w:sz="1"/>
+              <w:bottom w:val="single" w:color="BBBBBB" w:sz="1"/>
+              <w:right w:val="single" w:color="BBBBBB" w:sz="1"/>
+            </w:tcBorders>
+            <w:tcMar>
+              <w:top w:type="dxa" w:w="60"/>
+              <w:left w:type="dxa" w:w="110"/>
+              <w:bottom w:type="dxa" w:w="60"/>
+              <w:right w:type="dxa" w:w="110"/>
+            </w:tcMar>
+          </w:tcPr>
+          <w:p>
+            <w:pPr>
+              <w:spacing w:after="0" w:line="260"/>
+            </w:pPr>
+            <w:r>
+              <w:rPr>
+                <w:b w:val="false"/>
+                <w:bCs w:val="false"/>
+                <w:color w:val="1A1A1A"/>
+              </w:rPr>
+              <w:t xml:space="preserve">Vice Chancellor</w:t>
+            </w:r>
+          </w:p>
+        </w:tc>
+      </w:tr>
+      <w:tr>
+        <w:tc>
+          <w:tcPr>
+            <w:tcW w:type="dxa" w:w="4513"/>
+            <w:tcBorders>
+              <w:top w:val="single" w:color="BBBBBB" w:sz="1"/>
+              <w:left w:val="single" w:color="BBBBBB" w:sz="1"/>
+              <w:bottom w:val="single" w:color="BBBBBB" w:sz="1"/>
+              <w:right w:val="single" w:color="BBBBBB" w:sz="1"/>
+            </w:tcBorders>
+            <w:tcMar>
+              <w:top w:type="dxa" w:w="60"/>
+              <w:left w:type="dxa" w:w="110"/>
+              <w:bottom w:type="dxa" w:w="60"/>
+              <w:right w:type="dxa" w:w="110"/>
+            </w:tcMar>
+          </w:tcPr>
+          <w:p>
+            <w:pPr>
+              <w:spacing w:after="0" w:line="260"/>
+            </w:pPr>
+            <w:r>
+              <w:rPr>
+                <w:b/>
+                <w:bCs/>
+                <w:color w:val="1A1A1A"/>
+              </w:rPr>
+              <w:t xml:space="preserve">Dr. V. Sangeetha Albin</w:t>
+            </w:r>
+          </w:p>
+        </w:tc>
+        <w:tc>
+          <w:tcPr>
+            <w:tcW w:type="dxa" w:w="4513"/>
+            <w:tcBorders>
+              <w:top w:val="single" w:color="BBBBBB" w:sz="1"/>
+              <w:left w:val="single" w:color="BBBBBB" w:sz="1"/>
+              <w:bottom w:val="single" w:color="BBBBBB" w:sz="1"/>
+              <w:right w:val="single" w:color="BBBBBB" w:sz="1"/>
+            </w:tcBorders>
+            <w:tcMar>
+              <w:top w:type="dxa" w:w="60"/>
+              <w:left w:type="dxa" w:w="110"/>
+              <w:bottom w:type="dxa" w:w="60"/>
+              <w:right w:type="dxa" w:w="110"/>
+            </w:tcMar>
+          </w:tcPr>
+          <w:p>
+            <w:pPr>
+              <w:spacing w:after="0" w:line="260"/>
+            </w:pPr>
+            <w:r>
+              <w:rPr>
+                <w:b/>
+                <w:bCs/>
+                <w:color w:val="0E7C6B"/>
+              </w:rPr>
+              <w:t xml:space="preserve">Registrar</w:t>
+            </w:r>
+          </w:p>
+        </w:tc>
+      </w:tr>
+      <w:tr>
+        <w:tc>
+          <w:tcPr>
+            <w:tcW w:type="dxa" w:w="4513"/>
+            <w:tcBorders>
+              <w:top w:val="single" w:color="BBBBBB" w:sz="1"/>
+              <w:left w:val="single" w:color="BBBBBB" w:sz="1"/>
+              <w:bottom w:val="single" w:color="BBBBBB" w:sz="1"/>
+              <w:right w:val="single" w:color="BBBBBB" w:sz="1"/>
+            </w:tcBorders>
+            <w:tcMar>
+              <w:top w:type="dxa" w:w="60"/>
+              <w:left w:type="dxa" w:w="110"/>
+              <w:bottom w:type="dxa" w:w="60"/>
+              <w:right w:type="dxa" w:w="110"/>
+            </w:tcMar>
+          </w:tcPr>
+          <w:p>
+            <w:pPr>
+              <w:spacing w:after="0" w:line="260"/>
+            </w:pPr>
+            <w:r>
+              <w:rPr>
+                <w:b w:val="false"/>
+                <w:bCs w:val="false"/>
+                <w:color w:val="1A1A1A"/>
+              </w:rPr>
+              <w:t xml:space="preserve">Dr. M. Jayaprakashvel</w:t>
+            </w:r>
+          </w:p>
+        </w:tc>
+        <w:tc>
+          <w:tcPr>
+            <w:tcW w:type="dxa" w:w="4513"/>
+            <w:tcBorders>
+              <w:top w:val="single" w:color="BBBBBB" w:sz="1"/>
+              <w:left w:val="single" w:color="BBBBBB" w:sz="1"/>
+              <w:bottom w:val="single" w:color="BBBBBB" w:sz="1"/>
+              <w:right w:val="single" w:color="BBBBBB" w:sz="1"/>
+            </w:tcBorders>
+            <w:tcMar>
+              <w:top w:type="dxa" w:w="60"/>
+              <w:left w:type="dxa" w:w="110"/>
+              <w:bottom w:type="dxa" w:w="60"/>
+              <w:right w:type="dxa" w:w="110"/>
+            </w:tcMar>
+          </w:tcPr>
+          <w:p>
+            <w:pPr>
+              <w:spacing w:after="0" w:line="260"/>
+            </w:pPr>
+            <w:r>
+              <w:rPr>
+                <w:b w:val="false"/>
+                <w:bCs w:val="false"/>
+                <w:color w:val="1A1A1A"/>
+              </w:rPr>
+              <w:t xml:space="preserve">IQAC Coordinator</w:t>
             </w:r>
           </w:p>
         </w:tc>

</xml_diff>

<commit_message>
NOTES: document two design directions (holistic + maritime)
</commit_message>
<xml_diff>
--- a/pitch/AMET-CEII-Website-Redesign-Proposal.docx
+++ b/pitch/AMET-CEII-Website-Redesign-Proposal.docx
@@ -198,7 +198,17 @@
         <w:jc w:val="both"/>
       </w:pPr>
       <w:r>
-        <w:t xml:space="preserve">To demonstrate our seriousness, we have already built a working prototype of the redesigned site, which can be viewed at </w:t>
+        <w:t xml:space="preserve">To demonstrate our seriousness, we have already built </w:t>
+      </w:r>
+      <w:r>
+        <w:rPr>
+          <w:b/>
+          <w:bCs/>
+        </w:rPr>
+        <w:t xml:space="preserve">two complete, working prototypes</w:t>
+      </w:r>
+      <w:r>
+        <w:t xml:space="preserve"> — a holistic version for all departments (</w:t>
       </w:r>
       <w:r>
         <w:rPr>
@@ -208,7 +218,17 @@
         <w:t xml:space="preserve">amet-ceii.vercel.app</w:t>
       </w:r>
       <w:r>
-        <w:t xml:space="preserve">. This proposal document sets out the background, the proposed solution, a detailed maintenance plan, and the internship arrangement we are requesting.</w:t>
+        <w:t xml:space="preserve">) and a maritime-focused version (</w:t>
+      </w:r>
+      <w:r>
+        <w:rPr>
+          <w:b/>
+          <w:bCs/>
+        </w:rPr>
+        <w:t xml:space="preserve">amet-ceii.vercel.app/maritime</w:t>
+      </w:r>
+      <w:r>
+        <w:t xml:space="preserve">). Our proposal is to deliver and maintain both, or whichever direction the university prefers. This document sets out the background, the proposed solution, a detailed maintenance plan, and the internship arrangement we are requesting.</w:t>
       </w:r>
     </w:p>
     <w:p>
@@ -401,7 +421,7 @@
         <w:jc w:val="both"/>
       </w:pPr>
       <w:r>
-        <w:t xml:space="preserve">A working prototype is already live at amet-ceii.vercel.app. The redesign expands the site from a handful of pages to ten well-structured pages, adds an online application and enquiry system, and introduces a distinctive maritime visual identity — all built on free and low-cost, industry-standard tools.</w:t>
+        <w:t xml:space="preserve">Two working prototypes are already live — a holistic version (amet-ceii.vercel.app) and a maritime-focused version (amet-ceii.vercel.app/maritime). The redesign expands the site from a handful of pages to ten well-structured pages, adds an online application and enquiry system, and gives CEII a modern, professional visual identity — all built on free and low-cost, industry-standard tools.</w:t>
       </w:r>
     </w:p>
     <w:p>
@@ -2996,7 +3016,83 @@
         <w:pStyle w:val="Heading2"/>
       </w:pPr>
       <w:r>
-        <w:t xml:space="preserve">5.3  Prototype preview</w:t>
+        <w:t xml:space="preserve">5.3  Two design directions</w:t>
+      </w:r>
+    </w:p>
+    <w:p>
+      <w:pPr>
+        <w:spacing w:after="140" w:line="276"/>
+        <w:jc w:val="both"/>
+      </w:pPr>
+      <w:r>
+        <w:t xml:space="preserve">Because AMET is a full university with 18 departments — and also a distinguished maritime institution — we prepared </w:t>
+      </w:r>
+      <w:r>
+        <w:rPr>
+          <w:b/>
+          <w:bCs/>
+        </w:rPr>
+        <w:t xml:space="preserve">two design directions</w:t>
+      </w:r>
+      <w:r>
+        <w:t xml:space="preserve"> so the university can choose the emphasis it prefers:</w:t>
+      </w:r>
+    </w:p>
+    <w:p>
+      <w:pPr>
+        <w:pStyle w:val="ListParagraph"/>
+        <w:numPr>
+          <w:ilvl w:val="0"/>
+          <w:numId w:val="2"/>
+        </w:numPr>
+        <w:spacing w:after="70" w:line="270"/>
+      </w:pPr>
+      <w:r>
+        <w:rPr>
+          <w:b/>
+          <w:bCs/>
+        </w:rPr>
+        <w:t xml:space="preserve">Holistic </w:t>
+      </w:r>
+      <w:r>
+        <w:t xml:space="preserve">(amet-ceii.vercel.app): positions CEII as the incubator for every discipline, with maritime as one distinctive strength.</w:t>
+      </w:r>
+    </w:p>
+    <w:p>
+      <w:pPr>
+        <w:pStyle w:val="ListParagraph"/>
+        <w:numPr>
+          <w:ilvl w:val="0"/>
+          <w:numId w:val="2"/>
+        </w:numPr>
+        <w:spacing w:after="70" w:line="270"/>
+      </w:pPr>
+      <w:r>
+        <w:rPr>
+          <w:b/>
+          <w:bCs/>
+        </w:rPr>
+        <w:t xml:space="preserve">Maritime-focused </w:t>
+      </w:r>
+      <w:r>
+        <w:t xml:space="preserve">(amet-ceii.vercel.app/maritime): leans into AMET's maritime heritage and the blue economy as a headline identity.</w:t>
+      </w:r>
+    </w:p>
+    <w:p>
+      <w:pPr>
+        <w:spacing w:after="140" w:line="276"/>
+        <w:jc w:val="both"/>
+      </w:pPr>
+      <w:r>
+        <w:t xml:space="preserve">Both are complete and live, and a visitor can switch between them from a link on the page. The screenshots below show the holistic version.</w:t>
+      </w:r>
+    </w:p>
+    <w:p>
+      <w:pPr>
+        <w:pStyle w:val="Heading2"/>
+      </w:pPr>
+      <w:r>
+        <w:t xml:space="preserve">5.4  Prototype preview</w:t>
       </w:r>
     </w:p>
     <w:p>
@@ -3009,7 +3105,7 @@
           <wp:inline distT="0" distB="0" distL="0" distR="0">
             <wp:extent cx="5334000" cy="3257550"/>
             <wp:effectExtent t="0" r="0" b="0" l="0"/>
-            <wp:docPr id="1" name="home_top.png" descr="Figure 1 — Redesigned Home page (working prototype)." title="Figure 1 — Redesigned Home page (working prototype)."/>
+            <wp:docPr id="1" name="home_top.png" descr="Figure 1 — Redesigned Home page, holistic version (working prototype)." title="Figure 1 — Redesigned Home page, holistic version (working prototype)."/>
             <wp:cNvGraphicFramePr>
               <a:graphicFrameLocks xmlns:a="http://schemas.openxmlformats.org/drawingml/2006/main" noChangeAspect="1"/>
             </wp:cNvGraphicFramePr>
@@ -3058,7 +3154,7 @@
           <w:sz w:val="18"/>
           <w:szCs w:val="18"/>
         </w:rPr>
-        <w:t xml:space="preserve">Figure 1 — Redesigned Home page (working prototype).</w:t>
+        <w:t xml:space="preserve">Figure 1 — Redesigned Home page, holistic version (working prototype).</w:t>
       </w:r>
     </w:p>
     <w:p>

</xml_diff>

<commit_message>
Light-theme the version switcher pill
</commit_message>
<xml_diff>
--- a/pitch/AMET-CEII-Website-Redesign-Proposal.docx
+++ b/pitch/AMET-CEII-Website-Redesign-Proposal.docx
@@ -57,7 +57,7 @@
         <w:rPr>
           <w:b/>
           <w:bCs/>
-          <w:color w:val="0E2E42"/>
+          <w:color w:val="2A2550"/>
           <w:sz w:val="22"/>
           <w:szCs w:val="22"/>
         </w:rPr>
@@ -471,7 +471,7 @@
               <w:bottom w:val="single" w:color="BBBBBB" w:sz="1"/>
               <w:right w:val="single" w:color="BBBBBB" w:sz="1"/>
             </w:tcBorders>
-            <w:shd w:fill="0E2E42" w:val="clear"/>
+            <w:shd w:fill="2A2550" w:val="clear"/>
             <w:tcMar>
               <w:top w:type="dxa" w:w="60"/>
               <w:left w:type="dxa" w:w="110"/>
@@ -502,7 +502,7 @@
               <w:bottom w:val="single" w:color="BBBBBB" w:sz="1"/>
               <w:right w:val="single" w:color="BBBBBB" w:sz="1"/>
             </w:tcBorders>
-            <w:shd w:fill="0E2E42" w:val="clear"/>
+            <w:shd w:fill="2A2550" w:val="clear"/>
             <w:tcMar>
               <w:top w:type="dxa" w:w="60"/>
               <w:left w:type="dxa" w:w="110"/>
@@ -533,7 +533,7 @@
               <w:bottom w:val="single" w:color="BBBBBB" w:sz="1"/>
               <w:right w:val="single" w:color="BBBBBB" w:sz="1"/>
             </w:tcBorders>
-            <w:shd w:fill="0E2E42" w:val="clear"/>
+            <w:shd w:fill="2A2550" w:val="clear"/>
             <w:tcMar>
               <w:top w:type="dxa" w:w="60"/>
               <w:left w:type="dxa" w:w="110"/>
@@ -1585,7 +1585,7 @@
               <w:bottom w:val="single" w:color="BBBBBB" w:sz="1"/>
               <w:right w:val="single" w:color="BBBBBB" w:sz="1"/>
             </w:tcBorders>
-            <w:shd w:fill="0E2E42" w:val="clear"/>
+            <w:shd w:fill="2A2550" w:val="clear"/>
             <w:tcMar>
               <w:top w:type="dxa" w:w="60"/>
               <w:left w:type="dxa" w:w="110"/>
@@ -1616,7 +1616,7 @@
               <w:bottom w:val="single" w:color="BBBBBB" w:sz="1"/>
               <w:right w:val="single" w:color="BBBBBB" w:sz="1"/>
             </w:tcBorders>
-            <w:shd w:fill="0E2E42" w:val="clear"/>
+            <w:shd w:fill="2A2550" w:val="clear"/>
             <w:tcMar>
               <w:top w:type="dxa" w:w="60"/>
               <w:left w:type="dxa" w:w="110"/>
@@ -2004,7 +2004,7 @@
               <w:rPr>
                 <w:b/>
                 <w:bCs/>
-                <w:color w:val="0E7C6B"/>
+                <w:color w:val="4838D1"/>
               </w:rPr>
               <w:t xml:space="preserve">Registrar</w:t>
             </w:r>
@@ -2232,7 +2232,7 @@
               <w:bottom w:val="single" w:color="BBBBBB" w:sz="1"/>
               <w:right w:val="single" w:color="BBBBBB" w:sz="1"/>
             </w:tcBorders>
-            <w:shd w:fill="0E2E42" w:val="clear"/>
+            <w:shd w:fill="2A2550" w:val="clear"/>
             <w:tcMar>
               <w:top w:type="dxa" w:w="60"/>
               <w:left w:type="dxa" w:w="110"/>
@@ -2263,7 +2263,7 @@
               <w:bottom w:val="single" w:color="BBBBBB" w:sz="1"/>
               <w:right w:val="single" w:color="BBBBBB" w:sz="1"/>
             </w:tcBorders>
-            <w:shd w:fill="0E2E42" w:val="clear"/>
+            <w:shd w:fill="2A2550" w:val="clear"/>
             <w:tcMar>
               <w:top w:type="dxa" w:w="60"/>
               <w:left w:type="dxa" w:w="110"/>
@@ -3105,7 +3105,7 @@
           <wp:inline distT="0" distB="0" distL="0" distR="0">
             <wp:extent cx="5334000" cy="3257550"/>
             <wp:effectExtent t="0" r="0" b="0" l="0"/>
-            <wp:docPr id="1" name="home_top.png" descr="Figure 1 — Redesigned Home page, holistic version (working prototype)." title="Figure 1 — Redesigned Home page, holistic version (working prototype)."/>
+            <wp:docPr id="1" name="home_top.png" descr="Figure 1 — Home page, holistic version (light, minimalist)." title="Figure 1 — Home page, holistic version (light, minimalist)."/>
             <wp:cNvGraphicFramePr>
               <a:graphicFrameLocks xmlns:a="http://schemas.openxmlformats.org/drawingml/2006/main" noChangeAspect="1"/>
             </wp:cNvGraphicFramePr>
@@ -3154,7 +3154,7 @@
           <w:sz w:val="18"/>
           <w:szCs w:val="18"/>
         </w:rPr>
-        <w:t xml:space="preserve">Figure 1 — Redesigned Home page, holistic version (working prototype).</w:t>
+        <w:t xml:space="preserve">Figure 1 — Home page, holistic version (light, minimalist).</w:t>
       </w:r>
     </w:p>
     <w:p>
@@ -3167,7 +3167,7 @@
           <wp:inline distT="0" distB="0" distL="0" distR="0">
             <wp:extent cx="5334000" cy="3257550"/>
             <wp:effectExtent t="0" r="0" b="0" l="0"/>
-            <wp:docPr id="1" name="apply_top.png" descr="Figure 2 — Guided multi-step Apply form (working prototype)." title="Figure 2 — Guided multi-step Apply form (working prototype)."/>
+            <wp:docPr id="1" name="maritime_home_top.png" descr="Figure 2 — Home page, maritime-focused version (the alternative direction)." title="Figure 2 — Home page, maritime-focused version (the alternative direction)."/>
             <wp:cNvGraphicFramePr>
               <a:graphicFrameLocks xmlns:a="http://schemas.openxmlformats.org/drawingml/2006/main" noChangeAspect="1"/>
             </wp:cNvGraphicFramePr>
@@ -3216,7 +3216,7 @@
           <w:sz w:val="18"/>
           <w:szCs w:val="18"/>
         </w:rPr>
-        <w:t xml:space="preserve">Figure 2 — Guided multi-step Apply form (working prototype).</w:t>
+        <w:t xml:space="preserve">Figure 2 — Home page, maritime-focused version (the alternative direction).</w:t>
       </w:r>
     </w:p>
     <w:p>
@@ -3229,7 +3229,7 @@
           <wp:inline distT="0" distB="0" distL="0" distR="0">
             <wp:extent cx="5334000" cy="3257550"/>
             <wp:effectExtent t="0" r="0" b="0" l="0"/>
-            <wp:docPr id="1" name="portfolio_top.png" descr="Figure 3 — Portfolio page with sector filters (sample content shown)." title="Figure 3 — Portfolio page with sector filters (sample content shown)."/>
+            <wp:docPr id="1" name="apply_top.png" descr="Figure 3 — Guided multi-step Apply form (working prototype)." title="Figure 3 — Guided multi-step Apply form (working prototype)."/>
             <wp:cNvGraphicFramePr>
               <a:graphicFrameLocks xmlns:a="http://schemas.openxmlformats.org/drawingml/2006/main" noChangeAspect="1"/>
             </wp:cNvGraphicFramePr>
@@ -3278,7 +3278,69 @@
           <w:sz w:val="18"/>
           <w:szCs w:val="18"/>
         </w:rPr>
-        <w:t xml:space="preserve">Figure 3 — Portfolio page with sector filters (sample content shown).</w:t>
+        <w:t xml:space="preserve">Figure 3 — Guided multi-step Apply form (working prototype).</w:t>
+      </w:r>
+    </w:p>
+    <w:p>
+      <w:pPr>
+        <w:spacing w:after="40" w:before="100"/>
+        <w:jc w:val="center"/>
+      </w:pPr>
+      <w:r>
+        <w:drawing>
+          <wp:inline distT="0" distB="0" distL="0" distR="0">
+            <wp:extent cx="5334000" cy="3257550"/>
+            <wp:effectExtent t="0" r="0" b="0" l="0"/>
+            <wp:docPr id="1" name="portfolio_top.png" descr="Figure 4 — Portfolio page with sector filters (sample content shown)." title="Figure 4 — Portfolio page with sector filters (sample content shown)."/>
+            <wp:cNvGraphicFramePr>
+              <a:graphicFrameLocks xmlns:a="http://schemas.openxmlformats.org/drawingml/2006/main" noChangeAspect="1"/>
+            </wp:cNvGraphicFramePr>
+            <a:graphic xmlns:a="http://schemas.openxmlformats.org/drawingml/2006/main">
+              <a:graphicData uri="http://schemas.openxmlformats.org/drawingml/2006/picture">
+                <pic:pic xmlns:pic="http://schemas.openxmlformats.org/drawingml/2006/picture">
+                  <pic:nvPicPr>
+                    <pic:cNvPr id="0" name="" descr=""/>
+                    <pic:cNvPicPr>
+                      <a:picLocks noChangeAspect="1" noChangeArrowheads="1"/>
+                    </pic:cNvPicPr>
+                  </pic:nvPicPr>
+                  <pic:blipFill>
+                    <a:blip r:embed="rId13" cstate="none"/>
+                    <a:srcRect/>
+                    <a:stretch>
+                      <a:fillRect/>
+                    </a:stretch>
+                  </pic:blipFill>
+                  <pic:spPr bwMode="auto">
+                    <a:xfrm>
+                      <a:off x="0" y="0"/>
+                      <a:ext cx="5334000" cy="3257550"/>
+                    </a:xfrm>
+                    <a:prstGeom prst="rect">
+                      <a:avLst/>
+                    </a:prstGeom>
+                  </pic:spPr>
+                </pic:pic>
+              </a:graphicData>
+            </a:graphic>
+          </wp:inline>
+        </w:drawing>
+      </w:r>
+    </w:p>
+    <w:p>
+      <w:pPr>
+        <w:spacing w:after="160"/>
+        <w:jc w:val="center"/>
+      </w:pPr>
+      <w:r>
+        <w:rPr>
+          <w:i/>
+          <w:iCs/>
+          <w:color w:val="595959"/>
+          <w:sz w:val="18"/>
+          <w:szCs w:val="18"/>
+        </w:rPr>
+        <w:t xml:space="preserve">Figure 4 — Portfolio page with sector filters (sample content shown).</w:t>
       </w:r>
     </w:p>
     <w:p>
@@ -3328,7 +3390,7 @@
               <w:bottom w:val="single" w:color="BBBBBB" w:sz="1"/>
               <w:right w:val="single" w:color="BBBBBB" w:sz="1"/>
             </w:tcBorders>
-            <w:shd w:fill="0E2E42" w:val="clear"/>
+            <w:shd w:fill="2A2550" w:val="clear"/>
             <w:tcMar>
               <w:top w:type="dxa" w:w="60"/>
               <w:left w:type="dxa" w:w="110"/>
@@ -3359,7 +3421,7 @@
               <w:bottom w:val="single" w:color="BBBBBB" w:sz="1"/>
               <w:right w:val="single" w:color="BBBBBB" w:sz="1"/>
             </w:tcBorders>
-            <w:shd w:fill="0E2E42" w:val="clear"/>
+            <w:shd w:fill="2A2550" w:val="clear"/>
             <w:tcMar>
               <w:top w:type="dxa" w:w="60"/>
               <w:left w:type="dxa" w:w="110"/>
@@ -3390,7 +3452,7 @@
               <w:bottom w:val="single" w:color="BBBBBB" w:sz="1"/>
               <w:right w:val="single" w:color="BBBBBB" w:sz="1"/>
             </w:tcBorders>
-            <w:shd w:fill="0E2E42" w:val="clear"/>
+            <w:shd w:fill="2A2550" w:val="clear"/>
             <w:tcMar>
               <w:top w:type="dxa" w:w="60"/>
               <w:left w:type="dxa" w:w="110"/>
@@ -3804,7 +3866,7 @@
               <w:bottom w:val="single" w:color="BBBBBB" w:sz="1"/>
               <w:right w:val="single" w:color="BBBBBB" w:sz="1"/>
             </w:tcBorders>
-            <w:shd w:fill="0E2E42" w:val="clear"/>
+            <w:shd w:fill="2A2550" w:val="clear"/>
             <w:tcMar>
               <w:top w:type="dxa" w:w="60"/>
               <w:left w:type="dxa" w:w="110"/>
@@ -3835,7 +3897,7 @@
               <w:bottom w:val="single" w:color="BBBBBB" w:sz="1"/>
               <w:right w:val="single" w:color="BBBBBB" w:sz="1"/>
             </w:tcBorders>
-            <w:shd w:fill="0E2E42" w:val="clear"/>
+            <w:shd w:fill="2A2550" w:val="clear"/>
             <w:tcMar>
               <w:top w:type="dxa" w:w="60"/>
               <w:left w:type="dxa" w:w="110"/>
@@ -3866,7 +3928,7 @@
               <w:bottom w:val="single" w:color="BBBBBB" w:sz="1"/>
               <w:right w:val="single" w:color="BBBBBB" w:sz="1"/>
             </w:tcBorders>
-            <w:shd w:fill="0E2E42" w:val="clear"/>
+            <w:shd w:fill="2A2550" w:val="clear"/>
             <w:tcMar>
               <w:top w:type="dxa" w:w="60"/>
               <w:left w:type="dxa" w:w="110"/>
@@ -3970,7 +4032,7 @@
             </w:pPr>
             <w:r>
               <w:rPr>
-                <w:color w:val="0E7C6B"/>
+                <w:color w:val="4838D1"/>
               </w:rPr>
               <w:t xml:space="preserve">Near-zero — only hosting &amp; domain (largely free-tier).</w:t>
             </w:r>
@@ -4058,7 +4120,7 @@
             </w:pPr>
             <w:r>
               <w:rPr>
-                <w:color w:val="0E7C6B"/>
+                <w:color w:val="4838D1"/>
               </w:rPr>
               <w:t xml:space="preserve">Same-day / same-week updates by the on-campus team.</w:t>
             </w:r>
@@ -4146,7 +4208,7 @@
             </w:pPr>
             <w:r>
               <w:rPr>
-                <w:color w:val="0E7C6B"/>
+                <w:color w:val="4838D1"/>
               </w:rPr>
               <w:t xml:space="preserve">Students are inside the university and its context.</w:t>
             </w:r>
@@ -4234,7 +4296,7 @@
             </w:pPr>
             <w:r>
               <w:rPr>
-                <w:color w:val="0E7C6B"/>
+                <w:color w:val="4838D1"/>
               </w:rPr>
               <w:t xml:space="preserve">Builds student skills &amp; a reusable in-house capability.</w:t>
             </w:r>
@@ -4322,7 +4384,7 @@
             </w:pPr>
             <w:r>
               <w:rPr>
-                <w:color w:val="0E7C6B"/>
+                <w:color w:val="4838D1"/>
               </w:rPr>
               <w:t xml:space="preserve">Documented &amp; handed to the next student batch.</w:t>
             </w:r>
@@ -4445,7 +4507,7 @@
               <w:bottom w:val="single" w:color="BBBBBB" w:sz="1"/>
               <w:right w:val="single" w:color="BBBBBB" w:sz="1"/>
             </w:tcBorders>
-            <w:shd w:fill="0E2E42" w:val="clear"/>
+            <w:shd w:fill="2A2550" w:val="clear"/>
             <w:tcMar>
               <w:top w:type="dxa" w:w="60"/>
               <w:left w:type="dxa" w:w="110"/>
@@ -4476,7 +4538,7 @@
               <w:bottom w:val="single" w:color="BBBBBB" w:sz="1"/>
               <w:right w:val="single" w:color="BBBBBB" w:sz="1"/>
             </w:tcBorders>
-            <w:shd w:fill="0E2E42" w:val="clear"/>
+            <w:shd w:fill="2A2550" w:val="clear"/>
             <w:tcMar>
               <w:top w:type="dxa" w:w="60"/>
               <w:left w:type="dxa" w:w="110"/>
@@ -4507,7 +4569,7 @@
               <w:bottom w:val="single" w:color="BBBBBB" w:sz="1"/>
               <w:right w:val="single" w:color="BBBBBB" w:sz="1"/>
             </w:tcBorders>
-            <w:shd w:fill="0E2E42" w:val="clear"/>
+            <w:shd w:fill="2A2550" w:val="clear"/>
             <w:tcMar>
               <w:top w:type="dxa" w:w="60"/>
               <w:left w:type="dxa" w:w="110"/>
@@ -5277,7 +5339,7 @@
               <w:bottom w:val="single" w:color="BBBBBB" w:sz="1"/>
               <w:right w:val="single" w:color="BBBBBB" w:sz="1"/>
             </w:tcBorders>
-            <w:shd w:fill="0E2E42" w:val="clear"/>
+            <w:shd w:fill="2A2550" w:val="clear"/>
             <w:tcMar>
               <w:top w:type="dxa" w:w="60"/>
               <w:left w:type="dxa" w:w="110"/>
@@ -5308,7 +5370,7 @@
               <w:bottom w:val="single" w:color="BBBBBB" w:sz="1"/>
               <w:right w:val="single" w:color="BBBBBB" w:sz="1"/>
             </w:tcBorders>
-            <w:shd w:fill="0E2E42" w:val="clear"/>
+            <w:shd w:fill="2A2550" w:val="clear"/>
             <w:tcMar>
               <w:top w:type="dxa" w:w="60"/>
               <w:left w:type="dxa" w:w="110"/>
@@ -5339,7 +5401,7 @@
               <w:bottom w:val="single" w:color="BBBBBB" w:sz="1"/>
               <w:right w:val="single" w:color="BBBBBB" w:sz="1"/>
             </w:tcBorders>
-            <w:shd w:fill="0E2E42" w:val="clear"/>
+            <w:shd w:fill="2A2550" w:val="clear"/>
             <w:tcMar>
               <w:top w:type="dxa" w:w="60"/>
               <w:left w:type="dxa" w:w="110"/>
@@ -5849,7 +5911,7 @@
               <w:bottom w:val="single" w:color="BBBBBB" w:sz="1"/>
               <w:right w:val="single" w:color="BBBBBB" w:sz="1"/>
             </w:tcBorders>
-            <w:shd w:fill="0E2E42" w:val="clear"/>
+            <w:shd w:fill="2A2550" w:val="clear"/>
             <w:tcMar>
               <w:top w:type="dxa" w:w="60"/>
               <w:left w:type="dxa" w:w="110"/>
@@ -5880,7 +5942,7 @@
               <w:bottom w:val="single" w:color="BBBBBB" w:sz="1"/>
               <w:right w:val="single" w:color="BBBBBB" w:sz="1"/>
             </w:tcBorders>
-            <w:shd w:fill="0E2E42" w:val="clear"/>
+            <w:shd w:fill="2A2550" w:val="clear"/>
             <w:tcMar>
               <w:top w:type="dxa" w:w="60"/>
               <w:left w:type="dxa" w:w="110"/>
@@ -6132,7 +6194,7 @@
               <w:rPr>
                 <w:b/>
                 <w:bCs/>
-                <w:color w:val="0E7C6B"/>
+                <w:color w:val="4838D1"/>
               </w:rPr>
               <w:t xml:space="preserve">[ current annual vendor cost ] — saved</w:t>
             </w:r>
@@ -6191,7 +6253,7 @@
               <w:bottom w:val="single" w:color="BBBBBB" w:sz="1"/>
               <w:right w:val="single" w:color="BBBBBB" w:sz="1"/>
             </w:tcBorders>
-            <w:shd w:fill="0E2E42" w:val="clear"/>
+            <w:shd w:fill="2A2550" w:val="clear"/>
             <w:tcMar>
               <w:top w:type="dxa" w:w="60"/>
               <w:left w:type="dxa" w:w="110"/>
@@ -6222,7 +6284,7 @@
               <w:bottom w:val="single" w:color="BBBBBB" w:sz="1"/>
               <w:right w:val="single" w:color="BBBBBB" w:sz="1"/>
             </w:tcBorders>
-            <w:shd w:fill="0E2E42" w:val="clear"/>
+            <w:shd w:fill="2A2550" w:val="clear"/>
             <w:tcMar>
               <w:top w:type="dxa" w:w="60"/>
               <w:left w:type="dxa" w:w="110"/>
@@ -7026,7 +7088,7 @@
     <w:qFormat/>
     <w:pPr>
       <w:pBdr>
-        <w:bottom w:val="single" w:color="0E7C6B" w:sz="4" w:space="3"/>
+        <w:bottom w:val="single" w:color="4838D1" w:sz="4" w:space="3"/>
       </w:pBdr>
       <w:spacing w:after="140" w:before="280"/>
       <w:outlineLvl w:val="0"/>
@@ -7035,7 +7097,7 @@
       <w:rFonts w:ascii="Calibri" w:cs="Calibri" w:eastAsia="Calibri" w:hAnsi="Calibri"/>
       <w:b/>
       <w:bCs/>
-      <w:color w:val="0E2E42"/>
+      <w:color w:val="2A2550"/>
       <w:sz w:val="28"/>
       <w:szCs w:val="28"/>
     </w:rPr>
@@ -7053,7 +7115,7 @@
       <w:rFonts w:ascii="Calibri" w:cs="Calibri" w:eastAsia="Calibri" w:hAnsi="Calibri"/>
       <w:b/>
       <w:bCs/>
-      <w:color w:val="0E7C6B"/>
+      <w:color w:val="4838D1"/>
       <w:sz w:val="24"/>
       <w:szCs w:val="24"/>
     </w:rPr>

</xml_diff>

<commit_message>
Apply behavioural-science UX principles to both sites
- Apply form: endowed-progress meter (opens 20%, never 0%), smart-default
  program, query-param hand-off (pre-fills carried choice), value-first strip
- Homepage: "find your starting point" reciprocity check → instant program
  recommendation with no sign-up, carried into the application pre-filled
- Mirrored across holistic (root) + maritime/ copies
</commit_message>
<xml_diff>
--- a/pitch/AMET-CEII-Website-Redesign-Proposal.docx
+++ b/pitch/AMET-CEII-Website-Redesign-Proposal.docx
@@ -3341,6 +3341,150 @@
           <w:szCs w:val="18"/>
         </w:rPr>
         <w:t xml:space="preserve">Figure 4 — Portfolio page with sector filters (sample content shown).</w:t>
+      </w:r>
+    </w:p>
+    <w:p>
+      <w:pPr>
+        <w:pStyle w:val="Heading2"/>
+      </w:pPr>
+      <w:r>
+        <w:t xml:space="preserve">5.5  Designed for conversion — applied behavioural science</w:t>
+      </w:r>
+    </w:p>
+    <w:p>
+      <w:pPr>
+        <w:spacing w:after="140" w:line="276"/>
+      </w:pPr>
+      <w:r>
+        <w:t xml:space="preserve">A good-looking website is not the goal; a website that turns visitors into applicants is. Both prototypes are designed around six well-established findings from decision psychology, so that more of the founders who arrive actually complete an application or enquiry:</w:t>
+      </w:r>
+    </w:p>
+    <w:p>
+      <w:pPr>
+        <w:pStyle w:val="ListParagraph"/>
+        <w:numPr>
+          <w:ilvl w:val="0"/>
+          <w:numId w:val="2"/>
+        </w:numPr>
+        <w:spacing w:after="70" w:line="270"/>
+      </w:pPr>
+      <w:r>
+        <w:rPr>
+          <w:b/>
+          <w:bCs/>
+        </w:rPr>
+        <w:t xml:space="preserve">Smart defaults. </w:t>
+      </w:r>
+      <w:r>
+        <w:t xml:space="preserve">The application never shows a blank required field where a sensible answer exists; the most common choice is pre-selected, so founders adjust rather than decide from a blank page.</w:t>
+      </w:r>
+    </w:p>
+    <w:p>
+      <w:pPr>
+        <w:pStyle w:val="ListParagraph"/>
+        <w:numPr>
+          <w:ilvl w:val="0"/>
+          <w:numId w:val="2"/>
+        </w:numPr>
+        <w:spacing w:after="70" w:line="270"/>
+      </w:pPr>
+      <w:r>
+        <w:rPr>
+          <w:b/>
+          <w:bCs/>
+        </w:rPr>
+        <w:t xml:space="preserve">A head start on progress. </w:t>
+      </w:r>
+      <w:r>
+        <w:t xml:space="preserve">The application’s progress meter opens at 20%, never a discouraging 0% — people push harder toward a goal that already feels begun (the goal-gradient effect).</w:t>
+      </w:r>
+    </w:p>
+    <w:p>
+      <w:pPr>
+        <w:pStyle w:val="ListParagraph"/>
+        <w:numPr>
+          <w:ilvl w:val="0"/>
+          <w:numId w:val="2"/>
+        </w:numPr>
+        <w:spacing w:after="70" w:line="270"/>
+      </w:pPr>
+      <w:r>
+        <w:rPr>
+          <w:b/>
+          <w:bCs/>
+        </w:rPr>
+        <w:t xml:space="preserve">Value before the ask. </w:t>
+      </w:r>
+      <w:r>
+        <w:t xml:space="preserve">The home page offers a 30-second “find your starting point” check that returns a genuine programme recommendation with no sign-up, before anything is requested (the reciprocity principle).</w:t>
+      </w:r>
+    </w:p>
+    <w:p>
+      <w:pPr>
+        <w:pStyle w:val="ListParagraph"/>
+        <w:numPr>
+          <w:ilvl w:val="0"/>
+          <w:numId w:val="2"/>
+        </w:numPr>
+        <w:spacing w:after="70" w:line="270"/>
+      </w:pPr>
+      <w:r>
+        <w:rPr>
+          <w:b/>
+          <w:bCs/>
+        </w:rPr>
+        <w:t xml:space="preserve">Let founders invest first. </w:t>
+      </w:r>
+      <w:r>
+        <w:t xml:space="preserve">That recommendation is carried straight into the application, already filled in, so the founder is building something that feels like theirs before committing (the endowment effect).</w:t>
+      </w:r>
+    </w:p>
+    <w:p>
+      <w:pPr>
+        <w:pStyle w:val="ListParagraph"/>
+        <w:numPr>
+          <w:ilvl w:val="0"/>
+          <w:numId w:val="2"/>
+        </w:numPr>
+        <w:spacing w:after="70" w:line="270"/>
+      </w:pPr>
+      <w:r>
+        <w:rPr>
+          <w:b/>
+          <w:bCs/>
+        </w:rPr>
+        <w:t xml:space="preserve">Frame around what is at stake. </w:t>
+      </w:r>
+      <w:r>
+        <w:t xml:space="preserve">Calls to action speak to the opportunity a founder stands to miss, not only to abstract benefits (loss aversion).</w:t>
+      </w:r>
+    </w:p>
+    <w:p>
+      <w:pPr>
+        <w:pStyle w:val="ListParagraph"/>
+        <w:numPr>
+          <w:ilvl w:val="0"/>
+          <w:numId w:val="2"/>
+        </w:numPr>
+        <w:spacing w:after="70" w:line="270"/>
+      </w:pPr>
+      <w:r>
+        <w:rPr>
+          <w:b/>
+          <w:bCs/>
+        </w:rPr>
+        <w:t xml:space="preserve">Numbers in context. </w:t>
+      </w:r>
+      <w:r>
+        <w:t xml:space="preserve">Figures are shown against a clear reference point rather than in isolation, so they read fairly (the contrast effect).</w:t>
+      </w:r>
+    </w:p>
+    <w:p>
+      <w:pPr>
+        <w:spacing w:after="140" w:line="276"/>
+      </w:pPr>
+      <w:r>
+        <w:t xml:space="preserve">These are the same techniques used by leading technology products. Applied honestly — every recommendation is real and every placeholder statistic stays clearly labelled — they can meaningfully raise the number of quality applications CEII receives, at no extra cost.</w:t>
       </w:r>
     </w:p>
     <w:p>

</xml_diff>